<commit_message>
ajuste na importação do datetime
</commit_message>
<xml_diff>
--- a/modelos/desenvolvimento/ModeloDev - Estimativa de Esforço e Cronograma.docx
+++ b/modelos/desenvolvimento/ModeloDev - Estimativa de Esforço e Cronograma.docx
@@ -341,9 +341,9 @@
         <w:tblLook w:val="0600" w:firstRow="0" w:lastRow="0" w:firstColumn="0" w:lastColumn="0" w:noHBand="1" w:noVBand="1"/>
       </w:tblPr>
       <w:tblGrid>
-        <w:gridCol w:w="1785"/>
-        <w:gridCol w:w="5475"/>
-        <w:gridCol w:w="2370"/>
+        <w:gridCol w:w="2445"/>
+        <w:gridCol w:w="3690"/>
+        <w:gridCol w:w="3495"/>
       </w:tblGrid>
       <w:tr>
         <w:trPr>
@@ -497,7 +497,23 @@
                 <w:sz w:val="24"/>
                 <w:szCs w:val="24"/>
               </w:rPr>
-              <w:t>[DATA_ATUAL]</w:t>
+              <w:t>[DATA_</w:t>
+            </w:r>
+            <w:r>
+              <w:rPr>
+                <w:rFonts w:ascii="Calibri" w:eastAsia="Calibri" w:hAnsi="Calibri" w:cs="Calibri"/>
+                <w:sz w:val="24"/>
+                <w:szCs w:val="24"/>
+              </w:rPr>
+              <w:t>CRIACAO</w:t>
+            </w:r>
+            <w:r>
+              <w:rPr>
+                <w:rFonts w:ascii="Calibri" w:eastAsia="Calibri" w:hAnsi="Calibri" w:cs="Calibri"/>
+                <w:sz w:val="24"/>
+                <w:szCs w:val="24"/>
+              </w:rPr>
+              <w:t>]</w:t>
             </w:r>
           </w:p>
         </w:tc>
@@ -569,14 +585,31 @@
                 <w:sz w:val="24"/>
                 <w:szCs w:val="24"/>
               </w:rPr>
-              <w:t>[INICIAIS_AUTOR]</w:t>
+              <w:t>[INICIAIS_AUTOR</w:t>
+            </w:r>
+            <w:r>
+              <w:rPr>
+                <w:rFonts w:ascii="Calibri" w:eastAsia="Calibri" w:hAnsi="Calibri" w:cs="Calibri"/>
+                <w:sz w:val="24"/>
+                <w:szCs w:val="24"/>
+              </w:rPr>
+              <w:t>_CRIACAO</w:t>
+            </w:r>
+            <w:r>
+              <w:rPr>
+                <w:rFonts w:ascii="Calibri" w:eastAsia="Calibri" w:hAnsi="Calibri" w:cs="Calibri"/>
+                <w:sz w:val="24"/>
+                <w:szCs w:val="24"/>
+              </w:rPr>
+              <w:t>]</w:t>
             </w:r>
           </w:p>
         </w:tc>
       </w:tr>
       <w:tr>
         <w:trPr>
-          <w:trHeight w:val="180"/>
+          <w:cantSplit/>
+          <w:trHeight w:val="1134"/>
         </w:trPr>
         <w:tc>
           <w:tcPr>
@@ -610,7 +643,7 @@
                 <w:sz w:val="24"/>
                 <w:szCs w:val="24"/>
               </w:rPr>
-              <w:t>[DATA_ATUAL2]</w:t>
+              <w:t>[DATA_MODIFICACAO]</w:t>
             </w:r>
           </w:p>
         </w:tc>
@@ -690,7 +723,7 @@
                 <w:sz w:val="24"/>
                 <w:szCs w:val="24"/>
               </w:rPr>
-              <w:t>2</w:t>
+              <w:t>_MODIFICACAO</w:t>
             </w:r>
             <w:r>
               <w:rPr>

</xml_diff>

<commit_message>
ajustes gerais nos modelos
</commit_message>
<xml_diff>
--- a/modelos/desenvolvimento/ModeloDev - Estimativa de Esforço e Cronograma.docx
+++ b/modelos/desenvolvimento/ModeloDev - Estimativa de Esforço e Cronograma.docx
@@ -1311,17 +1311,7 @@
                 <w:sz w:val="24"/>
                 <w:szCs w:val="24"/>
               </w:rPr>
-              <w:t>Atividade/</w:t>
-            </w:r>
-            <w:r>
-              <w:rPr>
-                <w:rFonts w:ascii="Calibri" w:eastAsia="Calibri" w:hAnsi="Calibri" w:cs="Calibri"/>
-                <w:b/>
-                <w:bCs/>
-                <w:sz w:val="24"/>
-                <w:szCs w:val="24"/>
-              </w:rPr>
-              <w:t>Chamado</w:t>
+              <w:t>Atividade</w:t>
             </w:r>
           </w:p>
         </w:tc>
@@ -1439,25 +1429,7 @@
                 <w:sz w:val="24"/>
                 <w:szCs w:val="24"/>
               </w:rPr>
-              <w:t xml:space="preserve"> [</w:t>
-            </w:r>
-            <w:proofErr w:type="gramStart"/>
-            <w:r>
-              <w:rPr>
-                <w:rFonts w:ascii="Calibri" w:eastAsia="Calibri" w:hAnsi="Calibri" w:cs="Calibri"/>
-                <w:sz w:val="24"/>
-                <w:szCs w:val="24"/>
-              </w:rPr>
-              <w:t>TITULO</w:t>
-            </w:r>
-            <w:proofErr w:type="gramEnd"/>
-            <w:r>
-              <w:rPr>
-                <w:rFonts w:ascii="Calibri" w:eastAsia="Calibri" w:hAnsi="Calibri" w:cs="Calibri"/>
-                <w:sz w:val="24"/>
-                <w:szCs w:val="24"/>
-              </w:rPr>
-              <w:t>]</w:t>
+              <w:t xml:space="preserve"> [TITULO]</w:t>
             </w:r>
             <w:r>
               <w:rPr>
@@ -1965,27 +1937,7 @@
                 <w:szCs w:val="24"/>
                 <w:highlight w:val="white"/>
               </w:rPr>
-              <w:t>[</w:t>
-            </w:r>
-            <w:proofErr w:type="gramStart"/>
-            <w:r>
-              <w:rPr>
-                <w:rFonts w:ascii="Calibri" w:eastAsia="Calibri" w:hAnsi="Calibri" w:cs="Calibri"/>
-                <w:sz w:val="24"/>
-                <w:szCs w:val="24"/>
-                <w:highlight w:val="white"/>
-              </w:rPr>
-              <w:t>TITULO</w:t>
-            </w:r>
-            <w:proofErr w:type="gramEnd"/>
-            <w:r>
-              <w:rPr>
-                <w:rFonts w:ascii="Calibri" w:eastAsia="Calibri" w:hAnsi="Calibri" w:cs="Calibri"/>
-                <w:sz w:val="24"/>
-                <w:szCs w:val="24"/>
-                <w:highlight w:val="white"/>
-              </w:rPr>
-              <w:t>]</w:t>
+              <w:t>[TITULO]</w:t>
             </w:r>
           </w:p>
         </w:tc>
@@ -2849,21 +2801,7 @@
       <w:rPr>
         <w:color w:val="666666"/>
       </w:rPr>
-      <w:t xml:space="preserve"> Rua da </w:t>
-    </w:r>
-    <w:proofErr w:type="spellStart"/>
-    <w:r>
-      <w:rPr>
-        <w:color w:val="666666"/>
-      </w:rPr>
-      <w:t>Bronzita</w:t>
-    </w:r>
-    <w:proofErr w:type="spellEnd"/>
-    <w:r>
-      <w:rPr>
-        <w:color w:val="666666"/>
-      </w:rPr>
-      <w:t>, 1917, Lagoa Nova, Natal/RN, Sala 3, 59.076-500</w:t>
+      <w:t xml:space="preserve"> Rua da Bronzita, 1917, Lagoa Nova, Natal/RN, Sala 3, 59.076-500</w:t>
     </w:r>
   </w:p>
   <w:p>
@@ -3030,21 +2968,7 @@
       <w:rPr>
         <w:color w:val="666666"/>
       </w:rPr>
-      <w:t xml:space="preserve"> Rua da </w:t>
-    </w:r>
-    <w:proofErr w:type="spellStart"/>
-    <w:r>
-      <w:rPr>
-        <w:color w:val="666666"/>
-      </w:rPr>
-      <w:t>Bronzita</w:t>
-    </w:r>
-    <w:proofErr w:type="spellEnd"/>
-    <w:r>
-      <w:rPr>
-        <w:color w:val="666666"/>
-      </w:rPr>
-      <w:t>, 1917, Lagoa Nova, Natal/RN, Sala 3, 59.076-500</w:t>
+      <w:t xml:space="preserve"> Rua da Bronzita, 1917, Lagoa Nova, Natal/RN, Sala 3, 59.076-500</w:t>
     </w:r>
   </w:p>
   <w:p>

</xml_diff>

<commit_message>
mais atualizações nos modelos
</commit_message>
<xml_diff>
--- a/modelos/desenvolvimento/ModeloDev - Estimativa de Esforço e Cronograma.docx
+++ b/modelos/desenvolvimento/ModeloDev - Estimativa de Esforço e Cronograma.docx
@@ -1290,6 +1290,7 @@
               <w:bottom w:w="100" w:type="dxa"/>
               <w:right w:w="100" w:type="dxa"/>
             </w:tcMar>
+            <w:vAlign w:val="center"/>
           </w:tcPr>
           <w:p>
             <w:pPr>
@@ -1331,6 +1332,7 @@
               <w:bottom w:w="100" w:type="dxa"/>
               <w:right w:w="100" w:type="dxa"/>
             </w:tcMar>
+            <w:vAlign w:val="center"/>
           </w:tcPr>
           <w:p>
             <w:pPr>
@@ -1374,6 +1376,7 @@
               <w:bottom w:w="100" w:type="dxa"/>
               <w:right w:w="100" w:type="dxa"/>
             </w:tcMar>
+            <w:vAlign w:val="center"/>
           </w:tcPr>
           <w:p>
             <w:pPr>
@@ -1412,32 +1415,42 @@
               <w:bottom w:w="100" w:type="dxa"/>
               <w:right w:w="100" w:type="dxa"/>
             </w:tcMar>
+            <w:vAlign w:val="center"/>
           </w:tcPr>
           <w:p>
             <w:pPr>
               <w:spacing w:line="240" w:lineRule="auto"/>
-              <w:jc w:val="both"/>
-              <w:rPr>
-                <w:rFonts w:ascii="Calibri" w:eastAsia="Calibri" w:hAnsi="Calibri" w:cs="Calibri"/>
-                <w:sz w:val="24"/>
-                <w:szCs w:val="24"/>
-              </w:rPr>
-            </w:pPr>
-            <w:r>
-              <w:rPr>
-                <w:rFonts w:ascii="Calibri" w:eastAsia="Calibri" w:hAnsi="Calibri" w:cs="Calibri"/>
-                <w:sz w:val="24"/>
-                <w:szCs w:val="24"/>
-              </w:rPr>
-              <w:t xml:space="preserve"> [TITULO]</w:t>
-            </w:r>
-            <w:r>
-              <w:rPr>
-                <w:rFonts w:ascii="Calibri" w:eastAsia="Calibri" w:hAnsi="Calibri" w:cs="Calibri"/>
-                <w:sz w:val="24"/>
-                <w:szCs w:val="24"/>
-              </w:rPr>
-              <w:t xml:space="preserve"> </w:t>
+              <w:rPr>
+                <w:rFonts w:ascii="Calibri" w:eastAsia="Calibri" w:hAnsi="Calibri" w:cs="Calibri"/>
+                <w:sz w:val="24"/>
+                <w:szCs w:val="24"/>
+              </w:rPr>
+            </w:pPr>
+            <w:r>
+              <w:rPr>
+                <w:rFonts w:ascii="Calibri" w:eastAsia="Calibri" w:hAnsi="Calibri" w:cs="Calibri"/>
+                <w:sz w:val="24"/>
+                <w:szCs w:val="24"/>
+              </w:rPr>
+              <w:t>[</w:t>
+            </w:r>
+            <w:proofErr w:type="gramStart"/>
+            <w:r>
+              <w:rPr>
+                <w:rFonts w:ascii="Calibri" w:eastAsia="Calibri" w:hAnsi="Calibri" w:cs="Calibri"/>
+                <w:sz w:val="24"/>
+                <w:szCs w:val="24"/>
+              </w:rPr>
+              <w:t>TITULO</w:t>
+            </w:r>
+            <w:proofErr w:type="gramEnd"/>
+            <w:r>
+              <w:rPr>
+                <w:rFonts w:ascii="Calibri" w:eastAsia="Calibri" w:hAnsi="Calibri" w:cs="Calibri"/>
+                <w:sz w:val="24"/>
+                <w:szCs w:val="24"/>
+              </w:rPr>
+              <w:t>]</w:t>
             </w:r>
           </w:p>
         </w:tc>
@@ -1456,6 +1469,7 @@
               <w:bottom w:w="100" w:type="dxa"/>
               <w:right w:w="100" w:type="dxa"/>
             </w:tcMar>
+            <w:vAlign w:val="center"/>
           </w:tcPr>
           <w:p>
             <w:pPr>
@@ -1497,6 +1511,7 @@
               <w:bottom w:w="100" w:type="dxa"/>
               <w:right w:w="100" w:type="dxa"/>
             </w:tcMar>
+            <w:vAlign w:val="center"/>
           </w:tcPr>
           <w:p>
             <w:pPr>
@@ -1526,10 +1541,12 @@
               <w:bottom w:w="100" w:type="dxa"/>
               <w:right w:w="100" w:type="dxa"/>
             </w:tcMar>
+            <w:vAlign w:val="center"/>
           </w:tcPr>
           <w:p>
             <w:pPr>
               <w:spacing w:line="240" w:lineRule="auto"/>
+              <w:jc w:val="center"/>
               <w:rPr>
                 <w:rFonts w:ascii="Calibri" w:eastAsia="Calibri" w:hAnsi="Calibri" w:cs="Calibri"/>
                 <w:b/>
@@ -1565,6 +1582,7 @@
               <w:bottom w:w="100" w:type="dxa"/>
               <w:right w:w="100" w:type="dxa"/>
             </w:tcMar>
+            <w:vAlign w:val="center"/>
           </w:tcPr>
           <w:p>
             <w:pPr>
@@ -1937,7 +1955,27 @@
                 <w:szCs w:val="24"/>
                 <w:highlight w:val="white"/>
               </w:rPr>
-              <w:t>[TITULO]</w:t>
+              <w:t>[</w:t>
+            </w:r>
+            <w:proofErr w:type="gramStart"/>
+            <w:r>
+              <w:rPr>
+                <w:rFonts w:ascii="Calibri" w:eastAsia="Calibri" w:hAnsi="Calibri" w:cs="Calibri"/>
+                <w:sz w:val="24"/>
+                <w:szCs w:val="24"/>
+                <w:highlight w:val="white"/>
+              </w:rPr>
+              <w:t>TITULO</w:t>
+            </w:r>
+            <w:proofErr w:type="gramEnd"/>
+            <w:r>
+              <w:rPr>
+                <w:rFonts w:ascii="Calibri" w:eastAsia="Calibri" w:hAnsi="Calibri" w:cs="Calibri"/>
+                <w:sz w:val="24"/>
+                <w:szCs w:val="24"/>
+                <w:highlight w:val="white"/>
+              </w:rPr>
+              <w:t>]</w:t>
             </w:r>
           </w:p>
         </w:tc>
@@ -2801,7 +2839,21 @@
       <w:rPr>
         <w:color w:val="666666"/>
       </w:rPr>
-      <w:t xml:space="preserve"> Rua da Bronzita, 1917, Lagoa Nova, Natal/RN, Sala 3, 59.076-500</w:t>
+      <w:t xml:space="preserve"> Rua da </w:t>
+    </w:r>
+    <w:proofErr w:type="spellStart"/>
+    <w:r>
+      <w:rPr>
+        <w:color w:val="666666"/>
+      </w:rPr>
+      <w:t>Bronzita</w:t>
+    </w:r>
+    <w:proofErr w:type="spellEnd"/>
+    <w:r>
+      <w:rPr>
+        <w:color w:val="666666"/>
+      </w:rPr>
+      <w:t>, 1917, Lagoa Nova, Natal/RN, Sala 3, 59.076-500</w:t>
     </w:r>
   </w:p>
   <w:p>
@@ -2968,7 +3020,21 @@
       <w:rPr>
         <w:color w:val="666666"/>
       </w:rPr>
-      <w:t xml:space="preserve"> Rua da Bronzita, 1917, Lagoa Nova, Natal/RN, Sala 3, 59.076-500</w:t>
+      <w:t xml:space="preserve"> Rua da </w:t>
+    </w:r>
+    <w:proofErr w:type="spellStart"/>
+    <w:r>
+      <w:rPr>
+        <w:color w:val="666666"/>
+      </w:rPr>
+      <w:t>Bronzita</w:t>
+    </w:r>
+    <w:proofErr w:type="spellEnd"/>
+    <w:r>
+      <w:rPr>
+        <w:color w:val="666666"/>
+      </w:rPr>
+      <w:t>, 1917, Lagoa Nova, Natal/RN, Sala 3, 59.076-500</w:t>
     </w:r>
   </w:p>
   <w:p>

</xml_diff>

<commit_message>
atualizando documentos de desenvolvimento
</commit_message>
<xml_diff>
--- a/modelos/desenvolvimento/ModeloDev - Estimativa de Esforço e Cronograma.docx
+++ b/modelos/desenvolvimento/ModeloDev - Estimativa de Esforço e Cronograma.docx
@@ -1,3 +1,3266 @@
+
+<file path=word/document.xml><?xml version="1.0" encoding="utf-8"?>
+<w:document xmlns:wpc="http://schemas.microsoft.com/office/word/2010/wordprocessingCanvas" xmlns:cx="http://schemas.microsoft.com/office/drawing/2014/chartex" xmlns:cx1="http://schemas.microsoft.com/office/drawing/2015/9/8/chartex" xmlns:cx2="http://schemas.microsoft.com/office/drawing/2015/10/21/chartex" xmlns:cx3="http://schemas.microsoft.com/office/drawing/2016/5/9/chartex" xmlns:cx4="http://schemas.microsoft.com/office/drawing/2016/5/10/chartex" xmlns:cx5="http://schemas.microsoft.com/office/drawing/2016/5/11/chartex" xmlns:cx6="http://schemas.microsoft.com/office/drawing/2016/5/12/chartex" xmlns:cx7="http://schemas.microsoft.com/office/drawing/2016/5/13/chartex" xmlns:cx8="http://schemas.microsoft.com/office/drawing/2016/5/14/chartex" xmlns:mc="http://schemas.openxmlformats.org/markup-compatibility/2006" xmlns:aink="http://schemas.microsoft.com/office/drawing/2016/ink" xmlns:am3d="http://schemas.microsoft.com/office/drawing/2017/model3d" xmlns:o="urn:schemas-microsoft-com:office:office" xmlns:oel="http://schemas.microsoft.com/office/2019/extlst" xmlns:r="http://schemas.openxmlformats.org/officeDocument/2006/relationships" xmlns:m="http://schemas.openxmlformats.org/officeDocument/2006/math" xmlns:v="urn:schemas-microsoft-com:vml" xmlns:wp14="http://schemas.microsoft.com/office/word/2010/wordprocessingDrawing" xmlns:wp="http://schemas.openxmlformats.org/drawingml/2006/wordprocessingDrawing" xmlns:w10="urn:schemas-microsoft-com:office:word" xmlns:w="http://schemas.openxmlformats.org/wordprocessingml/2006/main" xmlns:w14="http://schemas.microsoft.com/office/word/2010/wordml" xmlns:w15="http://schemas.microsoft.com/office/word/2012/wordml" xmlns:w16cex="http://schemas.microsoft.com/office/word/2018/wordml/cex" xmlns:w16cid="http://schemas.microsoft.com/office/word/2016/wordml/cid" xmlns:w16="http://schemas.microsoft.com/office/word/2018/wordml" xmlns:w16du="http://schemas.microsoft.com/office/word/2023/wordml/word16du" xmlns:w16sdtdh="http://schemas.microsoft.com/office/word/2020/wordml/sdtdatahash" xmlns:w16sdtfl="http://schemas.microsoft.com/office/word/2024/wordml/sdtformatlock" xmlns:w16se="http://schemas.microsoft.com/office/word/2015/wordml/symex" xmlns:wpg="http://schemas.microsoft.com/office/word/2010/wordprocessingGroup" xmlns:wpi="http://schemas.microsoft.com/office/word/2010/wordprocessingInk" xmlns:wne="http://schemas.microsoft.com/office/word/2006/wordml" xmlns:wps="http://schemas.microsoft.com/office/word/2010/wordprocessingShape" mc:Ignorable="w14 w15 w16se w16cid w16 w16cex w16sdtdh w16sdtfl w16du wp14">
+  <w:body>
+    <w:p>
+      <w:pPr>
+        <w:rPr>
+          <w:rFonts w:ascii="Calibri" w:hAnsi="Calibri" w:cs="Calibri"/>
+        </w:rPr>
+      </w:pPr>
+      <w:bookmarkStart w:id="0" w:name="_ht9zwna7w4do"/>
+      <w:bookmarkStart w:id="1" w:name="_alkxysdga6x8" w:colFirst="0" w:colLast="0"/>
+      <w:bookmarkStart w:id="2" w:name="_Hlk190487182"/>
+      <w:bookmarkEnd w:id="0"/>
+      <w:bookmarkEnd w:id="1"/>
+    </w:p>
+    <w:p>
+      <w:pPr>
+        <w:rPr>
+          <w:rFonts w:ascii="Calibri" w:hAnsi="Calibri" w:cs="Calibri"/>
+        </w:rPr>
+      </w:pPr>
+      <w:bookmarkStart w:id="3" w:name="_pt5h7plkpyez" w:colFirst="0" w:colLast="0"/>
+      <w:bookmarkEnd w:id="3"/>
+    </w:p>
+    <w:p>
+      <w:pPr>
+        <w:rPr>
+          <w:rFonts w:ascii="Calibri" w:hAnsi="Calibri" w:cs="Calibri"/>
+        </w:rPr>
+      </w:pPr>
+    </w:p>
+    <w:p>
+      <w:pPr>
+        <w:rPr>
+          <w:rFonts w:ascii="Calibri" w:hAnsi="Calibri" w:cs="Calibri"/>
+        </w:rPr>
+      </w:pPr>
+    </w:p>
+    <w:p>
+      <w:pPr>
+        <w:rPr>
+          <w:rFonts w:ascii="Calibri" w:hAnsi="Calibri" w:cs="Calibri"/>
+        </w:rPr>
+      </w:pPr>
+    </w:p>
+    <w:p>
+      <w:pPr>
+        <w:rPr>
+          <w:rFonts w:ascii="Calibri" w:hAnsi="Calibri" w:cs="Calibri"/>
+        </w:rPr>
+      </w:pPr>
+    </w:p>
+    <w:p>
+      <w:pPr>
+        <w:rPr>
+          <w:rFonts w:ascii="Calibri" w:hAnsi="Calibri" w:cs="Calibri"/>
+        </w:rPr>
+      </w:pPr>
+    </w:p>
+    <w:p>
+      <w:pPr>
+        <w:rPr>
+          <w:rFonts w:ascii="Calibri" w:hAnsi="Calibri" w:cs="Calibri"/>
+        </w:rPr>
+      </w:pPr>
+    </w:p>
+    <w:p>
+      <w:pPr>
+        <w:rPr>
+          <w:rFonts w:ascii="Calibri" w:hAnsi="Calibri" w:cs="Calibri"/>
+        </w:rPr>
+      </w:pPr>
+    </w:p>
+    <w:p>
+      <w:pPr>
+        <w:rPr>
+          <w:rFonts w:ascii="Calibri" w:hAnsi="Calibri" w:cs="Calibri"/>
+        </w:rPr>
+      </w:pPr>
+    </w:p>
+    <w:p>
+      <w:pPr>
+        <w:rPr>
+          <w:rFonts w:ascii="Calibri" w:hAnsi="Calibri" w:cs="Calibri"/>
+        </w:rPr>
+      </w:pPr>
+    </w:p>
+    <w:p>
+      <w:pPr>
+        <w:rPr>
+          <w:rFonts w:ascii="Calibri" w:hAnsi="Calibri" w:cs="Calibri"/>
+        </w:rPr>
+      </w:pPr>
+      <w:bookmarkStart w:id="4" w:name="_gli44eea0fa8" w:colFirst="0" w:colLast="0"/>
+      <w:bookmarkEnd w:id="4"/>
+    </w:p>
+    <w:p>
+      <w:pPr>
+        <w:rPr>
+          <w:rFonts w:ascii="Calibri" w:hAnsi="Calibri" w:cs="Calibri"/>
+        </w:rPr>
+      </w:pPr>
+    </w:p>
+    <w:p>
+      <w:pPr>
+        <w:rPr>
+          <w:rFonts w:ascii="Calibri" w:hAnsi="Calibri" w:cs="Calibri"/>
+        </w:rPr>
+      </w:pPr>
+    </w:p>
+    <w:bookmarkEnd w:id="2"/>
+    <w:p>
+      <w:pPr>
+        <w:spacing w:before="240" w:after="240"/>
+        <w:jc w:val="right"/>
+        <w:rPr>
+          <w:rFonts w:ascii="Calibri" w:eastAsia="Calibri" w:hAnsi="Calibri" w:cs="Calibri"/>
+          <w:sz w:val="48"/>
+          <w:szCs w:val="48"/>
+        </w:rPr>
+      </w:pPr>
+      <w:r>
+        <w:rPr>
+          <w:rFonts w:ascii="Calibri" w:eastAsia="Calibri" w:hAnsi="Calibri" w:cs="Calibri"/>
+          <w:b/>
+          <w:color w:val="334682"/>
+          <w:sz w:val="48"/>
+          <w:szCs w:val="48"/>
+        </w:rPr>
+        <w:t>Estimativa de Esforço e Cronograma</w:t>
+      </w:r>
+    </w:p>
+    <w:p>
+      <w:pPr>
+        <w:pBdr>
+          <w:top w:val="nil"/>
+          <w:left w:val="nil"/>
+          <w:bottom w:val="nil"/>
+          <w:right w:val="nil"/>
+          <w:between w:val="nil"/>
+        </w:pBdr>
+        <w:spacing w:before="240" w:after="240"/>
+        <w:jc w:val="right"/>
+        <w:rPr>
+          <w:rFonts w:ascii="Calibri" w:eastAsia="Calibri" w:hAnsi="Calibri" w:cs="Calibri"/>
+          <w:b/>
+          <w:bCs/>
+          <w:color w:val="334682"/>
+          <w:sz w:val="28"/>
+          <w:szCs w:val="28"/>
+        </w:rPr>
+      </w:pPr>
+      <w:r>
+        <w:rPr>
+          <w:rFonts w:ascii="Calibri" w:eastAsia="Calibri" w:hAnsi="Calibri" w:cs="Calibri"/>
+          <w:b/>
+          <w:bCs/>
+          <w:color w:val="334682"/>
+          <w:sz w:val="28"/>
+          <w:szCs w:val="28"/>
+        </w:rPr>
+        <w:t>SS-CTNI-0534-2021.00-[NNN]-[AAAA]</w:t>
+      </w:r>
+    </w:p>
+    <w:p>
+      <w:pPr>
+        <w:rPr>
+          <w:rFonts w:ascii="Calibri" w:eastAsia="Calibri" w:hAnsi="Calibri" w:cs="Calibri"/>
+        </w:rPr>
+      </w:pPr>
+    </w:p>
+    <w:p>
+      <w:pPr>
+        <w:rPr>
+          <w:rFonts w:ascii="Calibri" w:eastAsia="Calibri" w:hAnsi="Calibri" w:cs="Calibri"/>
+        </w:rPr>
+      </w:pPr>
+    </w:p>
+    <w:p>
+      <w:pPr>
+        <w:rPr>
+          <w:rFonts w:ascii="Calibri" w:eastAsia="Calibri" w:hAnsi="Calibri" w:cs="Calibri"/>
+        </w:rPr>
+      </w:pPr>
+    </w:p>
+    <w:p>
+      <w:pPr>
+        <w:rPr>
+          <w:rFonts w:ascii="Calibri" w:eastAsia="Calibri" w:hAnsi="Calibri" w:cs="Calibri"/>
+        </w:rPr>
+      </w:pPr>
+    </w:p>
+    <w:p>
+      <w:pPr>
+        <w:rPr>
+          <w:rFonts w:ascii="Calibri" w:eastAsia="Calibri" w:hAnsi="Calibri" w:cs="Calibri"/>
+        </w:rPr>
+      </w:pPr>
+    </w:p>
+    <w:p>
+      <w:pPr>
+        <w:rPr>
+          <w:rFonts w:ascii="Calibri" w:eastAsia="Calibri" w:hAnsi="Calibri" w:cs="Calibri"/>
+        </w:rPr>
+      </w:pPr>
+    </w:p>
+    <w:p>
+      <w:pPr>
+        <w:pBdr>
+          <w:top w:val="nil"/>
+          <w:left w:val="nil"/>
+          <w:bottom w:val="nil"/>
+          <w:right w:val="nil"/>
+          <w:between w:val="nil"/>
+        </w:pBdr>
+        <w:spacing w:before="240" w:after="240"/>
+        <w:jc w:val="right"/>
+        <w:rPr>
+          <w:rFonts w:ascii="Calibri" w:eastAsia="Calibri" w:hAnsi="Calibri" w:cs="Calibri"/>
+          <w:b/>
+          <w:color w:val="334682"/>
+          <w:sz w:val="28"/>
+          <w:szCs w:val="28"/>
+        </w:rPr>
+      </w:pPr>
+      <w:r>
+        <w:rPr>
+          <w:rFonts w:ascii="Calibri" w:eastAsia="Calibri" w:hAnsi="Calibri" w:cs="Calibri"/>
+          <w:b/>
+          <w:color w:val="334682"/>
+          <w:sz w:val="28"/>
+          <w:szCs w:val="28"/>
+        </w:rPr>
+        <w:t>Versão 1.0</w:t>
+      </w:r>
+    </w:p>
+    <w:p>
+      <w:pPr>
+        <w:pBdr>
+          <w:top w:val="nil"/>
+          <w:left w:val="nil"/>
+          <w:bottom w:val="nil"/>
+          <w:right w:val="nil"/>
+          <w:between w:val="nil"/>
+        </w:pBdr>
+        <w:spacing w:before="240" w:after="240"/>
+        <w:jc w:val="right"/>
+        <w:rPr>
+          <w:rFonts w:ascii="Calibri" w:eastAsia="Calibri" w:hAnsi="Calibri" w:cs="Calibri"/>
+          <w:b/>
+          <w:bCs/>
+          <w:sz w:val="40"/>
+          <w:szCs w:val="40"/>
+          <w:u w:val="single"/>
+        </w:rPr>
+      </w:pPr>
+      <w:r>
+        <w:rPr>
+          <w:rFonts w:ascii="Calibri" w:eastAsia="Calibri" w:hAnsi="Calibri" w:cs="Calibri"/>
+          <w:b/>
+          <w:color w:val="334682"/>
+          <w:sz w:val="28"/>
+          <w:szCs w:val="28"/>
+        </w:rPr>
+        <w:t>[DATA_ATUAL]</w:t>
+      </w:r>
+    </w:p>
+    <w:p>
+      <w:pPr>
+        <w:rPr>
+          <w:rFonts w:ascii="Calibri" w:hAnsi="Calibri" w:cs="Calibri"/>
+          <w:b/>
+          <w:color w:val="334682"/>
+          <w:sz w:val="42"/>
+          <w:szCs w:val="42"/>
+        </w:rPr>
+      </w:pPr>
+      <w:bookmarkStart w:id="5" w:name="_i2upxltnlkdd"/>
+      <w:bookmarkEnd w:id="5"/>
+      <w:r>
+        <w:rPr>
+          <w:rFonts w:ascii="Calibri" w:hAnsi="Calibri" w:cs="Calibri"/>
+        </w:rPr>
+        <w:br w:type="page"/>
+      </w:r>
+    </w:p>
+    <w:p>
+      <w:pPr>
+        <w:rPr>
+          <w:rFonts w:ascii="Calibri" w:hAnsi="Calibri" w:cs="Calibri"/>
+        </w:rPr>
+      </w:pPr>
+      <w:bookmarkStart w:id="6" w:name="_f2q8bufb49ap" w:colFirst="0" w:colLast="0"/>
+      <w:bookmarkEnd w:id="6"/>
+    </w:p>
+    <w:p>
+      <w:pPr>
+        <w:jc w:val="center"/>
+        <w:rPr>
+          <w:rFonts w:ascii="Calibri" w:eastAsia="Calibri" w:hAnsi="Calibri" w:cs="Calibri"/>
+        </w:rPr>
+      </w:pPr>
+      <w:r>
+        <w:rPr>
+          <w:rFonts w:ascii="Calibri" w:eastAsia="Calibri" w:hAnsi="Calibri" w:cs="Calibri"/>
+          <w:b/>
+          <w:color w:val="334682"/>
+          <w:sz w:val="42"/>
+          <w:szCs w:val="42"/>
+        </w:rPr>
+        <w:t>Histórico de Revisão</w:t>
+      </w:r>
+    </w:p>
+    <w:p>
+      <w:pPr>
+        <w:spacing w:before="240" w:after="240"/>
+        <w:rPr>
+          <w:rFonts w:ascii="Calibri" w:eastAsia="Corbel" w:hAnsi="Calibri" w:cs="Calibri"/>
+        </w:rPr>
+      </w:pPr>
+      <w:r>
+        <w:rPr>
+          <w:rFonts w:ascii="Calibri" w:eastAsia="Corbel" w:hAnsi="Calibri" w:cs="Calibri"/>
+        </w:rPr>
+        <w:t xml:space="preserve"> </w:t>
+      </w:r>
+    </w:p>
+    <w:tbl>
+      <w:tblPr>
+        <w:tblW w:w="9630" w:type="dxa"/>
+        <w:tblInd w:w="2" w:type="dxa"/>
+        <w:tblBorders>
+          <w:top w:val="nil"/>
+          <w:left w:val="nil"/>
+          <w:bottom w:val="nil"/>
+          <w:right w:val="nil"/>
+          <w:insideH w:val="nil"/>
+          <w:insideV w:val="nil"/>
+        </w:tblBorders>
+        <w:tblLook w:val="0600" w:firstRow="0" w:lastRow="0" w:firstColumn="0" w:lastColumn="0" w:noHBand="1" w:noVBand="1"/>
+      </w:tblPr>
+      <w:tblGrid>
+        <w:gridCol w:w="2445"/>
+        <w:gridCol w:w="3690"/>
+        <w:gridCol w:w="3495"/>
+      </w:tblGrid>
+      <w:tr>
+        <w:trPr>
+          <w:trHeight w:val="460"/>
+        </w:trPr>
+        <w:tc>
+          <w:tcPr>
+            <w:tcW w:w="1785" w:type="dxa"/>
+            <w:tcBorders>
+              <w:top w:val="single" w:sz="8" w:space="0" w:color="000000" w:themeColor="text1"/>
+              <w:left w:val="single" w:sz="8" w:space="0" w:color="000000" w:themeColor="text1"/>
+              <w:bottom w:val="single" w:sz="8" w:space="0" w:color="000000" w:themeColor="text1"/>
+              <w:right w:val="single" w:sz="8" w:space="0" w:color="000000" w:themeColor="text1"/>
+            </w:tcBorders>
+            <w:tcMar>
+              <w:top w:w="100" w:type="dxa"/>
+              <w:left w:w="100" w:type="dxa"/>
+              <w:bottom w:w="100" w:type="dxa"/>
+              <w:right w:w="100" w:type="dxa"/>
+            </w:tcMar>
+          </w:tcPr>
+          <w:p>
+            <w:pPr>
+              <w:spacing w:before="240" w:after="240" w:line="240" w:lineRule="auto"/>
+              <w:rPr>
+                <w:rFonts w:ascii="Calibri" w:eastAsia="Calibri" w:hAnsi="Calibri" w:cs="Calibri"/>
+                <w:b/>
+                <w:sz w:val="24"/>
+                <w:szCs w:val="24"/>
+              </w:rPr>
+            </w:pPr>
+            <w:r>
+              <w:rPr>
+                <w:rFonts w:ascii="Calibri" w:eastAsia="Calibri" w:hAnsi="Calibri" w:cs="Calibri"/>
+                <w:b/>
+                <w:sz w:val="24"/>
+                <w:szCs w:val="24"/>
+              </w:rPr>
+              <w:t>Data</w:t>
+            </w:r>
+          </w:p>
+        </w:tc>
+        <w:tc>
+          <w:tcPr>
+            <w:tcW w:w="5475" w:type="dxa"/>
+            <w:tcBorders>
+              <w:top w:val="single" w:sz="8" w:space="0" w:color="000000" w:themeColor="text1"/>
+              <w:left w:val="nil"/>
+              <w:bottom w:val="single" w:sz="8" w:space="0" w:color="000000" w:themeColor="text1"/>
+              <w:right w:val="single" w:sz="8" w:space="0" w:color="000000" w:themeColor="text1"/>
+            </w:tcBorders>
+            <w:tcMar>
+              <w:top w:w="100" w:type="dxa"/>
+              <w:left w:w="100" w:type="dxa"/>
+              <w:bottom w:w="100" w:type="dxa"/>
+              <w:right w:w="100" w:type="dxa"/>
+            </w:tcMar>
+          </w:tcPr>
+          <w:p>
+            <w:pPr>
+              <w:spacing w:before="240" w:after="240" w:line="240" w:lineRule="auto"/>
+              <w:rPr>
+                <w:rFonts w:ascii="Calibri" w:eastAsia="Calibri" w:hAnsi="Calibri" w:cs="Calibri"/>
+                <w:b/>
+                <w:sz w:val="24"/>
+                <w:szCs w:val="24"/>
+              </w:rPr>
+            </w:pPr>
+            <w:r>
+              <w:rPr>
+                <w:rFonts w:ascii="Calibri" w:eastAsia="Calibri" w:hAnsi="Calibri" w:cs="Calibri"/>
+                <w:b/>
+                <w:sz w:val="24"/>
+                <w:szCs w:val="24"/>
+              </w:rPr>
+              <w:t>Descrição</w:t>
+            </w:r>
+          </w:p>
+        </w:tc>
+        <w:tc>
+          <w:tcPr>
+            <w:tcW w:w="2370" w:type="dxa"/>
+            <w:tcBorders>
+              <w:top w:val="single" w:sz="8" w:space="0" w:color="000000" w:themeColor="text1"/>
+              <w:left w:val="nil"/>
+              <w:bottom w:val="single" w:sz="8" w:space="0" w:color="000000" w:themeColor="text1"/>
+              <w:right w:val="single" w:sz="8" w:space="0" w:color="000000" w:themeColor="text1"/>
+            </w:tcBorders>
+            <w:tcMar>
+              <w:top w:w="100" w:type="dxa"/>
+              <w:left w:w="100" w:type="dxa"/>
+              <w:bottom w:w="100" w:type="dxa"/>
+              <w:right w:w="100" w:type="dxa"/>
+            </w:tcMar>
+          </w:tcPr>
+          <w:p>
+            <w:pPr>
+              <w:spacing w:before="240" w:after="240" w:line="240" w:lineRule="auto"/>
+              <w:rPr>
+                <w:rFonts w:ascii="Calibri" w:eastAsia="Calibri" w:hAnsi="Calibri" w:cs="Calibri"/>
+                <w:b/>
+                <w:sz w:val="24"/>
+                <w:szCs w:val="24"/>
+              </w:rPr>
+            </w:pPr>
+            <w:r>
+              <w:rPr>
+                <w:rFonts w:ascii="Calibri" w:eastAsia="Calibri" w:hAnsi="Calibri" w:cs="Calibri"/>
+                <w:b/>
+                <w:sz w:val="24"/>
+                <w:szCs w:val="24"/>
+              </w:rPr>
+              <w:t>Autor</w:t>
+            </w:r>
+          </w:p>
+        </w:tc>
+      </w:tr>
+      <w:tr>
+        <w:trPr>
+          <w:trHeight w:val="560"/>
+        </w:trPr>
+        <w:tc>
+          <w:tcPr>
+            <w:tcW w:w="1785" w:type="dxa"/>
+            <w:tcBorders>
+              <w:top w:val="nil"/>
+              <w:left w:val="single" w:sz="8" w:space="0" w:color="000000" w:themeColor="text1"/>
+              <w:bottom w:val="single" w:sz="8" w:space="0" w:color="000000" w:themeColor="text1"/>
+              <w:right w:val="single" w:sz="8" w:space="0" w:color="000000" w:themeColor="text1"/>
+            </w:tcBorders>
+            <w:tcMar>
+              <w:top w:w="100" w:type="dxa"/>
+              <w:left w:w="100" w:type="dxa"/>
+              <w:bottom w:w="100" w:type="dxa"/>
+              <w:right w:w="100" w:type="dxa"/>
+            </w:tcMar>
+            <w:vAlign w:val="center"/>
+          </w:tcPr>
+          <w:p>
+            <w:pPr>
+              <w:spacing w:before="240" w:after="240" w:line="240" w:lineRule="auto"/>
+              <w:rPr>
+                <w:rFonts w:ascii="Calibri" w:eastAsia="Calibri" w:hAnsi="Calibri" w:cs="Calibri"/>
+                <w:sz w:val="24"/>
+                <w:szCs w:val="24"/>
+              </w:rPr>
+            </w:pPr>
+            <w:r>
+              <w:rPr>
+                <w:rFonts w:ascii="Calibri" w:eastAsia="Calibri" w:hAnsi="Calibri" w:cs="Calibri"/>
+                <w:sz w:val="24"/>
+                <w:szCs w:val="24"/>
+              </w:rPr>
+              <w:t>[DATA_</w:t>
+            </w:r>
+            <w:r>
+              <w:rPr>
+                <w:rFonts w:ascii="Calibri" w:eastAsia="Calibri" w:hAnsi="Calibri" w:cs="Calibri"/>
+                <w:sz w:val="24"/>
+                <w:szCs w:val="24"/>
+              </w:rPr>
+              <w:t>CRIACAO</w:t>
+            </w:r>
+            <w:r>
+              <w:rPr>
+                <w:rFonts w:ascii="Calibri" w:eastAsia="Calibri" w:hAnsi="Calibri" w:cs="Calibri"/>
+                <w:sz w:val="24"/>
+                <w:szCs w:val="24"/>
+              </w:rPr>
+              <w:t>]</w:t>
+            </w:r>
+          </w:p>
+        </w:tc>
+        <w:tc>
+          <w:tcPr>
+            <w:tcW w:w="5475" w:type="dxa"/>
+            <w:tcBorders>
+              <w:top w:val="nil"/>
+              <w:left w:val="nil"/>
+              <w:bottom w:val="single" w:sz="8" w:space="0" w:color="000000" w:themeColor="text1"/>
+              <w:right w:val="single" w:sz="8" w:space="0" w:color="000000" w:themeColor="text1"/>
+            </w:tcBorders>
+            <w:tcMar>
+              <w:top w:w="100" w:type="dxa"/>
+              <w:left w:w="100" w:type="dxa"/>
+              <w:bottom w:w="100" w:type="dxa"/>
+              <w:right w:w="100" w:type="dxa"/>
+            </w:tcMar>
+            <w:vAlign w:val="center"/>
+          </w:tcPr>
+          <w:p>
+            <w:pPr>
+              <w:spacing w:before="240" w:after="240" w:line="240" w:lineRule="auto"/>
+              <w:rPr>
+                <w:rFonts w:ascii="Calibri" w:eastAsia="Calibri" w:hAnsi="Calibri" w:cs="Calibri"/>
+                <w:sz w:val="24"/>
+                <w:szCs w:val="24"/>
+              </w:rPr>
+            </w:pPr>
+            <w:r>
+              <w:rPr>
+                <w:rFonts w:ascii="Calibri" w:eastAsia="Calibri" w:hAnsi="Calibri" w:cs="Calibri"/>
+                <w:sz w:val="24"/>
+                <w:szCs w:val="24"/>
+              </w:rPr>
+              <w:t>Criação do documento</w:t>
+            </w:r>
+          </w:p>
+        </w:tc>
+        <w:tc>
+          <w:tcPr>
+            <w:tcW w:w="2370" w:type="dxa"/>
+            <w:tcBorders>
+              <w:top w:val="nil"/>
+              <w:left w:val="nil"/>
+              <w:bottom w:val="single" w:sz="8" w:space="0" w:color="000000" w:themeColor="text1"/>
+              <w:right w:val="single" w:sz="8" w:space="0" w:color="000000" w:themeColor="text1"/>
+            </w:tcBorders>
+            <w:tcMar>
+              <w:top w:w="100" w:type="dxa"/>
+              <w:left w:w="100" w:type="dxa"/>
+              <w:bottom w:w="100" w:type="dxa"/>
+              <w:right w:w="100" w:type="dxa"/>
+            </w:tcMar>
+            <w:vAlign w:val="center"/>
+          </w:tcPr>
+          <w:p>
+            <w:pPr>
+              <w:spacing w:before="240" w:after="240" w:line="240" w:lineRule="auto"/>
+              <w:rPr>
+                <w:rFonts w:ascii="Calibri" w:eastAsia="Calibri" w:hAnsi="Calibri" w:cs="Calibri"/>
+                <w:sz w:val="24"/>
+                <w:szCs w:val="24"/>
+              </w:rPr>
+            </w:pPr>
+            <w:r>
+              <w:rPr>
+                <w:rFonts w:ascii="Calibri" w:eastAsia="Calibri" w:hAnsi="Calibri" w:cs="Calibri"/>
+                <w:sz w:val="24"/>
+                <w:szCs w:val="24"/>
+              </w:rPr>
+              <w:t>[INICIAIS_AUTOR</w:t>
+            </w:r>
+            <w:r>
+              <w:rPr>
+                <w:rFonts w:ascii="Calibri" w:eastAsia="Calibri" w:hAnsi="Calibri" w:cs="Calibri"/>
+                <w:sz w:val="24"/>
+                <w:szCs w:val="24"/>
+              </w:rPr>
+              <w:t>_CRIACAO</w:t>
+            </w:r>
+            <w:r>
+              <w:rPr>
+                <w:rFonts w:ascii="Calibri" w:eastAsia="Calibri" w:hAnsi="Calibri" w:cs="Calibri"/>
+                <w:sz w:val="24"/>
+                <w:szCs w:val="24"/>
+              </w:rPr>
+              <w:t>]</w:t>
+            </w:r>
+          </w:p>
+        </w:tc>
+      </w:tr>
+      <w:tr>
+        <w:trPr>
+          <w:cantSplit/>
+          <w:trHeight w:val="1134"/>
+        </w:trPr>
+        <w:tc>
+          <w:tcPr>
+            <w:tcW w:w="1785" w:type="dxa"/>
+            <w:tcBorders>
+              <w:top w:val="nil"/>
+              <w:left w:val="single" w:sz="8" w:space="0" w:color="000000" w:themeColor="text1"/>
+              <w:bottom w:val="single" w:sz="8" w:space="0" w:color="000000" w:themeColor="text1"/>
+              <w:right w:val="single" w:sz="8" w:space="0" w:color="000000" w:themeColor="text1"/>
+            </w:tcBorders>
+            <w:tcMar>
+              <w:top w:w="100" w:type="dxa"/>
+              <w:left w:w="100" w:type="dxa"/>
+              <w:bottom w:w="100" w:type="dxa"/>
+              <w:right w:w="100" w:type="dxa"/>
+            </w:tcMar>
+            <w:vAlign w:val="center"/>
+          </w:tcPr>
+          <w:p>
+            <w:pPr>
+              <w:spacing w:before="240" w:after="240" w:line="240" w:lineRule="auto"/>
+              <w:rPr>
+                <w:rFonts w:ascii="Calibri" w:eastAsia="Calibri" w:hAnsi="Calibri" w:cs="Calibri"/>
+                <w:sz w:val="24"/>
+                <w:szCs w:val="24"/>
+              </w:rPr>
+            </w:pPr>
+            <w:r>
+              <w:rPr>
+                <w:rFonts w:ascii="Calibri" w:eastAsia="Calibri" w:hAnsi="Calibri" w:cs="Calibri"/>
+                <w:sz w:val="24"/>
+                <w:szCs w:val="24"/>
+              </w:rPr>
+              <w:t>[DATA_MODIFICACAO]</w:t>
+            </w:r>
+          </w:p>
+        </w:tc>
+        <w:tc>
+          <w:tcPr>
+            <w:tcW w:w="5475" w:type="dxa"/>
+            <w:tcBorders>
+              <w:top w:val="nil"/>
+              <w:left w:val="nil"/>
+              <w:bottom w:val="single" w:sz="8" w:space="0" w:color="000000" w:themeColor="text1"/>
+              <w:right w:val="single" w:sz="8" w:space="0" w:color="000000" w:themeColor="text1"/>
+            </w:tcBorders>
+            <w:tcMar>
+              <w:top w:w="100" w:type="dxa"/>
+              <w:left w:w="100" w:type="dxa"/>
+              <w:bottom w:w="100" w:type="dxa"/>
+              <w:right w:w="100" w:type="dxa"/>
+            </w:tcMar>
+            <w:vAlign w:val="center"/>
+          </w:tcPr>
+          <w:p>
+            <w:pPr>
+              <w:spacing w:before="240" w:after="240" w:line="240" w:lineRule="auto"/>
+              <w:rPr>
+                <w:rFonts w:ascii="Calibri" w:eastAsia="Calibri" w:hAnsi="Calibri" w:cs="Calibri"/>
+                <w:sz w:val="24"/>
+                <w:szCs w:val="24"/>
+              </w:rPr>
+            </w:pPr>
+            <w:r>
+              <w:rPr>
+                <w:rFonts w:ascii="Calibri" w:eastAsia="Calibri" w:hAnsi="Calibri" w:cs="Calibri"/>
+                <w:sz w:val="24"/>
+                <w:szCs w:val="24"/>
+              </w:rPr>
+              <w:t>Contagem de pontos de função</w:t>
+            </w:r>
+          </w:p>
+        </w:tc>
+        <w:tc>
+          <w:tcPr>
+            <w:tcW w:w="2370" w:type="dxa"/>
+            <w:tcBorders>
+              <w:top w:val="nil"/>
+              <w:left w:val="nil"/>
+              <w:bottom w:val="single" w:sz="8" w:space="0" w:color="000000" w:themeColor="text1"/>
+              <w:right w:val="single" w:sz="8" w:space="0" w:color="000000" w:themeColor="text1"/>
+            </w:tcBorders>
+            <w:tcMar>
+              <w:top w:w="100" w:type="dxa"/>
+              <w:left w:w="100" w:type="dxa"/>
+              <w:bottom w:w="100" w:type="dxa"/>
+              <w:right w:w="100" w:type="dxa"/>
+            </w:tcMar>
+            <w:vAlign w:val="center"/>
+          </w:tcPr>
+          <w:p>
+            <w:pPr>
+              <w:spacing w:before="240" w:after="240" w:line="240" w:lineRule="auto"/>
+              <w:rPr>
+                <w:rFonts w:ascii="Calibri" w:eastAsia="Calibri" w:hAnsi="Calibri" w:cs="Calibri"/>
+                <w:sz w:val="24"/>
+                <w:szCs w:val="24"/>
+              </w:rPr>
+            </w:pPr>
+            <w:r>
+              <w:rPr>
+                <w:rFonts w:ascii="Calibri" w:eastAsia="Calibri" w:hAnsi="Calibri" w:cs="Calibri"/>
+                <w:sz w:val="24"/>
+                <w:szCs w:val="24"/>
+              </w:rPr>
+              <w:t>[INICIAIS_AUTOR</w:t>
+            </w:r>
+            <w:r>
+              <w:rPr>
+                <w:rFonts w:ascii="Calibri" w:eastAsia="Calibri" w:hAnsi="Calibri" w:cs="Calibri"/>
+                <w:sz w:val="24"/>
+                <w:szCs w:val="24"/>
+              </w:rPr>
+              <w:t>_MODIFICACAO</w:t>
+            </w:r>
+            <w:r>
+              <w:rPr>
+                <w:rFonts w:ascii="Calibri" w:eastAsia="Calibri" w:hAnsi="Calibri" w:cs="Calibri"/>
+                <w:sz w:val="24"/>
+                <w:szCs w:val="24"/>
+              </w:rPr>
+              <w:t>]</w:t>
+            </w:r>
+          </w:p>
+        </w:tc>
+      </w:tr>
+      <w:tr>
+        <w:trPr>
+          <w:trHeight w:val="480"/>
+        </w:trPr>
+        <w:tc>
+          <w:tcPr>
+            <w:tcW w:w="1785" w:type="dxa"/>
+            <w:tcBorders>
+              <w:top w:val="nil"/>
+              <w:left w:val="single" w:sz="8" w:space="0" w:color="000000" w:themeColor="text1"/>
+              <w:bottom w:val="single" w:sz="8" w:space="0" w:color="000000" w:themeColor="text1"/>
+              <w:right w:val="single" w:sz="8" w:space="0" w:color="000000" w:themeColor="text1"/>
+            </w:tcBorders>
+            <w:tcMar>
+              <w:top w:w="100" w:type="dxa"/>
+              <w:left w:w="100" w:type="dxa"/>
+              <w:bottom w:w="100" w:type="dxa"/>
+              <w:right w:w="100" w:type="dxa"/>
+            </w:tcMar>
+          </w:tcPr>
+          <w:p>
+            <w:pPr>
+              <w:spacing w:before="240" w:after="240" w:line="240" w:lineRule="auto"/>
+              <w:rPr>
+                <w:rFonts w:ascii="Calibri" w:eastAsia="Calibri" w:hAnsi="Calibri" w:cs="Calibri"/>
+                <w:sz w:val="24"/>
+                <w:szCs w:val="24"/>
+              </w:rPr>
+            </w:pPr>
+          </w:p>
+        </w:tc>
+        <w:tc>
+          <w:tcPr>
+            <w:tcW w:w="5475" w:type="dxa"/>
+            <w:tcBorders>
+              <w:top w:val="nil"/>
+              <w:left w:val="nil"/>
+              <w:bottom w:val="single" w:sz="8" w:space="0" w:color="000000" w:themeColor="text1"/>
+              <w:right w:val="single" w:sz="8" w:space="0" w:color="000000" w:themeColor="text1"/>
+            </w:tcBorders>
+            <w:tcMar>
+              <w:top w:w="100" w:type="dxa"/>
+              <w:left w:w="100" w:type="dxa"/>
+              <w:bottom w:w="100" w:type="dxa"/>
+              <w:right w:w="100" w:type="dxa"/>
+            </w:tcMar>
+          </w:tcPr>
+          <w:p>
+            <w:pPr>
+              <w:spacing w:before="240" w:after="240" w:line="240" w:lineRule="auto"/>
+              <w:rPr>
+                <w:rFonts w:ascii="Calibri" w:eastAsia="Calibri" w:hAnsi="Calibri" w:cs="Calibri"/>
+                <w:sz w:val="24"/>
+                <w:szCs w:val="24"/>
+              </w:rPr>
+            </w:pPr>
+          </w:p>
+        </w:tc>
+        <w:tc>
+          <w:tcPr>
+            <w:tcW w:w="2370" w:type="dxa"/>
+            <w:tcBorders>
+              <w:top w:val="nil"/>
+              <w:left w:val="nil"/>
+              <w:bottom w:val="single" w:sz="8" w:space="0" w:color="000000" w:themeColor="text1"/>
+              <w:right w:val="single" w:sz="8" w:space="0" w:color="000000" w:themeColor="text1"/>
+            </w:tcBorders>
+            <w:tcMar>
+              <w:top w:w="100" w:type="dxa"/>
+              <w:left w:w="100" w:type="dxa"/>
+              <w:bottom w:w="100" w:type="dxa"/>
+              <w:right w:w="100" w:type="dxa"/>
+            </w:tcMar>
+          </w:tcPr>
+          <w:p>
+            <w:pPr>
+              <w:spacing w:before="240" w:after="240" w:line="240" w:lineRule="auto"/>
+              <w:rPr>
+                <w:rFonts w:ascii="Calibri" w:eastAsia="Calibri" w:hAnsi="Calibri" w:cs="Calibri"/>
+                <w:sz w:val="24"/>
+                <w:szCs w:val="24"/>
+              </w:rPr>
+            </w:pPr>
+          </w:p>
+        </w:tc>
+      </w:tr>
+      <w:tr>
+        <w:trPr>
+          <w:trHeight w:val="460"/>
+        </w:trPr>
+        <w:tc>
+          <w:tcPr>
+            <w:tcW w:w="1785" w:type="dxa"/>
+            <w:tcBorders>
+              <w:top w:val="nil"/>
+              <w:left w:val="single" w:sz="8" w:space="0" w:color="000000" w:themeColor="text1"/>
+              <w:bottom w:val="single" w:sz="8" w:space="0" w:color="000000" w:themeColor="text1"/>
+              <w:right w:val="single" w:sz="8" w:space="0" w:color="000000" w:themeColor="text1"/>
+            </w:tcBorders>
+            <w:tcMar>
+              <w:top w:w="100" w:type="dxa"/>
+              <w:left w:w="100" w:type="dxa"/>
+              <w:bottom w:w="100" w:type="dxa"/>
+              <w:right w:w="100" w:type="dxa"/>
+            </w:tcMar>
+          </w:tcPr>
+          <w:p>
+            <w:pPr>
+              <w:spacing w:before="240" w:after="240" w:line="240" w:lineRule="auto"/>
+              <w:rPr>
+                <w:rFonts w:ascii="Calibri" w:eastAsia="Calibri" w:hAnsi="Calibri" w:cs="Calibri"/>
+                <w:sz w:val="24"/>
+                <w:szCs w:val="24"/>
+              </w:rPr>
+            </w:pPr>
+            <w:r>
+              <w:rPr>
+                <w:rFonts w:ascii="Calibri" w:eastAsia="Calibri" w:hAnsi="Calibri" w:cs="Calibri"/>
+                <w:sz w:val="24"/>
+                <w:szCs w:val="24"/>
+              </w:rPr>
+              <w:t xml:space="preserve"> </w:t>
+            </w:r>
+          </w:p>
+        </w:tc>
+        <w:tc>
+          <w:tcPr>
+            <w:tcW w:w="5475" w:type="dxa"/>
+            <w:tcBorders>
+              <w:top w:val="nil"/>
+              <w:left w:val="nil"/>
+              <w:bottom w:val="single" w:sz="8" w:space="0" w:color="000000" w:themeColor="text1"/>
+              <w:right w:val="single" w:sz="8" w:space="0" w:color="000000" w:themeColor="text1"/>
+            </w:tcBorders>
+            <w:tcMar>
+              <w:top w:w="100" w:type="dxa"/>
+              <w:left w:w="100" w:type="dxa"/>
+              <w:bottom w:w="100" w:type="dxa"/>
+              <w:right w:w="100" w:type="dxa"/>
+            </w:tcMar>
+          </w:tcPr>
+          <w:p>
+            <w:pPr>
+              <w:spacing w:before="240" w:after="240" w:line="240" w:lineRule="auto"/>
+              <w:rPr>
+                <w:rFonts w:ascii="Calibri" w:eastAsia="Calibri" w:hAnsi="Calibri" w:cs="Calibri"/>
+                <w:sz w:val="24"/>
+                <w:szCs w:val="24"/>
+              </w:rPr>
+            </w:pPr>
+            <w:r>
+              <w:rPr>
+                <w:rFonts w:ascii="Calibri" w:eastAsia="Calibri" w:hAnsi="Calibri" w:cs="Calibri"/>
+                <w:sz w:val="24"/>
+                <w:szCs w:val="24"/>
+              </w:rPr>
+              <w:t xml:space="preserve"> </w:t>
+            </w:r>
+          </w:p>
+        </w:tc>
+        <w:tc>
+          <w:tcPr>
+            <w:tcW w:w="2370" w:type="dxa"/>
+            <w:tcBorders>
+              <w:top w:val="nil"/>
+              <w:left w:val="nil"/>
+              <w:bottom w:val="single" w:sz="8" w:space="0" w:color="000000" w:themeColor="text1"/>
+              <w:right w:val="single" w:sz="8" w:space="0" w:color="000000" w:themeColor="text1"/>
+            </w:tcBorders>
+            <w:tcMar>
+              <w:top w:w="100" w:type="dxa"/>
+              <w:left w:w="100" w:type="dxa"/>
+              <w:bottom w:w="100" w:type="dxa"/>
+              <w:right w:w="100" w:type="dxa"/>
+            </w:tcMar>
+          </w:tcPr>
+          <w:p>
+            <w:pPr>
+              <w:spacing w:before="240" w:after="240" w:line="240" w:lineRule="auto"/>
+              <w:rPr>
+                <w:rFonts w:ascii="Calibri" w:eastAsia="Calibri" w:hAnsi="Calibri" w:cs="Calibri"/>
+                <w:sz w:val="24"/>
+                <w:szCs w:val="24"/>
+              </w:rPr>
+            </w:pPr>
+            <w:r>
+              <w:rPr>
+                <w:rFonts w:ascii="Calibri" w:eastAsia="Calibri" w:hAnsi="Calibri" w:cs="Calibri"/>
+                <w:sz w:val="24"/>
+                <w:szCs w:val="24"/>
+              </w:rPr>
+              <w:t xml:space="preserve"> </w:t>
+            </w:r>
+          </w:p>
+        </w:tc>
+      </w:tr>
+      <w:tr>
+        <w:trPr>
+          <w:trHeight w:val="460"/>
+        </w:trPr>
+        <w:tc>
+          <w:tcPr>
+            <w:tcW w:w="1785" w:type="dxa"/>
+            <w:tcBorders>
+              <w:top w:val="nil"/>
+              <w:left w:val="single" w:sz="8" w:space="0" w:color="000000" w:themeColor="text1"/>
+              <w:bottom w:val="single" w:sz="8" w:space="0" w:color="000000" w:themeColor="text1"/>
+              <w:right w:val="single" w:sz="8" w:space="0" w:color="000000" w:themeColor="text1"/>
+            </w:tcBorders>
+            <w:tcMar>
+              <w:top w:w="100" w:type="dxa"/>
+              <w:left w:w="100" w:type="dxa"/>
+              <w:bottom w:w="100" w:type="dxa"/>
+              <w:right w:w="100" w:type="dxa"/>
+            </w:tcMar>
+          </w:tcPr>
+          <w:p>
+            <w:pPr>
+              <w:spacing w:before="240" w:after="240" w:line="240" w:lineRule="auto"/>
+              <w:rPr>
+                <w:rFonts w:ascii="Calibri" w:eastAsia="Calibri" w:hAnsi="Calibri" w:cs="Calibri"/>
+                <w:sz w:val="24"/>
+                <w:szCs w:val="24"/>
+              </w:rPr>
+            </w:pPr>
+            <w:r>
+              <w:rPr>
+                <w:rFonts w:ascii="Calibri" w:eastAsia="Calibri" w:hAnsi="Calibri" w:cs="Calibri"/>
+                <w:sz w:val="24"/>
+                <w:szCs w:val="24"/>
+              </w:rPr>
+              <w:t xml:space="preserve"> </w:t>
+            </w:r>
+          </w:p>
+        </w:tc>
+        <w:tc>
+          <w:tcPr>
+            <w:tcW w:w="5475" w:type="dxa"/>
+            <w:tcBorders>
+              <w:top w:val="nil"/>
+              <w:left w:val="nil"/>
+              <w:bottom w:val="single" w:sz="8" w:space="0" w:color="000000" w:themeColor="text1"/>
+              <w:right w:val="single" w:sz="8" w:space="0" w:color="000000" w:themeColor="text1"/>
+            </w:tcBorders>
+            <w:tcMar>
+              <w:top w:w="100" w:type="dxa"/>
+              <w:left w:w="100" w:type="dxa"/>
+              <w:bottom w:w="100" w:type="dxa"/>
+              <w:right w:w="100" w:type="dxa"/>
+            </w:tcMar>
+          </w:tcPr>
+          <w:p>
+            <w:pPr>
+              <w:spacing w:before="240" w:after="240" w:line="240" w:lineRule="auto"/>
+              <w:rPr>
+                <w:rFonts w:ascii="Calibri" w:eastAsia="Calibri" w:hAnsi="Calibri" w:cs="Calibri"/>
+                <w:sz w:val="24"/>
+                <w:szCs w:val="24"/>
+              </w:rPr>
+            </w:pPr>
+            <w:r>
+              <w:rPr>
+                <w:rFonts w:ascii="Calibri" w:eastAsia="Calibri" w:hAnsi="Calibri" w:cs="Calibri"/>
+                <w:sz w:val="24"/>
+                <w:szCs w:val="24"/>
+              </w:rPr>
+              <w:t xml:space="preserve"> </w:t>
+            </w:r>
+          </w:p>
+        </w:tc>
+        <w:tc>
+          <w:tcPr>
+            <w:tcW w:w="2370" w:type="dxa"/>
+            <w:tcBorders>
+              <w:top w:val="nil"/>
+              <w:left w:val="nil"/>
+              <w:bottom w:val="single" w:sz="8" w:space="0" w:color="000000" w:themeColor="text1"/>
+              <w:right w:val="single" w:sz="8" w:space="0" w:color="000000" w:themeColor="text1"/>
+            </w:tcBorders>
+            <w:tcMar>
+              <w:top w:w="100" w:type="dxa"/>
+              <w:left w:w="100" w:type="dxa"/>
+              <w:bottom w:w="100" w:type="dxa"/>
+              <w:right w:w="100" w:type="dxa"/>
+            </w:tcMar>
+          </w:tcPr>
+          <w:p>
+            <w:pPr>
+              <w:spacing w:before="240" w:after="240" w:line="240" w:lineRule="auto"/>
+              <w:rPr>
+                <w:rFonts w:ascii="Calibri" w:eastAsia="Calibri" w:hAnsi="Calibri" w:cs="Calibri"/>
+                <w:sz w:val="24"/>
+                <w:szCs w:val="24"/>
+              </w:rPr>
+            </w:pPr>
+            <w:r>
+              <w:rPr>
+                <w:rFonts w:ascii="Calibri" w:eastAsia="Calibri" w:hAnsi="Calibri" w:cs="Calibri"/>
+                <w:sz w:val="24"/>
+                <w:szCs w:val="24"/>
+              </w:rPr>
+              <w:t xml:space="preserve"> </w:t>
+            </w:r>
+          </w:p>
+        </w:tc>
+      </w:tr>
+    </w:tbl>
+    <w:p>
+      <w:pPr>
+        <w:pBdr>
+          <w:top w:val="nil"/>
+          <w:left w:val="nil"/>
+          <w:bottom w:val="nil"/>
+          <w:right w:val="nil"/>
+          <w:between w:val="nil"/>
+        </w:pBdr>
+        <w:spacing w:before="240" w:after="240" w:line="360" w:lineRule="auto"/>
+        <w:jc w:val="both"/>
+        <w:rPr>
+          <w:rFonts w:ascii="Calibri" w:hAnsi="Calibri" w:cs="Calibri"/>
+        </w:rPr>
+      </w:pPr>
+      <w:r>
+        <w:rPr>
+          <w:rFonts w:ascii="Calibri" w:hAnsi="Calibri" w:cs="Calibri"/>
+        </w:rPr>
+        <w:br w:type="page"/>
+      </w:r>
+    </w:p>
+    <w:p>
+      <w:pPr>
+        <w:pBdr>
+          <w:top w:val="nil"/>
+          <w:left w:val="nil"/>
+          <w:bottom w:val="nil"/>
+          <w:right w:val="nil"/>
+          <w:between w:val="nil"/>
+        </w:pBdr>
+        <w:jc w:val="both"/>
+        <w:rPr>
+          <w:rFonts w:ascii="Calibri" w:hAnsi="Calibri" w:cs="Calibri"/>
+        </w:rPr>
+      </w:pPr>
+      <w:bookmarkStart w:id="7" w:name="_y0pa65pm7hu" w:colFirst="0" w:colLast="0"/>
+      <w:bookmarkEnd w:id="7"/>
+    </w:p>
+    <w:p>
+      <w:pPr>
+        <w:pStyle w:val="CabealhodoSumrio"/>
+        <w:spacing w:before="0" w:after="200" w:line="276" w:lineRule="auto"/>
+        <w:rPr>
+          <w:rFonts w:ascii="Calibri" w:hAnsi="Calibri" w:cs="Calibri"/>
+          <w:b/>
+          <w:bCs/>
+          <w:color w:val="334682"/>
+          <w:sz w:val="42"/>
+          <w:szCs w:val="42"/>
+        </w:rPr>
+      </w:pPr>
+      <w:r>
+        <w:rPr>
+          <w:rFonts w:ascii="Calibri" w:hAnsi="Calibri" w:cs="Calibri"/>
+          <w:b/>
+          <w:bCs/>
+          <w:color w:val="334682"/>
+          <w:sz w:val="42"/>
+          <w:szCs w:val="42"/>
+        </w:rPr>
+        <w:t>Sumário</w:t>
+      </w:r>
+    </w:p>
+    <w:p>
+      <w:pPr>
+        <w:rPr>
+          <w:rFonts w:ascii="Calibri" w:hAnsi="Calibri" w:cs="Calibri"/>
+        </w:rPr>
+      </w:pPr>
+    </w:p>
+    <w:p>
+      <w:pPr>
+        <w:rPr>
+          <w:rFonts w:ascii="Calibri" w:hAnsi="Calibri" w:cs="Calibri"/>
+        </w:rPr>
+      </w:pPr>
+    </w:p>
+    <w:p>
+      <w:pPr>
+        <w:rPr>
+          <w:rFonts w:ascii="Calibri" w:hAnsi="Calibri" w:cs="Calibri"/>
+        </w:rPr>
+      </w:pPr>
+      <w:r>
+        <w:rPr>
+          <w:rFonts w:ascii="Calibri" w:hAnsi="Calibri" w:cs="Calibri"/>
+        </w:rPr>
+        <w:br w:type="page"/>
+      </w:r>
+    </w:p>
+    <w:p>
+      <w:pPr>
+        <w:rPr>
+          <w:rFonts w:ascii="Calibri" w:hAnsi="Calibri" w:cs="Calibri"/>
+        </w:rPr>
+      </w:pPr>
+      <w:bookmarkStart w:id="8" w:name="_llibfpoyq82q" w:colFirst="0" w:colLast="0"/>
+      <w:bookmarkEnd w:id="8"/>
+    </w:p>
+    <w:p>
+      <w:pPr>
+        <w:pStyle w:val="Ttulo1"/>
+        <w:rPr>
+          <w:rFonts w:ascii="Calibri" w:eastAsia="Calibri" w:hAnsi="Calibri" w:cs="Calibri"/>
+        </w:rPr>
+      </w:pPr>
+      <w:bookmarkStart w:id="9" w:name="_Toc191013032"/>
+      <w:r>
+        <w:rPr>
+          <w:rFonts w:ascii="Calibri" w:eastAsia="Calibri" w:hAnsi="Calibri" w:cs="Calibri"/>
+        </w:rPr>
+        <w:t>1 - Introdução</w:t>
+      </w:r>
+      <w:bookmarkEnd w:id="9"/>
+    </w:p>
+    <w:p>
+      <w:pPr>
+        <w:spacing w:before="240" w:after="240" w:line="360" w:lineRule="auto"/>
+        <w:jc w:val="both"/>
+        <w:rPr>
+          <w:rFonts w:ascii="Calibri" w:eastAsia="Calibri" w:hAnsi="Calibri" w:cs="Calibri"/>
+          <w:sz w:val="24"/>
+          <w:szCs w:val="24"/>
+        </w:rPr>
+      </w:pPr>
+      <w:r>
+        <w:rPr>
+          <w:rFonts w:ascii="Calibri" w:eastAsia="Calibri" w:hAnsi="Calibri" w:cs="Calibri"/>
+          <w:sz w:val="24"/>
+          <w:szCs w:val="24"/>
+        </w:rPr>
+        <w:t>Este documento tem por objetivo complementar o documento de Estratégia de Solução ES-CTNI-0534-2021.00-[NNN]-[AAAA], descrevendo a estimativa preliminar de esforço e o cronograma de distribuição de reembolso.</w:t>
+      </w:r>
+    </w:p>
+    <w:p>
+      <w:pPr>
+        <w:pStyle w:val="Ttulo1"/>
+        <w:spacing w:after="0" w:line="360" w:lineRule="auto"/>
+        <w:jc w:val="both"/>
+        <w:rPr>
+          <w:rFonts w:ascii="Calibri" w:hAnsi="Calibri" w:cs="Calibri"/>
+        </w:rPr>
+      </w:pPr>
+      <w:bookmarkStart w:id="10" w:name="_otibrhjxvmfc" w:colFirst="0" w:colLast="0"/>
+      <w:bookmarkEnd w:id="10"/>
+      <w:r>
+        <w:rPr>
+          <w:rFonts w:ascii="Calibri" w:hAnsi="Calibri" w:cs="Calibri"/>
+        </w:rPr>
+        <w:br w:type="page"/>
+      </w:r>
+    </w:p>
+    <w:p>
+      <w:pPr>
+        <w:rPr>
+          <w:rFonts w:ascii="Calibri" w:hAnsi="Calibri" w:cs="Calibri"/>
+        </w:rPr>
+      </w:pPr>
+    </w:p>
+    <w:p>
+      <w:pPr>
+        <w:pStyle w:val="Ttulo1"/>
+        <w:jc w:val="both"/>
+        <w:rPr>
+          <w:rFonts w:ascii="Calibri" w:eastAsia="Calibri" w:hAnsi="Calibri" w:cs="Calibri"/>
+        </w:rPr>
+      </w:pPr>
+      <w:bookmarkStart w:id="11" w:name="_Toc191013033"/>
+      <w:r>
+        <w:rPr>
+          <w:rFonts w:ascii="Calibri" w:eastAsia="Calibri" w:hAnsi="Calibri" w:cs="Calibri"/>
+        </w:rPr>
+        <w:t>2 - Estimativa preliminar (PF)</w:t>
+      </w:r>
+      <w:bookmarkEnd w:id="11"/>
+    </w:p>
+    <w:tbl>
+      <w:tblPr>
+        <w:tblStyle w:val="a0"/>
+        <w:tblW w:w="9615" w:type="dxa"/>
+        <w:tblInd w:w="2" w:type="dxa"/>
+        <w:tblBorders>
+          <w:top w:val="nil"/>
+          <w:left w:val="nil"/>
+          <w:bottom w:val="nil"/>
+          <w:right w:val="nil"/>
+          <w:insideH w:val="nil"/>
+          <w:insideV w:val="nil"/>
+        </w:tblBorders>
+        <w:tblLayout w:type="fixed"/>
+        <w:tblLook w:val="0600" w:firstRow="0" w:lastRow="0" w:firstColumn="0" w:lastColumn="0" w:noHBand="1" w:noVBand="1"/>
+      </w:tblPr>
+      <w:tblGrid>
+        <w:gridCol w:w="630"/>
+        <w:gridCol w:w="6870"/>
+        <w:gridCol w:w="2115"/>
+      </w:tblGrid>
+      <w:tr>
+        <w:trPr>
+          <w:trHeight w:val="680"/>
+        </w:trPr>
+        <w:tc>
+          <w:tcPr>
+            <w:tcW w:w="630" w:type="dxa"/>
+            <w:tcBorders>
+              <w:top w:val="single" w:sz="8" w:space="0" w:color="000000" w:themeColor="text1"/>
+              <w:left w:val="single" w:sz="8" w:space="0" w:color="000000" w:themeColor="text1"/>
+              <w:bottom w:val="single" w:sz="8" w:space="0" w:color="000000" w:themeColor="text1"/>
+              <w:right w:val="single" w:sz="8" w:space="0" w:color="000000" w:themeColor="text1"/>
+            </w:tcBorders>
+            <w:shd w:val="clear" w:color="auto" w:fill="FFFFFF" w:themeFill="background1"/>
+            <w:tcMar>
+              <w:top w:w="100" w:type="dxa"/>
+              <w:left w:w="100" w:type="dxa"/>
+              <w:bottom w:w="100" w:type="dxa"/>
+              <w:right w:w="100" w:type="dxa"/>
+            </w:tcMar>
+          </w:tcPr>
+          <w:p>
+            <w:pPr>
+              <w:spacing w:line="240" w:lineRule="auto"/>
+              <w:rPr>
+                <w:rFonts w:ascii="Calibri" w:eastAsia="Calibri" w:hAnsi="Calibri" w:cs="Calibri"/>
+                <w:b/>
+                <w:sz w:val="24"/>
+                <w:szCs w:val="24"/>
+              </w:rPr>
+            </w:pPr>
+          </w:p>
+        </w:tc>
+        <w:tc>
+          <w:tcPr>
+            <w:tcW w:w="6870" w:type="dxa"/>
+            <w:tcBorders>
+              <w:top w:val="single" w:sz="8" w:space="0" w:color="000000" w:themeColor="text1"/>
+              <w:left w:val="single" w:sz="8" w:space="0" w:color="000000" w:themeColor="text1"/>
+              <w:bottom w:val="single" w:sz="8" w:space="0" w:color="000000" w:themeColor="text1"/>
+              <w:right w:val="single" w:sz="8" w:space="0" w:color="000000" w:themeColor="text1"/>
+            </w:tcBorders>
+            <w:shd w:val="clear" w:color="auto" w:fill="FFFFFF" w:themeFill="background1"/>
+            <w:tcMar>
+              <w:top w:w="100" w:type="dxa"/>
+              <w:left w:w="100" w:type="dxa"/>
+              <w:bottom w:w="100" w:type="dxa"/>
+              <w:right w:w="100" w:type="dxa"/>
+            </w:tcMar>
+            <w:vAlign w:val="center"/>
+          </w:tcPr>
+          <w:p>
+            <w:pPr>
+              <w:spacing w:line="240" w:lineRule="auto"/>
+              <w:jc w:val="center"/>
+              <w:rPr>
+                <w:rFonts w:ascii="Calibri" w:eastAsia="Calibri" w:hAnsi="Calibri" w:cs="Calibri"/>
+                <w:b/>
+                <w:bCs/>
+                <w:sz w:val="24"/>
+                <w:szCs w:val="24"/>
+              </w:rPr>
+            </w:pPr>
+            <w:r>
+              <w:rPr>
+                <w:rFonts w:ascii="Calibri" w:eastAsia="Calibri" w:hAnsi="Calibri" w:cs="Calibri"/>
+                <w:b/>
+                <w:bCs/>
+                <w:sz w:val="24"/>
+                <w:szCs w:val="24"/>
+              </w:rPr>
+              <w:t>Atividade</w:t>
+            </w:r>
+          </w:p>
+        </w:tc>
+        <w:tc>
+          <w:tcPr>
+            <w:tcW w:w="2115" w:type="dxa"/>
+            <w:tcBorders>
+              <w:top w:val="single" w:sz="8" w:space="0" w:color="000000" w:themeColor="text1"/>
+              <w:left w:val="single" w:sz="8" w:space="0" w:color="000000" w:themeColor="text1"/>
+              <w:bottom w:val="single" w:sz="8" w:space="0" w:color="000000" w:themeColor="text1"/>
+              <w:right w:val="single" w:sz="8" w:space="0" w:color="000000" w:themeColor="text1"/>
+            </w:tcBorders>
+            <w:shd w:val="clear" w:color="auto" w:fill="FFFFFF" w:themeFill="background1"/>
+            <w:tcMar>
+              <w:top w:w="100" w:type="dxa"/>
+              <w:left w:w="100" w:type="dxa"/>
+              <w:bottom w:w="100" w:type="dxa"/>
+              <w:right w:w="100" w:type="dxa"/>
+            </w:tcMar>
+            <w:vAlign w:val="center"/>
+          </w:tcPr>
+          <w:p>
+            <w:pPr>
+              <w:spacing w:line="240" w:lineRule="auto"/>
+              <w:jc w:val="center"/>
+              <w:rPr>
+                <w:rFonts w:ascii="Calibri" w:eastAsia="Calibri" w:hAnsi="Calibri" w:cs="Calibri"/>
+                <w:b/>
+                <w:sz w:val="24"/>
+                <w:szCs w:val="24"/>
+              </w:rPr>
+            </w:pPr>
+            <w:r>
+              <w:rPr>
+                <w:rFonts w:ascii="Calibri" w:eastAsia="Calibri" w:hAnsi="Calibri" w:cs="Calibri"/>
+                <w:b/>
+                <w:sz w:val="24"/>
+                <w:szCs w:val="24"/>
+              </w:rPr>
+              <w:t>PF</w:t>
+            </w:r>
+          </w:p>
+        </w:tc>
+      </w:tr>
+      <w:tr>
+        <w:trPr>
+          <w:trHeight w:val="500"/>
+        </w:trPr>
+        <w:tc>
+          <w:tcPr>
+            <w:tcW w:w="630" w:type="dxa"/>
+            <w:tcBorders>
+              <w:top w:val="nil"/>
+              <w:left w:val="single" w:sz="8" w:space="0" w:color="000000" w:themeColor="text1"/>
+              <w:bottom w:val="single" w:sz="8" w:space="0" w:color="000000" w:themeColor="text1"/>
+              <w:right w:val="single" w:sz="8" w:space="0" w:color="000000" w:themeColor="text1"/>
+            </w:tcBorders>
+            <w:tcMar>
+              <w:top w:w="100" w:type="dxa"/>
+              <w:left w:w="100" w:type="dxa"/>
+              <w:bottom w:w="100" w:type="dxa"/>
+              <w:right w:w="100" w:type="dxa"/>
+            </w:tcMar>
+            <w:vAlign w:val="center"/>
+          </w:tcPr>
+          <w:p>
+            <w:pPr>
+              <w:spacing w:line="240" w:lineRule="auto"/>
+              <w:jc w:val="center"/>
+              <w:rPr>
+                <w:rFonts w:ascii="Calibri" w:eastAsia="Calibri" w:hAnsi="Calibri" w:cs="Calibri"/>
+                <w:sz w:val="24"/>
+                <w:szCs w:val="24"/>
+                <w:highlight w:val="white"/>
+              </w:rPr>
+            </w:pPr>
+            <w:r>
+              <w:rPr>
+                <w:rFonts w:ascii="Calibri" w:eastAsia="Calibri" w:hAnsi="Calibri" w:cs="Calibri"/>
+                <w:sz w:val="24"/>
+                <w:szCs w:val="24"/>
+                <w:highlight w:val="white"/>
+              </w:rPr>
+              <w:t>1</w:t>
+            </w:r>
+          </w:p>
+        </w:tc>
+        <w:tc>
+          <w:tcPr>
+            <w:tcW w:w="6870" w:type="dxa"/>
+            <w:tcBorders>
+              <w:top w:val="nil"/>
+              <w:left w:val="single" w:sz="8" w:space="0" w:color="000000" w:themeColor="text1"/>
+              <w:bottom w:val="single" w:sz="8" w:space="0" w:color="000000" w:themeColor="text1"/>
+              <w:right w:val="single" w:sz="8" w:space="0" w:color="000000" w:themeColor="text1"/>
+            </w:tcBorders>
+            <w:tcMar>
+              <w:top w:w="100" w:type="dxa"/>
+              <w:left w:w="100" w:type="dxa"/>
+              <w:bottom w:w="100" w:type="dxa"/>
+              <w:right w:w="100" w:type="dxa"/>
+            </w:tcMar>
+            <w:vAlign w:val="center"/>
+          </w:tcPr>
+          <w:p>
+            <w:pPr>
+              <w:spacing w:line="240" w:lineRule="auto"/>
+              <w:rPr>
+                <w:rFonts w:ascii="Calibri" w:eastAsia="Calibri" w:hAnsi="Calibri" w:cs="Calibri"/>
+                <w:sz w:val="24"/>
+                <w:szCs w:val="24"/>
+              </w:rPr>
+            </w:pPr>
+            <w:r>
+              <w:rPr>
+                <w:rFonts w:ascii="Calibri" w:eastAsia="Calibri" w:hAnsi="Calibri" w:cs="Calibri"/>
+                <w:sz w:val="24"/>
+                <w:szCs w:val="24"/>
+              </w:rPr>
+              <w:t>[</w:t>
+            </w:r>
+            <w:proofErr w:type="gramStart"/>
+            <w:r>
+              <w:rPr>
+                <w:rFonts w:ascii="Calibri" w:eastAsia="Calibri" w:hAnsi="Calibri" w:cs="Calibri"/>
+                <w:sz w:val="24"/>
+                <w:szCs w:val="24"/>
+              </w:rPr>
+              <w:t>TITULO</w:t>
+            </w:r>
+            <w:proofErr w:type="gramEnd"/>
+            <w:r>
+              <w:rPr>
+                <w:rFonts w:ascii="Calibri" w:eastAsia="Calibri" w:hAnsi="Calibri" w:cs="Calibri"/>
+                <w:sz w:val="24"/>
+                <w:szCs w:val="24"/>
+              </w:rPr>
+              <w:t>]</w:t>
+            </w:r>
+          </w:p>
+        </w:tc>
+        <w:tc>
+          <w:tcPr>
+            <w:tcW w:w="2115" w:type="dxa"/>
+            <w:tcBorders>
+              <w:top w:val="nil"/>
+              <w:left w:val="single" w:sz="8" w:space="0" w:color="000000" w:themeColor="text1"/>
+              <w:bottom w:val="single" w:sz="8" w:space="0" w:color="000000" w:themeColor="text1"/>
+              <w:right w:val="single" w:sz="8" w:space="0" w:color="000000" w:themeColor="text1"/>
+            </w:tcBorders>
+            <w:tcMar>
+              <w:top w:w="100" w:type="dxa"/>
+              <w:left w:w="100" w:type="dxa"/>
+              <w:bottom w:w="100" w:type="dxa"/>
+              <w:right w:w="100" w:type="dxa"/>
+            </w:tcMar>
+            <w:vAlign w:val="center"/>
+          </w:tcPr>
+          <w:p>
+            <w:pPr>
+              <w:spacing w:line="240" w:lineRule="auto"/>
+              <w:jc w:val="center"/>
+              <w:rPr>
+                <w:rFonts w:ascii="Calibri" w:eastAsia="Calibri" w:hAnsi="Calibri" w:cs="Calibri"/>
+                <w:sz w:val="24"/>
+                <w:szCs w:val="24"/>
+              </w:rPr>
+            </w:pPr>
+            <w:r>
+              <w:rPr>
+                <w:rFonts w:ascii="Calibri" w:eastAsia="Calibri" w:hAnsi="Calibri" w:cs="Calibri"/>
+                <w:sz w:val="24"/>
+                <w:szCs w:val="24"/>
+              </w:rPr>
+              <w:t>[N_PF]</w:t>
+            </w:r>
+          </w:p>
+        </w:tc>
+      </w:tr>
+      <w:tr>
+        <w:trPr>
+          <w:trHeight w:val="500"/>
+        </w:trPr>
+        <w:tc>
+          <w:tcPr>
+            <w:tcW w:w="630" w:type="dxa"/>
+            <w:tcBorders>
+              <w:top w:val="nil"/>
+              <w:left w:val="single" w:sz="8" w:space="0" w:color="000000" w:themeColor="text1"/>
+              <w:bottom w:val="single" w:sz="8" w:space="0" w:color="000000" w:themeColor="text1"/>
+              <w:right w:val="single" w:sz="8" w:space="0" w:color="000000" w:themeColor="text1"/>
+            </w:tcBorders>
+            <w:tcMar>
+              <w:top w:w="100" w:type="dxa"/>
+              <w:left w:w="100" w:type="dxa"/>
+              <w:bottom w:w="100" w:type="dxa"/>
+              <w:right w:w="100" w:type="dxa"/>
+            </w:tcMar>
+            <w:vAlign w:val="center"/>
+          </w:tcPr>
+          <w:p>
+            <w:pPr>
+              <w:spacing w:line="240" w:lineRule="auto"/>
+              <w:jc w:val="center"/>
+              <w:rPr>
+                <w:rFonts w:ascii="Calibri" w:eastAsia="Calibri" w:hAnsi="Calibri" w:cs="Calibri"/>
+                <w:sz w:val="24"/>
+                <w:szCs w:val="24"/>
+                <w:highlight w:val="white"/>
+              </w:rPr>
+            </w:pPr>
+          </w:p>
+        </w:tc>
+        <w:tc>
+          <w:tcPr>
+            <w:tcW w:w="6870" w:type="dxa"/>
+            <w:tcBorders>
+              <w:top w:val="nil"/>
+              <w:left w:val="single" w:sz="8" w:space="0" w:color="000000" w:themeColor="text1"/>
+              <w:bottom w:val="single" w:sz="8" w:space="0" w:color="000000" w:themeColor="text1"/>
+              <w:right w:val="single" w:sz="8" w:space="0" w:color="000000" w:themeColor="text1"/>
+            </w:tcBorders>
+            <w:tcMar>
+              <w:top w:w="100" w:type="dxa"/>
+              <w:left w:w="100" w:type="dxa"/>
+              <w:bottom w:w="100" w:type="dxa"/>
+              <w:right w:w="100" w:type="dxa"/>
+            </w:tcMar>
+            <w:vAlign w:val="center"/>
+          </w:tcPr>
+          <w:p>
+            <w:pPr>
+              <w:spacing w:line="240" w:lineRule="auto"/>
+              <w:jc w:val="center"/>
+              <w:rPr>
+                <w:rFonts w:ascii="Calibri" w:eastAsia="Calibri" w:hAnsi="Calibri" w:cs="Calibri"/>
+                <w:b/>
+                <w:sz w:val="24"/>
+                <w:szCs w:val="24"/>
+                <w:highlight w:val="white"/>
+              </w:rPr>
+            </w:pPr>
+            <w:r>
+              <w:rPr>
+                <w:rFonts w:ascii="Calibri" w:eastAsia="Calibri" w:hAnsi="Calibri" w:cs="Calibri"/>
+                <w:b/>
+                <w:sz w:val="24"/>
+                <w:szCs w:val="24"/>
+                <w:highlight w:val="white"/>
+              </w:rPr>
+              <w:t>Total</w:t>
+            </w:r>
+          </w:p>
+        </w:tc>
+        <w:tc>
+          <w:tcPr>
+            <w:tcW w:w="2115" w:type="dxa"/>
+            <w:tcBorders>
+              <w:top w:val="nil"/>
+              <w:left w:val="single" w:sz="8" w:space="0" w:color="000000" w:themeColor="text1"/>
+              <w:bottom w:val="single" w:sz="8" w:space="0" w:color="000000" w:themeColor="text1"/>
+              <w:right w:val="single" w:sz="8" w:space="0" w:color="000000" w:themeColor="text1"/>
+            </w:tcBorders>
+            <w:tcMar>
+              <w:top w:w="100" w:type="dxa"/>
+              <w:left w:w="100" w:type="dxa"/>
+              <w:bottom w:w="100" w:type="dxa"/>
+              <w:right w:w="100" w:type="dxa"/>
+            </w:tcMar>
+            <w:vAlign w:val="center"/>
+          </w:tcPr>
+          <w:p>
+            <w:pPr>
+              <w:spacing w:line="240" w:lineRule="auto"/>
+              <w:jc w:val="center"/>
+              <w:rPr>
+                <w:rFonts w:ascii="Calibri" w:eastAsia="Calibri" w:hAnsi="Calibri" w:cs="Calibri"/>
+                <w:b/>
+                <w:bCs/>
+                <w:sz w:val="24"/>
+                <w:szCs w:val="24"/>
+              </w:rPr>
+            </w:pPr>
+            <w:r>
+              <w:rPr>
+                <w:rFonts w:ascii="Calibri" w:eastAsia="Calibri" w:hAnsi="Calibri" w:cs="Calibri"/>
+                <w:b/>
+                <w:bCs/>
+                <w:sz w:val="24"/>
+                <w:szCs w:val="24"/>
+              </w:rPr>
+              <w:t>[N_PF]</w:t>
+            </w:r>
+          </w:p>
+        </w:tc>
+      </w:tr>
+    </w:tbl>
+    <w:p>
+      <w:pPr>
+        <w:spacing w:before="240" w:after="240" w:line="360" w:lineRule="auto"/>
+        <w:jc w:val="center"/>
+        <w:rPr>
+          <w:rFonts w:ascii="Calibri" w:eastAsia="Calibri" w:hAnsi="Calibri" w:cs="Calibri"/>
+        </w:rPr>
+      </w:pPr>
+      <w:r>
+        <w:rPr>
+          <w:rFonts w:ascii="Calibri" w:eastAsia="Calibri" w:hAnsi="Calibri" w:cs="Calibri"/>
+        </w:rPr>
+        <w:t>Tabela 1 – Estimativa de pontos de função.</w:t>
+      </w:r>
+    </w:p>
+    <w:p>
+      <w:pPr>
+        <w:pStyle w:val="Ttulo1"/>
+        <w:spacing w:before="240" w:after="240" w:line="360" w:lineRule="auto"/>
+        <w:jc w:val="both"/>
+      </w:pPr>
+      <w:bookmarkStart w:id="12" w:name="_oh0zdv6if8xp" w:colFirst="0" w:colLast="0"/>
+      <w:bookmarkEnd w:id="12"/>
+      <w:r>
+        <w:br w:type="page"/>
+      </w:r>
+    </w:p>
+    <w:p>
+      <w:pPr>
+        <w:rPr>
+          <w:rFonts w:ascii="Calibri" w:eastAsia="Calibri" w:hAnsi="Calibri" w:cs="Calibri"/>
+        </w:rPr>
+      </w:pPr>
+      <w:bookmarkStart w:id="13" w:name="_9uqw0j7fcvq1" w:colFirst="0" w:colLast="0"/>
+      <w:bookmarkEnd w:id="13"/>
+    </w:p>
+    <w:p>
+      <w:pPr>
+        <w:pStyle w:val="Ttulo1"/>
+        <w:jc w:val="both"/>
+        <w:rPr>
+          <w:rFonts w:ascii="Calibri" w:eastAsia="Calibri" w:hAnsi="Calibri" w:cs="Calibri"/>
+        </w:rPr>
+      </w:pPr>
+      <w:bookmarkStart w:id="14" w:name="_Toc191013034"/>
+      <w:r>
+        <w:rPr>
+          <w:rFonts w:ascii="Calibri" w:eastAsia="Calibri" w:hAnsi="Calibri" w:cs="Calibri"/>
+        </w:rPr>
+        <w:t>3 - Cronograma de distribuição de desembolso</w:t>
+      </w:r>
+      <w:bookmarkEnd w:id="14"/>
+    </w:p>
+    <w:p>
+      <w:pPr>
+        <w:spacing w:before="240" w:after="240" w:line="360" w:lineRule="auto"/>
+        <w:jc w:val="both"/>
+        <w:rPr>
+          <w:rFonts w:ascii="Calibri" w:eastAsia="Calibri" w:hAnsi="Calibri" w:cs="Calibri"/>
+          <w:sz w:val="24"/>
+          <w:szCs w:val="24"/>
+        </w:rPr>
+      </w:pPr>
+      <w:r>
+        <w:rPr>
+          <w:rFonts w:ascii="Calibri" w:eastAsia="Calibri" w:hAnsi="Calibri" w:cs="Calibri"/>
+          <w:sz w:val="24"/>
+          <w:szCs w:val="24"/>
+        </w:rPr>
+        <w:t xml:space="preserve">Na Tabela </w:t>
+      </w:r>
+      <w:r>
+        <w:rPr>
+          <w:rFonts w:ascii="Calibri" w:eastAsia="Calibri" w:hAnsi="Calibri" w:cs="Calibri"/>
+          <w:sz w:val="24"/>
+          <w:szCs w:val="24"/>
+        </w:rPr>
+        <w:t>2</w:t>
+      </w:r>
+      <w:r>
+        <w:rPr>
+          <w:rFonts w:ascii="Calibri" w:eastAsia="Calibri" w:hAnsi="Calibri" w:cs="Calibri"/>
+          <w:sz w:val="24"/>
+          <w:szCs w:val="24"/>
+        </w:rPr>
+        <w:t xml:space="preserve"> estão as autorizações de serviço necessárias para execução da solicitação de serviço SS-CTNI-0534-2021.00-</w:t>
+      </w:r>
+      <w:r>
+        <w:rPr>
+          <w:rFonts w:ascii="Calibri" w:eastAsia="Calibri" w:hAnsi="Calibri" w:cs="Calibri"/>
+          <w:sz w:val="24"/>
+          <w:szCs w:val="24"/>
+        </w:rPr>
+        <w:t>[NNN]</w:t>
+      </w:r>
+      <w:r>
+        <w:rPr>
+          <w:rFonts w:ascii="Calibri" w:eastAsia="Calibri" w:hAnsi="Calibri" w:cs="Calibri"/>
+          <w:sz w:val="24"/>
+          <w:szCs w:val="24"/>
+        </w:rPr>
+        <w:t>-</w:t>
+      </w:r>
+      <w:r>
+        <w:rPr>
+          <w:rFonts w:ascii="Calibri" w:eastAsia="Calibri" w:hAnsi="Calibri" w:cs="Calibri"/>
+          <w:sz w:val="24"/>
+          <w:szCs w:val="24"/>
+        </w:rPr>
+        <w:t>[AAAA]</w:t>
+      </w:r>
+      <w:r>
+        <w:rPr>
+          <w:rFonts w:ascii="Calibri" w:eastAsia="Calibri" w:hAnsi="Calibri" w:cs="Calibri"/>
+          <w:sz w:val="24"/>
+          <w:szCs w:val="24"/>
+        </w:rPr>
+        <w:t>.</w:t>
+      </w:r>
+    </w:p>
+    <w:tbl>
+      <w:tblPr>
+        <w:tblStyle w:val="a1"/>
+        <w:tblW w:w="9450" w:type="dxa"/>
+        <w:tblInd w:w="2" w:type="dxa"/>
+        <w:tblBorders>
+          <w:top w:val="nil"/>
+          <w:left w:val="nil"/>
+          <w:bottom w:val="nil"/>
+          <w:right w:val="nil"/>
+          <w:insideH w:val="nil"/>
+          <w:insideV w:val="nil"/>
+        </w:tblBorders>
+        <w:tblLayout w:type="fixed"/>
+        <w:tblLook w:val="0600" w:firstRow="0" w:lastRow="0" w:firstColumn="0" w:lastColumn="0" w:noHBand="1" w:noVBand="1"/>
+      </w:tblPr>
+      <w:tblGrid>
+        <w:gridCol w:w="2385"/>
+        <w:gridCol w:w="4380"/>
+        <w:gridCol w:w="2685"/>
+      </w:tblGrid>
+      <w:tr>
+        <w:trPr>
+          <w:trHeight w:val="480"/>
+        </w:trPr>
+        <w:tc>
+          <w:tcPr>
+            <w:tcW w:w="2385" w:type="dxa"/>
+            <w:tcBorders>
+              <w:top w:val="single" w:sz="8" w:space="0" w:color="000000" w:themeColor="text1"/>
+              <w:left w:val="single" w:sz="8" w:space="0" w:color="000000" w:themeColor="text1"/>
+              <w:bottom w:val="single" w:sz="8" w:space="0" w:color="000000" w:themeColor="text1"/>
+              <w:right w:val="single" w:sz="8" w:space="0" w:color="000000" w:themeColor="text1"/>
+            </w:tcBorders>
+            <w:tcMar>
+              <w:top w:w="100" w:type="dxa"/>
+              <w:left w:w="100" w:type="dxa"/>
+              <w:bottom w:w="100" w:type="dxa"/>
+              <w:right w:w="100" w:type="dxa"/>
+            </w:tcMar>
+          </w:tcPr>
+          <w:p>
+            <w:pPr>
+              <w:spacing w:before="240" w:after="240" w:line="240" w:lineRule="auto"/>
+              <w:jc w:val="center"/>
+              <w:rPr>
+                <w:rFonts w:ascii="Calibri" w:eastAsia="Calibri" w:hAnsi="Calibri" w:cs="Calibri"/>
+                <w:b/>
+                <w:sz w:val="24"/>
+                <w:szCs w:val="24"/>
+              </w:rPr>
+            </w:pPr>
+            <w:r>
+              <w:rPr>
+                <w:rFonts w:ascii="Calibri" w:eastAsia="Calibri" w:hAnsi="Calibri" w:cs="Calibri"/>
+                <w:b/>
+                <w:sz w:val="24"/>
+                <w:szCs w:val="24"/>
+              </w:rPr>
+              <w:t>Autorização</w:t>
+            </w:r>
+          </w:p>
+        </w:tc>
+        <w:tc>
+          <w:tcPr>
+            <w:tcW w:w="4380" w:type="dxa"/>
+            <w:tcBorders>
+              <w:top w:val="single" w:sz="8" w:space="0" w:color="000000" w:themeColor="text1"/>
+              <w:left w:val="nil"/>
+              <w:bottom w:val="single" w:sz="8" w:space="0" w:color="000000" w:themeColor="text1"/>
+              <w:right w:val="single" w:sz="8" w:space="0" w:color="000000" w:themeColor="text1"/>
+            </w:tcBorders>
+            <w:tcMar>
+              <w:top w:w="100" w:type="dxa"/>
+              <w:left w:w="100" w:type="dxa"/>
+              <w:bottom w:w="100" w:type="dxa"/>
+              <w:right w:w="100" w:type="dxa"/>
+            </w:tcMar>
+          </w:tcPr>
+          <w:p>
+            <w:pPr>
+              <w:spacing w:before="240" w:after="240" w:line="240" w:lineRule="auto"/>
+              <w:jc w:val="center"/>
+              <w:rPr>
+                <w:rFonts w:ascii="Calibri" w:eastAsia="Calibri" w:hAnsi="Calibri" w:cs="Calibri"/>
+                <w:b/>
+                <w:sz w:val="24"/>
+                <w:szCs w:val="24"/>
+              </w:rPr>
+            </w:pPr>
+            <w:r>
+              <w:rPr>
+                <w:rFonts w:ascii="Calibri" w:eastAsia="Calibri" w:hAnsi="Calibri" w:cs="Calibri"/>
+                <w:b/>
+                <w:sz w:val="24"/>
+                <w:szCs w:val="24"/>
+              </w:rPr>
+              <w:t>Descrição</w:t>
+            </w:r>
+          </w:p>
+        </w:tc>
+        <w:tc>
+          <w:tcPr>
+            <w:tcW w:w="2685" w:type="dxa"/>
+            <w:tcBorders>
+              <w:top w:val="single" w:sz="8" w:space="0" w:color="000000" w:themeColor="text1"/>
+              <w:left w:val="nil"/>
+              <w:bottom w:val="single" w:sz="8" w:space="0" w:color="000000" w:themeColor="text1"/>
+              <w:right w:val="single" w:sz="8" w:space="0" w:color="000000" w:themeColor="text1"/>
+            </w:tcBorders>
+            <w:tcMar>
+              <w:top w:w="100" w:type="dxa"/>
+              <w:left w:w="100" w:type="dxa"/>
+              <w:bottom w:w="100" w:type="dxa"/>
+              <w:right w:w="100" w:type="dxa"/>
+            </w:tcMar>
+          </w:tcPr>
+          <w:p>
+            <w:pPr>
+              <w:spacing w:before="240" w:after="240" w:line="240" w:lineRule="auto"/>
+              <w:jc w:val="center"/>
+              <w:rPr>
+                <w:rFonts w:ascii="Calibri" w:eastAsia="Calibri" w:hAnsi="Calibri" w:cs="Calibri"/>
+                <w:b/>
+                <w:sz w:val="24"/>
+                <w:szCs w:val="24"/>
+              </w:rPr>
+            </w:pPr>
+            <w:r>
+              <w:rPr>
+                <w:rFonts w:ascii="Calibri" w:eastAsia="Calibri" w:hAnsi="Calibri" w:cs="Calibri"/>
+                <w:b/>
+                <w:sz w:val="24"/>
+                <w:szCs w:val="24"/>
+              </w:rPr>
+              <w:t>Quantidade PF</w:t>
+            </w:r>
+          </w:p>
+        </w:tc>
+      </w:tr>
+      <w:tr>
+        <w:trPr>
+          <w:trHeight w:val="740"/>
+        </w:trPr>
+        <w:tc>
+          <w:tcPr>
+            <w:tcW w:w="2385" w:type="dxa"/>
+            <w:tcBorders>
+              <w:top w:val="nil"/>
+              <w:left w:val="single" w:sz="8" w:space="0" w:color="000000" w:themeColor="text1"/>
+              <w:bottom w:val="single" w:sz="8" w:space="0" w:color="000000" w:themeColor="text1"/>
+              <w:right w:val="single" w:sz="8" w:space="0" w:color="000000" w:themeColor="text1"/>
+            </w:tcBorders>
+            <w:tcMar>
+              <w:top w:w="100" w:type="dxa"/>
+              <w:left w:w="100" w:type="dxa"/>
+              <w:bottom w:w="100" w:type="dxa"/>
+              <w:right w:w="100" w:type="dxa"/>
+            </w:tcMar>
+          </w:tcPr>
+          <w:p>
+            <w:pPr>
+              <w:spacing w:before="240" w:after="240" w:line="240" w:lineRule="auto"/>
+              <w:jc w:val="center"/>
+              <w:rPr>
+                <w:rFonts w:ascii="Calibri" w:eastAsia="Calibri" w:hAnsi="Calibri" w:cs="Calibri"/>
+                <w:sz w:val="24"/>
+                <w:szCs w:val="24"/>
+                <w:highlight w:val="white"/>
+              </w:rPr>
+            </w:pPr>
+            <w:r>
+              <w:rPr>
+                <w:rFonts w:ascii="Calibri" w:eastAsia="Calibri" w:hAnsi="Calibri" w:cs="Calibri"/>
+                <w:sz w:val="24"/>
+                <w:szCs w:val="24"/>
+                <w:highlight w:val="white"/>
+              </w:rPr>
+              <w:t xml:space="preserve">Autorização </w:t>
+            </w:r>
+            <w:r>
+              <w:rPr>
+                <w:rFonts w:ascii="Calibri" w:eastAsia="Calibri" w:hAnsi="Calibri" w:cs="Calibri"/>
+                <w:sz w:val="24"/>
+                <w:szCs w:val="24"/>
+                <w:highlight w:val="white"/>
+              </w:rPr>
+              <w:t>[NNN]</w:t>
+            </w:r>
+          </w:p>
+        </w:tc>
+        <w:tc>
+          <w:tcPr>
+            <w:tcW w:w="4380" w:type="dxa"/>
+            <w:tcBorders>
+              <w:top w:val="nil"/>
+              <w:left w:val="nil"/>
+              <w:bottom w:val="single" w:sz="8" w:space="0" w:color="000000" w:themeColor="text1"/>
+              <w:right w:val="single" w:sz="8" w:space="0" w:color="000000" w:themeColor="text1"/>
+            </w:tcBorders>
+            <w:tcMar>
+              <w:top w:w="100" w:type="dxa"/>
+              <w:left w:w="100" w:type="dxa"/>
+              <w:bottom w:w="100" w:type="dxa"/>
+              <w:right w:w="100" w:type="dxa"/>
+            </w:tcMar>
+          </w:tcPr>
+          <w:p>
+            <w:pPr>
+              <w:spacing w:line="240" w:lineRule="auto"/>
+              <w:jc w:val="center"/>
+              <w:rPr>
+                <w:rFonts w:ascii="Calibri" w:eastAsia="Calibri" w:hAnsi="Calibri" w:cs="Calibri"/>
+                <w:sz w:val="24"/>
+                <w:szCs w:val="24"/>
+                <w:highlight w:val="white"/>
+              </w:rPr>
+            </w:pPr>
+            <w:r>
+              <w:rPr>
+                <w:rFonts w:ascii="Calibri" w:eastAsia="Calibri" w:hAnsi="Calibri" w:cs="Calibri"/>
+                <w:sz w:val="24"/>
+                <w:szCs w:val="24"/>
+                <w:highlight w:val="white"/>
+              </w:rPr>
+              <w:t>[</w:t>
+            </w:r>
+            <w:proofErr w:type="gramStart"/>
+            <w:r>
+              <w:rPr>
+                <w:rFonts w:ascii="Calibri" w:eastAsia="Calibri" w:hAnsi="Calibri" w:cs="Calibri"/>
+                <w:sz w:val="24"/>
+                <w:szCs w:val="24"/>
+                <w:highlight w:val="white"/>
+              </w:rPr>
+              <w:t>TITULO</w:t>
+            </w:r>
+            <w:proofErr w:type="gramEnd"/>
+            <w:r>
+              <w:rPr>
+                <w:rFonts w:ascii="Calibri" w:eastAsia="Calibri" w:hAnsi="Calibri" w:cs="Calibri"/>
+                <w:sz w:val="24"/>
+                <w:szCs w:val="24"/>
+                <w:highlight w:val="white"/>
+              </w:rPr>
+              <w:t>]</w:t>
+            </w:r>
+          </w:p>
+        </w:tc>
+        <w:tc>
+          <w:tcPr>
+            <w:tcW w:w="2685" w:type="dxa"/>
+            <w:tcBorders>
+              <w:top w:val="nil"/>
+              <w:left w:val="single" w:sz="8" w:space="0" w:color="000000" w:themeColor="text1"/>
+              <w:bottom w:val="single" w:sz="8" w:space="0" w:color="000000" w:themeColor="text1"/>
+              <w:right w:val="single" w:sz="8" w:space="0" w:color="000000" w:themeColor="text1"/>
+            </w:tcBorders>
+            <w:tcMar>
+              <w:top w:w="100" w:type="dxa"/>
+              <w:left w:w="100" w:type="dxa"/>
+              <w:bottom w:w="100" w:type="dxa"/>
+              <w:right w:w="100" w:type="dxa"/>
+            </w:tcMar>
+          </w:tcPr>
+          <w:p>
+            <w:pPr>
+              <w:spacing w:line="240" w:lineRule="auto"/>
+              <w:jc w:val="center"/>
+              <w:rPr>
+                <w:rFonts w:ascii="Calibri" w:eastAsia="Calibri" w:hAnsi="Calibri" w:cs="Calibri"/>
+                <w:b/>
+                <w:bCs/>
+                <w:sz w:val="24"/>
+                <w:szCs w:val="24"/>
+              </w:rPr>
+            </w:pPr>
+            <w:r>
+              <w:rPr>
+                <w:rFonts w:ascii="Calibri" w:eastAsia="Calibri" w:hAnsi="Calibri" w:cs="Calibri"/>
+                <w:b/>
+                <w:bCs/>
+                <w:sz w:val="24"/>
+                <w:szCs w:val="24"/>
+              </w:rPr>
+              <w:t>[N_PF]</w:t>
+            </w:r>
+          </w:p>
+        </w:tc>
+      </w:tr>
+    </w:tbl>
+    <w:p>
+      <w:pPr>
+        <w:spacing w:before="240" w:after="240" w:line="240" w:lineRule="auto"/>
+        <w:jc w:val="center"/>
+        <w:rPr>
+          <w:rFonts w:ascii="Calibri" w:eastAsia="Calibri" w:hAnsi="Calibri" w:cs="Calibri"/>
+        </w:rPr>
+      </w:pPr>
+      <w:r>
+        <w:rPr>
+          <w:rFonts w:ascii="Calibri" w:eastAsia="Calibri" w:hAnsi="Calibri" w:cs="Calibri"/>
+        </w:rPr>
+        <w:t xml:space="preserve">Tabela </w:t>
+      </w:r>
+      <w:r>
+        <w:rPr>
+          <w:rFonts w:ascii="Calibri" w:eastAsia="Calibri" w:hAnsi="Calibri" w:cs="Calibri"/>
+        </w:rPr>
+        <w:t>2</w:t>
+      </w:r>
+      <w:r>
+        <w:rPr>
+          <w:rFonts w:ascii="Calibri" w:eastAsia="Calibri" w:hAnsi="Calibri" w:cs="Calibri"/>
+        </w:rPr>
+        <w:t xml:space="preserve"> - Autorizações de serviço necessárias. </w:t>
+      </w:r>
+    </w:p>
+    <w:tbl>
+      <w:tblPr>
+        <w:tblStyle w:val="a2"/>
+        <w:tblW w:w="9465" w:type="dxa"/>
+        <w:tblInd w:w="2" w:type="dxa"/>
+        <w:tblBorders>
+          <w:top w:val="nil"/>
+          <w:left w:val="nil"/>
+          <w:bottom w:val="nil"/>
+          <w:right w:val="nil"/>
+          <w:insideH w:val="nil"/>
+          <w:insideV w:val="nil"/>
+        </w:tblBorders>
+        <w:tblLayout w:type="fixed"/>
+        <w:tblLook w:val="0600" w:firstRow="0" w:lastRow="0" w:firstColumn="0" w:lastColumn="0" w:noHBand="1" w:noVBand="1"/>
+      </w:tblPr>
+      <w:tblGrid>
+        <w:gridCol w:w="2400"/>
+        <w:gridCol w:w="4305"/>
+        <w:gridCol w:w="2760"/>
+      </w:tblGrid>
+      <w:tr>
+        <w:trPr>
+          <w:trHeight w:val="660"/>
+        </w:trPr>
+        <w:tc>
+          <w:tcPr>
+            <w:tcW w:w="2400" w:type="dxa"/>
+            <w:tcBorders>
+              <w:top w:val="single" w:sz="8" w:space="0" w:color="000000" w:themeColor="text1"/>
+              <w:left w:val="single" w:sz="8" w:space="0" w:color="000000" w:themeColor="text1"/>
+              <w:bottom w:val="single" w:sz="8" w:space="0" w:color="000000" w:themeColor="text1"/>
+              <w:right w:val="single" w:sz="8" w:space="0" w:color="000000" w:themeColor="text1"/>
+            </w:tcBorders>
+            <w:tcMar>
+              <w:top w:w="100" w:type="dxa"/>
+              <w:left w:w="100" w:type="dxa"/>
+              <w:bottom w:w="100" w:type="dxa"/>
+              <w:right w:w="100" w:type="dxa"/>
+            </w:tcMar>
+          </w:tcPr>
+          <w:p>
+            <w:pPr>
+              <w:spacing w:before="240" w:after="240" w:line="240" w:lineRule="auto"/>
+              <w:jc w:val="center"/>
+              <w:rPr>
+                <w:rFonts w:ascii="Calibri" w:eastAsia="Calibri" w:hAnsi="Calibri" w:cs="Calibri"/>
+                <w:b/>
+                <w:sz w:val="24"/>
+                <w:szCs w:val="24"/>
+              </w:rPr>
+            </w:pPr>
+            <w:r>
+              <w:rPr>
+                <w:rFonts w:ascii="Calibri" w:eastAsia="Calibri" w:hAnsi="Calibri" w:cs="Calibri"/>
+                <w:b/>
+                <w:sz w:val="24"/>
+                <w:szCs w:val="24"/>
+              </w:rPr>
+              <w:t>Fase</w:t>
+            </w:r>
+          </w:p>
+        </w:tc>
+        <w:tc>
+          <w:tcPr>
+            <w:tcW w:w="4305" w:type="dxa"/>
+            <w:tcBorders>
+              <w:top w:val="single" w:sz="8" w:space="0" w:color="000000" w:themeColor="text1"/>
+              <w:left w:val="nil"/>
+              <w:bottom w:val="single" w:sz="8" w:space="0" w:color="000000" w:themeColor="text1"/>
+              <w:right w:val="single" w:sz="8" w:space="0" w:color="000000" w:themeColor="text1"/>
+            </w:tcBorders>
+            <w:tcMar>
+              <w:top w:w="100" w:type="dxa"/>
+              <w:left w:w="100" w:type="dxa"/>
+              <w:bottom w:w="100" w:type="dxa"/>
+              <w:right w:w="100" w:type="dxa"/>
+            </w:tcMar>
+          </w:tcPr>
+          <w:p>
+            <w:pPr>
+              <w:spacing w:before="240" w:after="240" w:line="240" w:lineRule="auto"/>
+              <w:jc w:val="center"/>
+              <w:rPr>
+                <w:rFonts w:ascii="Calibri" w:eastAsia="Calibri" w:hAnsi="Calibri" w:cs="Calibri"/>
+                <w:b/>
+                <w:sz w:val="24"/>
+                <w:szCs w:val="24"/>
+              </w:rPr>
+            </w:pPr>
+            <w:r>
+              <w:rPr>
+                <w:rFonts w:ascii="Calibri" w:eastAsia="Calibri" w:hAnsi="Calibri" w:cs="Calibri"/>
+                <w:b/>
+                <w:sz w:val="24"/>
+                <w:szCs w:val="24"/>
+              </w:rPr>
+              <w:t>Descrição</w:t>
+            </w:r>
+          </w:p>
+        </w:tc>
+        <w:tc>
+          <w:tcPr>
+            <w:tcW w:w="2760" w:type="dxa"/>
+            <w:tcBorders>
+              <w:top w:val="single" w:sz="8" w:space="0" w:color="000000" w:themeColor="text1"/>
+              <w:left w:val="nil"/>
+              <w:bottom w:val="single" w:sz="8" w:space="0" w:color="000000" w:themeColor="text1"/>
+              <w:right w:val="single" w:sz="8" w:space="0" w:color="000000" w:themeColor="text1"/>
+            </w:tcBorders>
+            <w:tcMar>
+              <w:top w:w="100" w:type="dxa"/>
+              <w:left w:w="100" w:type="dxa"/>
+              <w:bottom w:w="100" w:type="dxa"/>
+              <w:right w:w="100" w:type="dxa"/>
+            </w:tcMar>
+          </w:tcPr>
+          <w:p>
+            <w:pPr>
+              <w:spacing w:line="240" w:lineRule="auto"/>
+              <w:jc w:val="center"/>
+              <w:rPr>
+                <w:rFonts w:ascii="Calibri" w:eastAsia="Calibri" w:hAnsi="Calibri" w:cs="Calibri"/>
+                <w:b/>
+                <w:sz w:val="24"/>
+                <w:szCs w:val="24"/>
+              </w:rPr>
+            </w:pPr>
+            <w:r>
+              <w:rPr>
+                <w:rFonts w:ascii="Calibri" w:eastAsia="Calibri" w:hAnsi="Calibri" w:cs="Calibri"/>
+                <w:b/>
+                <w:sz w:val="24"/>
+                <w:szCs w:val="24"/>
+              </w:rPr>
+              <w:t xml:space="preserve">Duração estimada </w:t>
+            </w:r>
+          </w:p>
+          <w:p>
+            <w:pPr>
+              <w:spacing w:line="240" w:lineRule="auto"/>
+              <w:jc w:val="center"/>
+              <w:rPr>
+                <w:rFonts w:ascii="Calibri" w:eastAsia="Calibri" w:hAnsi="Calibri" w:cs="Calibri"/>
+                <w:b/>
+                <w:sz w:val="24"/>
+                <w:szCs w:val="24"/>
+              </w:rPr>
+            </w:pPr>
+            <w:r>
+              <w:rPr>
+                <w:rFonts w:ascii="Calibri" w:eastAsia="Calibri" w:hAnsi="Calibri" w:cs="Calibri"/>
+                <w:b/>
+                <w:sz w:val="24"/>
+                <w:szCs w:val="24"/>
+              </w:rPr>
+              <w:t>(dias úteis)</w:t>
+            </w:r>
+          </w:p>
+        </w:tc>
+      </w:tr>
+      <w:tr>
+        <w:trPr>
+          <w:trHeight w:val="820"/>
+        </w:trPr>
+        <w:tc>
+          <w:tcPr>
+            <w:tcW w:w="2400" w:type="dxa"/>
+            <w:tcBorders>
+              <w:top w:val="nil"/>
+              <w:left w:val="single" w:sz="8" w:space="0" w:color="000000" w:themeColor="text1"/>
+              <w:bottom w:val="single" w:sz="8" w:space="0" w:color="000000" w:themeColor="text1"/>
+              <w:right w:val="single" w:sz="8" w:space="0" w:color="000000" w:themeColor="text1"/>
+            </w:tcBorders>
+            <w:tcMar>
+              <w:top w:w="100" w:type="dxa"/>
+              <w:left w:w="100" w:type="dxa"/>
+              <w:bottom w:w="100" w:type="dxa"/>
+              <w:right w:w="100" w:type="dxa"/>
+            </w:tcMar>
+          </w:tcPr>
+          <w:p>
+            <w:pPr>
+              <w:keepNext/>
+              <w:spacing w:line="240" w:lineRule="auto"/>
+              <w:jc w:val="center"/>
+              <w:rPr>
+                <w:rFonts w:ascii="Calibri" w:eastAsia="Calibri" w:hAnsi="Calibri" w:cs="Calibri"/>
+                <w:sz w:val="24"/>
+                <w:szCs w:val="24"/>
+              </w:rPr>
+            </w:pPr>
+            <w:r>
+              <w:rPr>
+                <w:rFonts w:ascii="Calibri" w:eastAsia="Calibri" w:hAnsi="Calibri" w:cs="Calibri"/>
+                <w:sz w:val="24"/>
+                <w:szCs w:val="24"/>
+              </w:rPr>
+              <w:t>Requisitos</w:t>
+            </w:r>
+          </w:p>
+        </w:tc>
+        <w:tc>
+          <w:tcPr>
+            <w:tcW w:w="4305" w:type="dxa"/>
+            <w:tcBorders>
+              <w:top w:val="nil"/>
+              <w:left w:val="nil"/>
+              <w:bottom w:val="single" w:sz="8" w:space="0" w:color="000000" w:themeColor="text1"/>
+              <w:right w:val="single" w:sz="8" w:space="0" w:color="000000" w:themeColor="text1"/>
+            </w:tcBorders>
+            <w:tcMar>
+              <w:top w:w="100" w:type="dxa"/>
+              <w:left w:w="100" w:type="dxa"/>
+              <w:bottom w:w="100" w:type="dxa"/>
+              <w:right w:w="100" w:type="dxa"/>
+            </w:tcMar>
+          </w:tcPr>
+          <w:p>
+            <w:pPr>
+              <w:keepNext/>
+              <w:spacing w:line="240" w:lineRule="auto"/>
+              <w:jc w:val="center"/>
+              <w:rPr>
+                <w:rFonts w:ascii="Calibri" w:eastAsia="Calibri" w:hAnsi="Calibri" w:cs="Calibri"/>
+                <w:sz w:val="24"/>
+                <w:szCs w:val="24"/>
+              </w:rPr>
+            </w:pPr>
+            <w:r>
+              <w:rPr>
+                <w:rFonts w:ascii="Calibri" w:eastAsia="Calibri" w:hAnsi="Calibri" w:cs="Calibri"/>
+                <w:sz w:val="24"/>
+                <w:szCs w:val="24"/>
+              </w:rPr>
+              <w:t>Levantar mais detalhes das demandas.</w:t>
+            </w:r>
+          </w:p>
+        </w:tc>
+        <w:tc>
+          <w:tcPr>
+            <w:tcW w:w="2760" w:type="dxa"/>
+            <w:tcBorders>
+              <w:top w:val="nil"/>
+              <w:left w:val="nil"/>
+              <w:bottom w:val="single" w:sz="8" w:space="0" w:color="000000" w:themeColor="text1"/>
+              <w:right w:val="single" w:sz="8" w:space="0" w:color="000000" w:themeColor="text1"/>
+            </w:tcBorders>
+            <w:tcMar>
+              <w:top w:w="100" w:type="dxa"/>
+              <w:left w:w="100" w:type="dxa"/>
+              <w:bottom w:w="100" w:type="dxa"/>
+              <w:right w:w="100" w:type="dxa"/>
+            </w:tcMar>
+          </w:tcPr>
+          <w:p>
+            <w:pPr>
+              <w:keepNext/>
+              <w:spacing w:line="240" w:lineRule="auto"/>
+              <w:jc w:val="center"/>
+              <w:rPr>
+                <w:rFonts w:ascii="Calibri" w:eastAsia="Calibri" w:hAnsi="Calibri" w:cs="Calibri"/>
+                <w:sz w:val="24"/>
+                <w:szCs w:val="24"/>
+              </w:rPr>
+            </w:pPr>
+            <w:r>
+              <w:rPr>
+                <w:rFonts w:ascii="Calibri" w:eastAsia="Calibri" w:hAnsi="Calibri" w:cs="Calibri"/>
+                <w:sz w:val="24"/>
+                <w:szCs w:val="24"/>
+              </w:rPr>
+              <w:t>1</w:t>
+            </w:r>
+          </w:p>
+        </w:tc>
+      </w:tr>
+      <w:tr>
+        <w:trPr>
+          <w:trHeight w:val="780"/>
+        </w:trPr>
+        <w:tc>
+          <w:tcPr>
+            <w:tcW w:w="2400" w:type="dxa"/>
+            <w:tcBorders>
+              <w:top w:val="nil"/>
+              <w:left w:val="single" w:sz="8" w:space="0" w:color="000000" w:themeColor="text1"/>
+              <w:bottom w:val="single" w:sz="8" w:space="0" w:color="000000" w:themeColor="text1"/>
+              <w:right w:val="single" w:sz="8" w:space="0" w:color="000000" w:themeColor="text1"/>
+            </w:tcBorders>
+            <w:tcMar>
+              <w:top w:w="100" w:type="dxa"/>
+              <w:left w:w="100" w:type="dxa"/>
+              <w:bottom w:w="100" w:type="dxa"/>
+              <w:right w:w="100" w:type="dxa"/>
+            </w:tcMar>
+          </w:tcPr>
+          <w:p>
+            <w:pPr>
+              <w:keepNext/>
+              <w:spacing w:line="240" w:lineRule="auto"/>
+              <w:jc w:val="center"/>
+              <w:rPr>
+                <w:rFonts w:ascii="Calibri" w:eastAsia="Calibri" w:hAnsi="Calibri" w:cs="Calibri"/>
+                <w:sz w:val="24"/>
+                <w:szCs w:val="24"/>
+                <w:highlight w:val="white"/>
+              </w:rPr>
+            </w:pPr>
+            <w:r>
+              <w:rPr>
+                <w:rFonts w:ascii="Calibri" w:eastAsia="Calibri" w:hAnsi="Calibri" w:cs="Calibri"/>
+                <w:sz w:val="24"/>
+                <w:szCs w:val="24"/>
+                <w:highlight w:val="white"/>
+              </w:rPr>
+              <w:t>Desenvolvimento</w:t>
+            </w:r>
+          </w:p>
+        </w:tc>
+        <w:tc>
+          <w:tcPr>
+            <w:tcW w:w="4305" w:type="dxa"/>
+            <w:tcBorders>
+              <w:top w:val="nil"/>
+              <w:left w:val="nil"/>
+              <w:bottom w:val="single" w:sz="8" w:space="0" w:color="000000" w:themeColor="text1"/>
+              <w:right w:val="single" w:sz="8" w:space="0" w:color="000000" w:themeColor="text1"/>
+            </w:tcBorders>
+            <w:tcMar>
+              <w:top w:w="100" w:type="dxa"/>
+              <w:left w:w="100" w:type="dxa"/>
+              <w:bottom w:w="100" w:type="dxa"/>
+              <w:right w:w="100" w:type="dxa"/>
+            </w:tcMar>
+          </w:tcPr>
+          <w:p>
+            <w:pPr>
+              <w:keepNext/>
+              <w:spacing w:line="240" w:lineRule="auto"/>
+              <w:jc w:val="center"/>
+              <w:rPr>
+                <w:rFonts w:ascii="Calibri" w:eastAsia="Calibri" w:hAnsi="Calibri" w:cs="Calibri"/>
+                <w:sz w:val="24"/>
+                <w:szCs w:val="24"/>
+                <w:highlight w:val="white"/>
+              </w:rPr>
+            </w:pPr>
+            <w:r>
+              <w:rPr>
+                <w:rFonts w:ascii="Calibri" w:eastAsia="Calibri" w:hAnsi="Calibri" w:cs="Calibri"/>
+                <w:sz w:val="24"/>
+                <w:szCs w:val="24"/>
+                <w:highlight w:val="white"/>
+              </w:rPr>
+              <w:t>Realizar o desenvolvimento das demandas.</w:t>
+            </w:r>
+          </w:p>
+        </w:tc>
+        <w:tc>
+          <w:tcPr>
+            <w:tcW w:w="2760" w:type="dxa"/>
+            <w:tcBorders>
+              <w:top w:val="nil"/>
+              <w:left w:val="nil"/>
+              <w:bottom w:val="single" w:sz="8" w:space="0" w:color="000000" w:themeColor="text1"/>
+              <w:right w:val="single" w:sz="8" w:space="0" w:color="000000" w:themeColor="text1"/>
+            </w:tcBorders>
+            <w:tcMar>
+              <w:top w:w="100" w:type="dxa"/>
+              <w:left w:w="100" w:type="dxa"/>
+              <w:bottom w:w="100" w:type="dxa"/>
+              <w:right w:w="100" w:type="dxa"/>
+            </w:tcMar>
+          </w:tcPr>
+          <w:p>
+            <w:pPr>
+              <w:keepNext/>
+              <w:spacing w:line="240" w:lineRule="auto"/>
+              <w:jc w:val="center"/>
+              <w:rPr>
+                <w:rFonts w:ascii="Calibri" w:eastAsia="Calibri" w:hAnsi="Calibri" w:cs="Calibri"/>
+                <w:sz w:val="24"/>
+                <w:szCs w:val="24"/>
+                <w:highlight w:val="white"/>
+              </w:rPr>
+            </w:pPr>
+            <w:r>
+              <w:rPr>
+                <w:rFonts w:ascii="Calibri" w:eastAsia="Calibri" w:hAnsi="Calibri" w:cs="Calibri"/>
+                <w:sz w:val="24"/>
+                <w:szCs w:val="24"/>
+                <w:highlight w:val="white"/>
+              </w:rPr>
+              <w:t>[DIAS_UTEIS]</w:t>
+            </w:r>
+          </w:p>
+        </w:tc>
+      </w:tr>
+      <w:tr>
+        <w:trPr>
+          <w:trHeight w:val="680"/>
+        </w:trPr>
+        <w:tc>
+          <w:tcPr>
+            <w:tcW w:w="2400" w:type="dxa"/>
+            <w:tcBorders>
+              <w:top w:val="nil"/>
+              <w:left w:val="single" w:sz="8" w:space="0" w:color="000000" w:themeColor="text1"/>
+              <w:bottom w:val="single" w:sz="8" w:space="0" w:color="000000" w:themeColor="text1"/>
+              <w:right w:val="single" w:sz="8" w:space="0" w:color="000000" w:themeColor="text1"/>
+            </w:tcBorders>
+            <w:tcMar>
+              <w:top w:w="100" w:type="dxa"/>
+              <w:left w:w="100" w:type="dxa"/>
+              <w:bottom w:w="100" w:type="dxa"/>
+              <w:right w:w="100" w:type="dxa"/>
+            </w:tcMar>
+          </w:tcPr>
+          <w:p>
+            <w:pPr>
+              <w:keepNext/>
+              <w:spacing w:line="240" w:lineRule="auto"/>
+              <w:jc w:val="center"/>
+              <w:rPr>
+                <w:rFonts w:ascii="Calibri" w:eastAsia="Calibri" w:hAnsi="Calibri" w:cs="Calibri"/>
+                <w:sz w:val="24"/>
+                <w:szCs w:val="24"/>
+              </w:rPr>
+            </w:pPr>
+            <w:r>
+              <w:rPr>
+                <w:rFonts w:ascii="Calibri" w:eastAsia="Calibri" w:hAnsi="Calibri" w:cs="Calibri"/>
+                <w:sz w:val="24"/>
+                <w:szCs w:val="24"/>
+              </w:rPr>
+              <w:t>Contagem final de PF</w:t>
+            </w:r>
+          </w:p>
+        </w:tc>
+        <w:tc>
+          <w:tcPr>
+            <w:tcW w:w="4305" w:type="dxa"/>
+            <w:tcBorders>
+              <w:top w:val="nil"/>
+              <w:left w:val="nil"/>
+              <w:bottom w:val="single" w:sz="8" w:space="0" w:color="000000" w:themeColor="text1"/>
+              <w:right w:val="single" w:sz="8" w:space="0" w:color="000000" w:themeColor="text1"/>
+            </w:tcBorders>
+            <w:tcMar>
+              <w:top w:w="100" w:type="dxa"/>
+              <w:left w:w="100" w:type="dxa"/>
+              <w:bottom w:w="100" w:type="dxa"/>
+              <w:right w:w="100" w:type="dxa"/>
+            </w:tcMar>
+          </w:tcPr>
+          <w:p>
+            <w:pPr>
+              <w:keepNext/>
+              <w:spacing w:line="240" w:lineRule="auto"/>
+              <w:jc w:val="center"/>
+              <w:rPr>
+                <w:rFonts w:ascii="Calibri" w:eastAsia="Calibri" w:hAnsi="Calibri" w:cs="Calibri"/>
+                <w:sz w:val="24"/>
+                <w:szCs w:val="24"/>
+              </w:rPr>
+            </w:pPr>
+            <w:r>
+              <w:rPr>
+                <w:rFonts w:ascii="Calibri" w:eastAsia="Calibri" w:hAnsi="Calibri" w:cs="Calibri"/>
+                <w:sz w:val="24"/>
+                <w:szCs w:val="24"/>
+              </w:rPr>
+              <w:t>Contagem final do desenvolvimento</w:t>
+            </w:r>
+          </w:p>
+        </w:tc>
+        <w:tc>
+          <w:tcPr>
+            <w:tcW w:w="2760" w:type="dxa"/>
+            <w:tcBorders>
+              <w:top w:val="nil"/>
+              <w:left w:val="nil"/>
+              <w:bottom w:val="single" w:sz="8" w:space="0" w:color="000000" w:themeColor="text1"/>
+              <w:right w:val="single" w:sz="8" w:space="0" w:color="000000" w:themeColor="text1"/>
+            </w:tcBorders>
+            <w:tcMar>
+              <w:top w:w="100" w:type="dxa"/>
+              <w:left w:w="100" w:type="dxa"/>
+              <w:bottom w:w="100" w:type="dxa"/>
+              <w:right w:w="100" w:type="dxa"/>
+            </w:tcMar>
+          </w:tcPr>
+          <w:p>
+            <w:pPr>
+              <w:keepNext/>
+              <w:spacing w:line="240" w:lineRule="auto"/>
+              <w:jc w:val="center"/>
+              <w:rPr>
+                <w:rFonts w:ascii="Calibri" w:eastAsia="Calibri" w:hAnsi="Calibri" w:cs="Calibri"/>
+                <w:sz w:val="24"/>
+                <w:szCs w:val="24"/>
+              </w:rPr>
+            </w:pPr>
+            <w:r>
+              <w:rPr>
+                <w:rFonts w:ascii="Calibri" w:eastAsia="Calibri" w:hAnsi="Calibri" w:cs="Calibri"/>
+                <w:sz w:val="24"/>
+                <w:szCs w:val="24"/>
+              </w:rPr>
+              <w:t>1</w:t>
+            </w:r>
+          </w:p>
+        </w:tc>
+      </w:tr>
+      <w:tr>
+        <w:trPr>
+          <w:trHeight w:val="320"/>
+        </w:trPr>
+        <w:tc>
+          <w:tcPr>
+            <w:tcW w:w="2400" w:type="dxa"/>
+            <w:tcBorders>
+              <w:top w:val="nil"/>
+              <w:left w:val="single" w:sz="8" w:space="0" w:color="000000" w:themeColor="text1"/>
+              <w:bottom w:val="single" w:sz="8" w:space="0" w:color="000000" w:themeColor="text1"/>
+              <w:right w:val="single" w:sz="8" w:space="0" w:color="000000" w:themeColor="text1"/>
+            </w:tcBorders>
+            <w:tcMar>
+              <w:top w:w="100" w:type="dxa"/>
+              <w:left w:w="100" w:type="dxa"/>
+              <w:bottom w:w="100" w:type="dxa"/>
+              <w:right w:w="100" w:type="dxa"/>
+            </w:tcMar>
+          </w:tcPr>
+          <w:p>
+            <w:pPr>
+              <w:keepNext/>
+              <w:spacing w:line="240" w:lineRule="auto"/>
+              <w:jc w:val="center"/>
+              <w:rPr>
+                <w:rFonts w:ascii="Calibri" w:eastAsia="Calibri" w:hAnsi="Calibri" w:cs="Calibri"/>
+                <w:sz w:val="24"/>
+                <w:szCs w:val="24"/>
+              </w:rPr>
+            </w:pPr>
+            <w:r>
+              <w:rPr>
+                <w:rFonts w:ascii="Calibri" w:eastAsia="Calibri" w:hAnsi="Calibri" w:cs="Calibri"/>
+                <w:sz w:val="24"/>
+                <w:szCs w:val="24"/>
+              </w:rPr>
+              <w:t>Homologação</w:t>
+            </w:r>
+          </w:p>
+        </w:tc>
+        <w:tc>
+          <w:tcPr>
+            <w:tcW w:w="4305" w:type="dxa"/>
+            <w:tcBorders>
+              <w:top w:val="nil"/>
+              <w:left w:val="nil"/>
+              <w:bottom w:val="single" w:sz="8" w:space="0" w:color="000000" w:themeColor="text1"/>
+              <w:right w:val="single" w:sz="8" w:space="0" w:color="000000" w:themeColor="text1"/>
+            </w:tcBorders>
+            <w:tcMar>
+              <w:top w:w="100" w:type="dxa"/>
+              <w:left w:w="100" w:type="dxa"/>
+              <w:bottom w:w="100" w:type="dxa"/>
+              <w:right w:w="100" w:type="dxa"/>
+            </w:tcMar>
+          </w:tcPr>
+          <w:p>
+            <w:pPr>
+              <w:keepNext/>
+              <w:spacing w:line="240" w:lineRule="auto"/>
+              <w:jc w:val="center"/>
+              <w:rPr>
+                <w:rFonts w:ascii="Calibri" w:eastAsia="Calibri" w:hAnsi="Calibri" w:cs="Calibri"/>
+                <w:sz w:val="24"/>
+                <w:szCs w:val="24"/>
+              </w:rPr>
+            </w:pPr>
+            <w:r>
+              <w:rPr>
+                <w:rFonts w:ascii="Calibri" w:eastAsia="Calibri" w:hAnsi="Calibri" w:cs="Calibri"/>
+                <w:sz w:val="24"/>
+                <w:szCs w:val="24"/>
+              </w:rPr>
+              <w:t>Homologação da solução pela CHESF</w:t>
+            </w:r>
+          </w:p>
+        </w:tc>
+        <w:tc>
+          <w:tcPr>
+            <w:tcW w:w="2760" w:type="dxa"/>
+            <w:tcBorders>
+              <w:top w:val="nil"/>
+              <w:left w:val="nil"/>
+              <w:bottom w:val="single" w:sz="8" w:space="0" w:color="000000" w:themeColor="text1"/>
+              <w:right w:val="single" w:sz="8" w:space="0" w:color="000000" w:themeColor="text1"/>
+            </w:tcBorders>
+            <w:tcMar>
+              <w:top w:w="100" w:type="dxa"/>
+              <w:left w:w="100" w:type="dxa"/>
+              <w:bottom w:w="100" w:type="dxa"/>
+              <w:right w:w="100" w:type="dxa"/>
+            </w:tcMar>
+          </w:tcPr>
+          <w:p>
+            <w:pPr>
+              <w:keepNext/>
+              <w:spacing w:line="240" w:lineRule="auto"/>
+              <w:jc w:val="center"/>
+              <w:rPr>
+                <w:rFonts w:ascii="Calibri" w:eastAsia="Calibri" w:hAnsi="Calibri" w:cs="Calibri"/>
+                <w:sz w:val="24"/>
+                <w:szCs w:val="24"/>
+                <w:highlight w:val="white"/>
+              </w:rPr>
+            </w:pPr>
+            <w:r>
+              <w:rPr>
+                <w:rFonts w:ascii="Calibri" w:eastAsia="Calibri" w:hAnsi="Calibri" w:cs="Calibri"/>
+                <w:sz w:val="24"/>
+                <w:szCs w:val="24"/>
+                <w:highlight w:val="white"/>
+              </w:rPr>
+              <w:t>1</w:t>
+            </w:r>
+          </w:p>
+        </w:tc>
+      </w:tr>
+    </w:tbl>
+    <w:p>
+      <w:pPr>
+        <w:spacing w:before="240" w:after="240" w:line="240" w:lineRule="auto"/>
+        <w:jc w:val="center"/>
+        <w:rPr>
+          <w:rFonts w:ascii="Calibri" w:eastAsia="Calibri" w:hAnsi="Calibri" w:cs="Calibri"/>
+        </w:rPr>
+      </w:pPr>
+      <w:r>
+        <w:rPr>
+          <w:rFonts w:ascii="Calibri" w:eastAsia="Calibri" w:hAnsi="Calibri" w:cs="Calibri"/>
+        </w:rPr>
+        <w:t xml:space="preserve">Tabela </w:t>
+      </w:r>
+      <w:r>
+        <w:rPr>
+          <w:rFonts w:ascii="Calibri" w:eastAsia="Calibri" w:hAnsi="Calibri" w:cs="Calibri"/>
+        </w:rPr>
+        <w:t>3</w:t>
+      </w:r>
+      <w:r>
+        <w:rPr>
+          <w:rFonts w:ascii="Calibri" w:eastAsia="Calibri" w:hAnsi="Calibri" w:cs="Calibri"/>
+        </w:rPr>
+        <w:t xml:space="preserve"> – Cronograma de execução para autorização de serviço.</w:t>
+      </w:r>
+    </w:p>
+    <w:p>
+      <w:pPr>
+        <w:pBdr>
+          <w:top w:val="nil"/>
+          <w:left w:val="nil"/>
+          <w:bottom w:val="nil"/>
+          <w:right w:val="nil"/>
+          <w:between w:val="nil"/>
+        </w:pBdr>
+        <w:spacing w:before="240" w:after="240" w:line="360" w:lineRule="auto"/>
+        <w:jc w:val="both"/>
+        <w:rPr>
+          <w:rFonts w:ascii="Calibri" w:eastAsia="Calibri" w:hAnsi="Calibri" w:cs="Calibri"/>
+          <w:sz w:val="24"/>
+          <w:szCs w:val="24"/>
+        </w:rPr>
+      </w:pPr>
+      <w:r>
+        <w:rPr>
+          <w:rFonts w:ascii="Calibri" w:eastAsia="Calibri" w:hAnsi="Calibri" w:cs="Calibri"/>
+          <w:sz w:val="24"/>
+          <w:szCs w:val="24"/>
+        </w:rPr>
+        <w:t>O pagamento será realizado após a homologação e aprovação do serviço pela CHESF.</w:t>
+      </w:r>
+    </w:p>
+    <w:p>
+      <w:pPr>
+        <w:spacing w:line="360" w:lineRule="auto"/>
+        <w:jc w:val="both"/>
+        <w:rPr>
+          <w:rFonts w:ascii="Corbel" w:eastAsia="Corbel" w:hAnsi="Corbel" w:cs="Corbel"/>
+          <w:sz w:val="28"/>
+          <w:szCs w:val="28"/>
+        </w:rPr>
+      </w:pPr>
+    </w:p>
+    <w:sectPr>
+      <w:headerReference w:type="default" r:id="rId6"/>
+      <w:footerReference w:type="default" r:id="rId7"/>
+      <w:headerReference w:type="first" r:id="rId8"/>
+      <w:footerReference w:type="first" r:id="rId9"/>
+      <w:pgSz w:w="11909" w:h="16834"/>
+      <w:pgMar w:top="850" w:right="1133" w:bottom="850" w:left="1133" w:header="720" w:footer="850" w:gutter="0"/>
+      <w:pgNumType w:start="1"/>
+      <w:cols w:space="720"/>
+      <w:titlePg/>
+    </w:sectPr>
+  </w:body>
+</w:document>
+</file>
+
+<file path=word/endnotes.xml><?xml version="1.0" encoding="utf-8"?>
+<w:endnotes xmlns:wpc="http://schemas.microsoft.com/office/word/2010/wordprocessingCanvas" xmlns:cx="http://schemas.microsoft.com/office/drawing/2014/chartex" xmlns:cx1="http://schemas.microsoft.com/office/drawing/2015/9/8/chartex" xmlns:cx2="http://schemas.microsoft.com/office/drawing/2015/10/21/chartex" xmlns:cx3="http://schemas.microsoft.com/office/drawing/2016/5/9/chartex" xmlns:cx4="http://schemas.microsoft.com/office/drawing/2016/5/10/chartex" xmlns:cx5="http://schemas.microsoft.com/office/drawing/2016/5/11/chartex" xmlns:cx6="http://schemas.microsoft.com/office/drawing/2016/5/12/chartex" xmlns:cx7="http://schemas.microsoft.com/office/drawing/2016/5/13/chartex" xmlns:cx8="http://schemas.microsoft.com/office/drawing/2016/5/14/chartex" xmlns:mc="http://schemas.openxmlformats.org/markup-compatibility/2006" xmlns:aink="http://schemas.microsoft.com/office/drawing/2016/ink" xmlns:am3d="http://schemas.microsoft.com/office/drawing/2017/model3d" xmlns:o="urn:schemas-microsoft-com:office:office" xmlns:oel="http://schemas.microsoft.com/office/2019/extlst" xmlns:r="http://schemas.openxmlformats.org/officeDocument/2006/relationships" xmlns:m="http://schemas.openxmlformats.org/officeDocument/2006/math" xmlns:v="urn:schemas-microsoft-com:vml" xmlns:wp14="http://schemas.microsoft.com/office/word/2010/wordprocessingDrawing" xmlns:wp="http://schemas.openxmlformats.org/drawingml/2006/wordprocessingDrawing" xmlns:w10="urn:schemas-microsoft-com:office:word" xmlns:w="http://schemas.openxmlformats.org/wordprocessingml/2006/main" xmlns:w14="http://schemas.microsoft.com/office/word/2010/wordml" xmlns:w15="http://schemas.microsoft.com/office/word/2012/wordml" xmlns:w16cex="http://schemas.microsoft.com/office/word/2018/wordml/cex" xmlns:w16cid="http://schemas.microsoft.com/office/word/2016/wordml/cid" xmlns:w16="http://schemas.microsoft.com/office/word/2018/wordml" xmlns:w16du="http://schemas.microsoft.com/office/word/2023/wordml/word16du" xmlns:w16sdtdh="http://schemas.microsoft.com/office/word/2020/wordml/sdtdatahash" xmlns:w16sdtfl="http://schemas.microsoft.com/office/word/2024/wordml/sdtformatlock" xmlns:w16se="http://schemas.microsoft.com/office/word/2015/wordml/symex" xmlns:wpg="http://schemas.microsoft.com/office/word/2010/wordprocessingGroup" xmlns:wpi="http://schemas.microsoft.com/office/word/2010/wordprocessingInk" xmlns:wne="http://schemas.microsoft.com/office/word/2006/wordml" xmlns:wps="http://schemas.microsoft.com/office/word/2010/wordprocessingShape" mc:Ignorable="w14 w15 w16se w16cid w16 w16cex w16sdtdh w16sdtfl w16du wp14">
+  <w:endnote w:type="separator" w:id="-1">
+    <w:p>
+      <w:pPr>
+        <w:spacing w:line="240" w:lineRule="auto"/>
+      </w:pPr>
+      <w:r>
+        <w:separator/>
+      </w:r>
+    </w:p>
+  </w:endnote>
+  <w:endnote w:type="continuationSeparator" w:id="0">
+    <w:p>
+      <w:pPr>
+        <w:spacing w:line="240" w:lineRule="auto"/>
+      </w:pPr>
+      <w:r>
+        <w:continuationSeparator/>
+      </w:r>
+    </w:p>
+  </w:endnote>
+</w:endnotes>
+</file>
+
+<file path=word/footer1.xml><?xml version="1.0" encoding="utf-8"?>
+<w:ftr xmlns:wpc="http://schemas.microsoft.com/office/word/2010/wordprocessingCanvas" xmlns:cx="http://schemas.microsoft.com/office/drawing/2014/chartex" xmlns:cx1="http://schemas.microsoft.com/office/drawing/2015/9/8/chartex" xmlns:cx2="http://schemas.microsoft.com/office/drawing/2015/10/21/chartex" xmlns:cx3="http://schemas.microsoft.com/office/drawing/2016/5/9/chartex" xmlns:cx4="http://schemas.microsoft.com/office/drawing/2016/5/10/chartex" xmlns:cx5="http://schemas.microsoft.com/office/drawing/2016/5/11/chartex" xmlns:cx6="http://schemas.microsoft.com/office/drawing/2016/5/12/chartex" xmlns:cx7="http://schemas.microsoft.com/office/drawing/2016/5/13/chartex" xmlns:cx8="http://schemas.microsoft.com/office/drawing/2016/5/14/chartex" xmlns:mc="http://schemas.openxmlformats.org/markup-compatibility/2006" xmlns:aink="http://schemas.microsoft.com/office/drawing/2016/ink" xmlns:am3d="http://schemas.microsoft.com/office/drawing/2017/model3d" xmlns:o="urn:schemas-microsoft-com:office:office" xmlns:oel="http://schemas.microsoft.com/office/2019/extlst" xmlns:r="http://schemas.openxmlformats.org/officeDocument/2006/relationships" xmlns:m="http://schemas.openxmlformats.org/officeDocument/2006/math" xmlns:v="urn:schemas-microsoft-com:vml" xmlns:wp14="http://schemas.microsoft.com/office/word/2010/wordprocessingDrawing" xmlns:wp="http://schemas.openxmlformats.org/drawingml/2006/wordprocessingDrawing" xmlns:w10="urn:schemas-microsoft-com:office:word" xmlns:w="http://schemas.openxmlformats.org/wordprocessingml/2006/main" xmlns:w14="http://schemas.microsoft.com/office/word/2010/wordml" xmlns:w15="http://schemas.microsoft.com/office/word/2012/wordml" xmlns:w16cex="http://schemas.microsoft.com/office/word/2018/wordml/cex" xmlns:w16cid="http://schemas.microsoft.com/office/word/2016/wordml/cid" xmlns:w16="http://schemas.microsoft.com/office/word/2018/wordml" xmlns:w16du="http://schemas.microsoft.com/office/word/2023/wordml/word16du" xmlns:w16sdtdh="http://schemas.microsoft.com/office/word/2020/wordml/sdtdatahash" xmlns:w16sdtfl="http://schemas.microsoft.com/office/word/2024/wordml/sdtformatlock" xmlns:w16se="http://schemas.microsoft.com/office/word/2015/wordml/symex" xmlns:wpg="http://schemas.microsoft.com/office/word/2010/wordprocessingGroup" xmlns:wpi="http://schemas.microsoft.com/office/word/2010/wordprocessingInk" xmlns:wne="http://schemas.microsoft.com/office/word/2006/wordml" xmlns:wps="http://schemas.microsoft.com/office/word/2010/wordprocessingShape" mc:Ignorable="w14 w15 w16se w16cid w16 w16cex w16sdtdh w16sdtfl w16du wp14">
+  <w:p>
+    <w:pPr>
+      <w:rPr>
+        <w:color w:val="666666"/>
+      </w:rPr>
+    </w:pPr>
+    <w:r>
+      <w:rPr>
+        <w:noProof/>
+        <w:color w:val="666666"/>
+      </w:rPr>
+      <w:drawing>
+        <wp:inline distT="114300" distB="114300" distL="114300" distR="114300" wp14:anchorId="729AE733" wp14:editId="07777777">
+          <wp:extent cx="142875" cy="114300"/>
+          <wp:effectExtent l="0" t="0" r="0" b="0"/>
+          <wp:docPr id="2" name="image2.png"/>
+          <wp:cNvGraphicFramePr/>
+          <a:graphic xmlns:a="http://schemas.openxmlformats.org/drawingml/2006/main">
+            <a:graphicData uri="http://schemas.openxmlformats.org/drawingml/2006/picture">
+              <pic:pic xmlns:pic="http://schemas.openxmlformats.org/drawingml/2006/picture">
+                <pic:nvPicPr>
+                  <pic:cNvPr id="0" name="image2.png"/>
+                  <pic:cNvPicPr preferRelativeResize="0"/>
+                </pic:nvPicPr>
+                <pic:blipFill>
+                  <a:blip r:embed="rId1"/>
+                  <a:srcRect/>
+                  <a:stretch>
+                    <a:fillRect/>
+                  </a:stretch>
+                </pic:blipFill>
+                <pic:spPr>
+                  <a:xfrm>
+                    <a:off x="0" y="0"/>
+                    <a:ext cx="142875" cy="114300"/>
+                  </a:xfrm>
+                  <a:prstGeom prst="rect">
+                    <a:avLst/>
+                  </a:prstGeom>
+                  <a:ln/>
+                </pic:spPr>
+              </pic:pic>
+            </a:graphicData>
+          </a:graphic>
+        </wp:inline>
+      </w:drawing>
+    </w:r>
+    <w:r>
+      <w:rPr>
+        <w:color w:val="666666"/>
+      </w:rPr>
+      <w:t xml:space="preserve"> Rua da </w:t>
+    </w:r>
+    <w:proofErr w:type="spellStart"/>
+    <w:r>
+      <w:rPr>
+        <w:color w:val="666666"/>
+      </w:rPr>
+      <w:t>Bronzita</w:t>
+    </w:r>
+    <w:proofErr w:type="spellEnd"/>
+    <w:r>
+      <w:rPr>
+        <w:color w:val="666666"/>
+      </w:rPr>
+      <w:t>, 1917, Lagoa Nova, Natal/RN, Sala 3, 59.076-500</w:t>
+    </w:r>
+  </w:p>
+  <w:p>
+    <w:pPr>
+      <w:rPr>
+        <w:color w:val="666666"/>
+      </w:rPr>
+    </w:pPr>
+    <w:r>
+      <w:rPr>
+        <w:noProof/>
+        <w:color w:val="666666"/>
+      </w:rPr>
+      <w:drawing>
+        <wp:inline distT="114300" distB="114300" distL="114300" distR="114300" wp14:anchorId="382686BF" wp14:editId="07777777">
+          <wp:extent cx="123825" cy="123825"/>
+          <wp:effectExtent l="0" t="0" r="0" b="0"/>
+          <wp:docPr id="8" name="image3.png"/>
+          <wp:cNvGraphicFramePr/>
+          <a:graphic xmlns:a="http://schemas.openxmlformats.org/drawingml/2006/main">
+            <a:graphicData uri="http://schemas.openxmlformats.org/drawingml/2006/picture">
+              <pic:pic xmlns:pic="http://schemas.openxmlformats.org/drawingml/2006/picture">
+                <pic:nvPicPr>
+                  <pic:cNvPr id="0" name="image3.png"/>
+                  <pic:cNvPicPr preferRelativeResize="0"/>
+                </pic:nvPicPr>
+                <pic:blipFill>
+                  <a:blip r:embed="rId2"/>
+                  <a:srcRect/>
+                  <a:stretch>
+                    <a:fillRect/>
+                  </a:stretch>
+                </pic:blipFill>
+                <pic:spPr>
+                  <a:xfrm>
+                    <a:off x="0" y="0"/>
+                    <a:ext cx="123825" cy="123825"/>
+                  </a:xfrm>
+                  <a:prstGeom prst="rect">
+                    <a:avLst/>
+                  </a:prstGeom>
+                  <a:ln/>
+                </pic:spPr>
+              </pic:pic>
+            </a:graphicData>
+          </a:graphic>
+        </wp:inline>
+      </w:drawing>
+    </w:r>
+    <w:r>
+      <w:rPr>
+        <w:color w:val="666666"/>
+      </w:rPr>
+      <w:t xml:space="preserve"> +55 84 2020 1917</w:t>
+    </w:r>
+  </w:p>
+  <w:p>
+    <w:pPr>
+      <w:rPr>
+        <w:color w:val="666666"/>
+      </w:rPr>
+    </w:pPr>
+    <w:r>
+      <w:rPr>
+        <w:noProof/>
+        <w:color w:val="666666"/>
+      </w:rPr>
+      <w:drawing>
+        <wp:inline distT="114300" distB="114300" distL="114300" distR="114300" wp14:anchorId="40A04061" wp14:editId="07777777">
+          <wp:extent cx="133350" cy="104775"/>
+          <wp:effectExtent l="0" t="0" r="0" b="0"/>
+          <wp:docPr id="3" name="image1.png"/>
+          <wp:cNvGraphicFramePr/>
+          <a:graphic xmlns:a="http://schemas.openxmlformats.org/drawingml/2006/main">
+            <a:graphicData uri="http://schemas.openxmlformats.org/drawingml/2006/picture">
+              <pic:pic xmlns:pic="http://schemas.openxmlformats.org/drawingml/2006/picture">
+                <pic:nvPicPr>
+                  <pic:cNvPr id="0" name="image1.png"/>
+                  <pic:cNvPicPr preferRelativeResize="0"/>
+                </pic:nvPicPr>
+                <pic:blipFill>
+                  <a:blip r:embed="rId3"/>
+                  <a:srcRect/>
+                  <a:stretch>
+                    <a:fillRect/>
+                  </a:stretch>
+                </pic:blipFill>
+                <pic:spPr>
+                  <a:xfrm>
+                    <a:off x="0" y="0"/>
+                    <a:ext cx="133350" cy="104775"/>
+                  </a:xfrm>
+                  <a:prstGeom prst="rect">
+                    <a:avLst/>
+                  </a:prstGeom>
+                  <a:ln/>
+                </pic:spPr>
+              </pic:pic>
+            </a:graphicData>
+          </a:graphic>
+        </wp:inline>
+      </w:drawing>
+    </w:r>
+    <w:r>
+      <w:rPr>
+        <w:color w:val="666666"/>
+      </w:rPr>
+      <w:t xml:space="preserve"> contato@logap.com.br</w:t>
+    </w:r>
+  </w:p>
+</w:ftr>
+</file>
+
+<file path=word/footer2.xml><?xml version="1.0" encoding="utf-8"?>
+<w:ftr xmlns:wpc="http://schemas.microsoft.com/office/word/2010/wordprocessingCanvas" xmlns:cx="http://schemas.microsoft.com/office/drawing/2014/chartex" xmlns:cx1="http://schemas.microsoft.com/office/drawing/2015/9/8/chartex" xmlns:cx2="http://schemas.microsoft.com/office/drawing/2015/10/21/chartex" xmlns:cx3="http://schemas.microsoft.com/office/drawing/2016/5/9/chartex" xmlns:cx4="http://schemas.microsoft.com/office/drawing/2016/5/10/chartex" xmlns:cx5="http://schemas.microsoft.com/office/drawing/2016/5/11/chartex" xmlns:cx6="http://schemas.microsoft.com/office/drawing/2016/5/12/chartex" xmlns:cx7="http://schemas.microsoft.com/office/drawing/2016/5/13/chartex" xmlns:cx8="http://schemas.microsoft.com/office/drawing/2016/5/14/chartex" xmlns:mc="http://schemas.openxmlformats.org/markup-compatibility/2006" xmlns:aink="http://schemas.microsoft.com/office/drawing/2016/ink" xmlns:am3d="http://schemas.microsoft.com/office/drawing/2017/model3d" xmlns:o="urn:schemas-microsoft-com:office:office" xmlns:oel="http://schemas.microsoft.com/office/2019/extlst" xmlns:r="http://schemas.openxmlformats.org/officeDocument/2006/relationships" xmlns:m="http://schemas.openxmlformats.org/officeDocument/2006/math" xmlns:v="urn:schemas-microsoft-com:vml" xmlns:wp14="http://schemas.microsoft.com/office/word/2010/wordprocessingDrawing" xmlns:wp="http://schemas.openxmlformats.org/drawingml/2006/wordprocessingDrawing" xmlns:w10="urn:schemas-microsoft-com:office:word" xmlns:w="http://schemas.openxmlformats.org/wordprocessingml/2006/main" xmlns:w14="http://schemas.microsoft.com/office/word/2010/wordml" xmlns:w15="http://schemas.microsoft.com/office/word/2012/wordml" xmlns:w16cex="http://schemas.microsoft.com/office/word/2018/wordml/cex" xmlns:w16cid="http://schemas.microsoft.com/office/word/2016/wordml/cid" xmlns:w16="http://schemas.microsoft.com/office/word/2018/wordml" xmlns:w16du="http://schemas.microsoft.com/office/word/2023/wordml/word16du" xmlns:w16sdtdh="http://schemas.microsoft.com/office/word/2020/wordml/sdtdatahash" xmlns:w16sdtfl="http://schemas.microsoft.com/office/word/2024/wordml/sdtformatlock" xmlns:w16se="http://schemas.microsoft.com/office/word/2015/wordml/symex" xmlns:wpg="http://schemas.microsoft.com/office/word/2010/wordprocessingGroup" xmlns:wpi="http://schemas.microsoft.com/office/word/2010/wordprocessingInk" xmlns:wne="http://schemas.microsoft.com/office/word/2006/wordml" xmlns:wps="http://schemas.microsoft.com/office/word/2010/wordprocessingShape" mc:Ignorable="w14 w15 w16se w16cid w16 w16cex w16sdtdh w16sdtfl w16du wp14">
+  <w:p>
+    <w:pPr>
+      <w:rPr>
+        <w:color w:val="666666"/>
+      </w:rPr>
+    </w:pPr>
+    <w:r>
+      <w:rPr>
+        <w:noProof/>
+        <w:color w:val="666666"/>
+      </w:rPr>
+      <w:drawing>
+        <wp:inline distT="114300" distB="114300" distL="114300" distR="114300" wp14:anchorId="2B3CE4D9" wp14:editId="07777777">
+          <wp:extent cx="142875" cy="114300"/>
+          <wp:effectExtent l="0" t="0" r="0" b="0"/>
+          <wp:docPr id="7" name="image2.png"/>
+          <wp:cNvGraphicFramePr/>
+          <a:graphic xmlns:a="http://schemas.openxmlformats.org/drawingml/2006/main">
+            <a:graphicData uri="http://schemas.openxmlformats.org/drawingml/2006/picture">
+              <pic:pic xmlns:pic="http://schemas.openxmlformats.org/drawingml/2006/picture">
+                <pic:nvPicPr>
+                  <pic:cNvPr id="0" name="image2.png"/>
+                  <pic:cNvPicPr preferRelativeResize="0"/>
+                </pic:nvPicPr>
+                <pic:blipFill>
+                  <a:blip r:embed="rId1"/>
+                  <a:srcRect/>
+                  <a:stretch>
+                    <a:fillRect/>
+                  </a:stretch>
+                </pic:blipFill>
+                <pic:spPr>
+                  <a:xfrm>
+                    <a:off x="0" y="0"/>
+                    <a:ext cx="142875" cy="114300"/>
+                  </a:xfrm>
+                  <a:prstGeom prst="rect">
+                    <a:avLst/>
+                  </a:prstGeom>
+                  <a:ln/>
+                </pic:spPr>
+              </pic:pic>
+            </a:graphicData>
+          </a:graphic>
+        </wp:inline>
+      </w:drawing>
+    </w:r>
+    <w:r>
+      <w:rPr>
+        <w:color w:val="666666"/>
+      </w:rPr>
+      <w:t xml:space="preserve"> Rua da </w:t>
+    </w:r>
+    <w:proofErr w:type="spellStart"/>
+    <w:r>
+      <w:rPr>
+        <w:color w:val="666666"/>
+      </w:rPr>
+      <w:t>Bronzita</w:t>
+    </w:r>
+    <w:proofErr w:type="spellEnd"/>
+    <w:r>
+      <w:rPr>
+        <w:color w:val="666666"/>
+      </w:rPr>
+      <w:t>, 1917, Lagoa Nova, Natal/RN, Sala 3, 59.076-500</w:t>
+    </w:r>
+  </w:p>
+  <w:p>
+    <w:pPr>
+      <w:rPr>
+        <w:color w:val="666666"/>
+      </w:rPr>
+    </w:pPr>
+    <w:r>
+      <w:rPr>
+        <w:noProof/>
+        <w:color w:val="666666"/>
+      </w:rPr>
+      <w:drawing>
+        <wp:inline distT="114300" distB="114300" distL="114300" distR="114300" wp14:anchorId="2898D10B" wp14:editId="07777777">
+          <wp:extent cx="123825" cy="123825"/>
+          <wp:effectExtent l="0" t="0" r="0" b="0"/>
+          <wp:docPr id="1" name="image3.png"/>
+          <wp:cNvGraphicFramePr/>
+          <a:graphic xmlns:a="http://schemas.openxmlformats.org/drawingml/2006/main">
+            <a:graphicData uri="http://schemas.openxmlformats.org/drawingml/2006/picture">
+              <pic:pic xmlns:pic="http://schemas.openxmlformats.org/drawingml/2006/picture">
+                <pic:nvPicPr>
+                  <pic:cNvPr id="0" name="image3.png"/>
+                  <pic:cNvPicPr preferRelativeResize="0"/>
+                </pic:nvPicPr>
+                <pic:blipFill>
+                  <a:blip r:embed="rId2"/>
+                  <a:srcRect/>
+                  <a:stretch>
+                    <a:fillRect/>
+                  </a:stretch>
+                </pic:blipFill>
+                <pic:spPr>
+                  <a:xfrm>
+                    <a:off x="0" y="0"/>
+                    <a:ext cx="123825" cy="123825"/>
+                  </a:xfrm>
+                  <a:prstGeom prst="rect">
+                    <a:avLst/>
+                  </a:prstGeom>
+                  <a:ln/>
+                </pic:spPr>
+              </pic:pic>
+            </a:graphicData>
+          </a:graphic>
+        </wp:inline>
+      </w:drawing>
+    </w:r>
+    <w:r>
+      <w:rPr>
+        <w:color w:val="666666"/>
+      </w:rPr>
+      <w:t xml:space="preserve"> +55 84 2020 1917</w:t>
+    </w:r>
+  </w:p>
+  <w:p>
+    <w:r>
+      <w:rPr>
+        <w:noProof/>
+        <w:color w:val="666666"/>
+      </w:rPr>
+      <w:drawing>
+        <wp:inline distT="114300" distB="114300" distL="114300" distR="114300" wp14:anchorId="1B1561E1" wp14:editId="07777777">
+          <wp:extent cx="133350" cy="104775"/>
+          <wp:effectExtent l="0" t="0" r="0" b="0"/>
+          <wp:docPr id="5" name="image1.png"/>
+          <wp:cNvGraphicFramePr/>
+          <a:graphic xmlns:a="http://schemas.openxmlformats.org/drawingml/2006/main">
+            <a:graphicData uri="http://schemas.openxmlformats.org/drawingml/2006/picture">
+              <pic:pic xmlns:pic="http://schemas.openxmlformats.org/drawingml/2006/picture">
+                <pic:nvPicPr>
+                  <pic:cNvPr id="0" name="image1.png"/>
+                  <pic:cNvPicPr preferRelativeResize="0"/>
+                </pic:nvPicPr>
+                <pic:blipFill>
+                  <a:blip r:embed="rId3"/>
+                  <a:srcRect/>
+                  <a:stretch>
+                    <a:fillRect/>
+                  </a:stretch>
+                </pic:blipFill>
+                <pic:spPr>
+                  <a:xfrm>
+                    <a:off x="0" y="0"/>
+                    <a:ext cx="133350" cy="104775"/>
+                  </a:xfrm>
+                  <a:prstGeom prst="rect">
+                    <a:avLst/>
+                  </a:prstGeom>
+                  <a:ln/>
+                </pic:spPr>
+              </pic:pic>
+            </a:graphicData>
+          </a:graphic>
+        </wp:inline>
+      </w:drawing>
+    </w:r>
+    <w:r>
+      <w:rPr>
+        <w:color w:val="666666"/>
+      </w:rPr>
+      <w:t xml:space="preserve"> contato@logap.com.br</w:t>
+    </w:r>
+  </w:p>
+</w:ftr>
+</file>
+
+<file path=word/footnotes.xml><?xml version="1.0" encoding="utf-8"?>
+<w:footnotes xmlns:wpc="http://schemas.microsoft.com/office/word/2010/wordprocessingCanvas" xmlns:cx="http://schemas.microsoft.com/office/drawing/2014/chartex" xmlns:cx1="http://schemas.microsoft.com/office/drawing/2015/9/8/chartex" xmlns:cx2="http://schemas.microsoft.com/office/drawing/2015/10/21/chartex" xmlns:cx3="http://schemas.microsoft.com/office/drawing/2016/5/9/chartex" xmlns:cx4="http://schemas.microsoft.com/office/drawing/2016/5/10/chartex" xmlns:cx5="http://schemas.microsoft.com/office/drawing/2016/5/11/chartex" xmlns:cx6="http://schemas.microsoft.com/office/drawing/2016/5/12/chartex" xmlns:cx7="http://schemas.microsoft.com/office/drawing/2016/5/13/chartex" xmlns:cx8="http://schemas.microsoft.com/office/drawing/2016/5/14/chartex" xmlns:mc="http://schemas.openxmlformats.org/markup-compatibility/2006" xmlns:aink="http://schemas.microsoft.com/office/drawing/2016/ink" xmlns:am3d="http://schemas.microsoft.com/office/drawing/2017/model3d" xmlns:o="urn:schemas-microsoft-com:office:office" xmlns:oel="http://schemas.microsoft.com/office/2019/extlst" xmlns:r="http://schemas.openxmlformats.org/officeDocument/2006/relationships" xmlns:m="http://schemas.openxmlformats.org/officeDocument/2006/math" xmlns:v="urn:schemas-microsoft-com:vml" xmlns:wp14="http://schemas.microsoft.com/office/word/2010/wordprocessingDrawing" xmlns:wp="http://schemas.openxmlformats.org/drawingml/2006/wordprocessingDrawing" xmlns:w10="urn:schemas-microsoft-com:office:word" xmlns:w="http://schemas.openxmlformats.org/wordprocessingml/2006/main" xmlns:w14="http://schemas.microsoft.com/office/word/2010/wordml" xmlns:w15="http://schemas.microsoft.com/office/word/2012/wordml" xmlns:w16cex="http://schemas.microsoft.com/office/word/2018/wordml/cex" xmlns:w16cid="http://schemas.microsoft.com/office/word/2016/wordml/cid" xmlns:w16="http://schemas.microsoft.com/office/word/2018/wordml" xmlns:w16du="http://schemas.microsoft.com/office/word/2023/wordml/word16du" xmlns:w16sdtdh="http://schemas.microsoft.com/office/word/2020/wordml/sdtdatahash" xmlns:w16sdtfl="http://schemas.microsoft.com/office/word/2024/wordml/sdtformatlock" xmlns:w16se="http://schemas.microsoft.com/office/word/2015/wordml/symex" xmlns:wpg="http://schemas.microsoft.com/office/word/2010/wordprocessingGroup" xmlns:wpi="http://schemas.microsoft.com/office/word/2010/wordprocessingInk" xmlns:wne="http://schemas.microsoft.com/office/word/2006/wordml" xmlns:wps="http://schemas.microsoft.com/office/word/2010/wordprocessingShape" mc:Ignorable="w14 w15 w16se w16cid w16 w16cex w16sdtdh w16sdtfl w16du wp14">
+  <w:footnote w:type="separator" w:id="-1">
+    <w:p>
+      <w:pPr>
+        <w:spacing w:line="240" w:lineRule="auto"/>
+      </w:pPr>
+      <w:r>
+        <w:separator/>
+      </w:r>
+    </w:p>
+  </w:footnote>
+  <w:footnote w:type="continuationSeparator" w:id="0">
+    <w:p>
+      <w:pPr>
+        <w:spacing w:line="240" w:lineRule="auto"/>
+      </w:pPr>
+      <w:r>
+        <w:continuationSeparator/>
+      </w:r>
+    </w:p>
+  </w:footnote>
+</w:footnotes>
+</file>
+
+<file path=word/header1.xml><?xml version="1.0" encoding="utf-8"?>
+<w:hdr xmlns:wpc="http://schemas.microsoft.com/office/word/2010/wordprocessingCanvas" xmlns:cx="http://schemas.microsoft.com/office/drawing/2014/chartex" xmlns:cx1="http://schemas.microsoft.com/office/drawing/2015/9/8/chartex" xmlns:cx2="http://schemas.microsoft.com/office/drawing/2015/10/21/chartex" xmlns:cx3="http://schemas.microsoft.com/office/drawing/2016/5/9/chartex" xmlns:cx4="http://schemas.microsoft.com/office/drawing/2016/5/10/chartex" xmlns:cx5="http://schemas.microsoft.com/office/drawing/2016/5/11/chartex" xmlns:cx6="http://schemas.microsoft.com/office/drawing/2016/5/12/chartex" xmlns:cx7="http://schemas.microsoft.com/office/drawing/2016/5/13/chartex" xmlns:cx8="http://schemas.microsoft.com/office/drawing/2016/5/14/chartex" xmlns:mc="http://schemas.openxmlformats.org/markup-compatibility/2006" xmlns:aink="http://schemas.microsoft.com/office/drawing/2016/ink" xmlns:am3d="http://schemas.microsoft.com/office/drawing/2017/model3d" xmlns:o="urn:schemas-microsoft-com:office:office" xmlns:oel="http://schemas.microsoft.com/office/2019/extlst" xmlns:r="http://schemas.openxmlformats.org/officeDocument/2006/relationships" xmlns:m="http://schemas.openxmlformats.org/officeDocument/2006/math" xmlns:v="urn:schemas-microsoft-com:vml" xmlns:wp14="http://schemas.microsoft.com/office/word/2010/wordprocessingDrawing" xmlns:wp="http://schemas.openxmlformats.org/drawingml/2006/wordprocessingDrawing" xmlns:w10="urn:schemas-microsoft-com:office:word" xmlns:w="http://schemas.openxmlformats.org/wordprocessingml/2006/main" xmlns:w14="http://schemas.microsoft.com/office/word/2010/wordml" xmlns:w15="http://schemas.microsoft.com/office/word/2012/wordml" xmlns:w16cex="http://schemas.microsoft.com/office/word/2018/wordml/cex" xmlns:w16cid="http://schemas.microsoft.com/office/word/2016/wordml/cid" xmlns:w16="http://schemas.microsoft.com/office/word/2018/wordml" xmlns:w16du="http://schemas.microsoft.com/office/word/2023/wordml/word16du" xmlns:w16sdtdh="http://schemas.microsoft.com/office/word/2020/wordml/sdtdatahash" xmlns:w16sdtfl="http://schemas.microsoft.com/office/word/2024/wordml/sdtformatlock" xmlns:w16se="http://schemas.microsoft.com/office/word/2015/wordml/symex" xmlns:wpg="http://schemas.microsoft.com/office/word/2010/wordprocessingGroup" xmlns:wpi="http://schemas.microsoft.com/office/word/2010/wordprocessingInk" xmlns:wne="http://schemas.microsoft.com/office/word/2006/wordml" xmlns:wps="http://schemas.microsoft.com/office/word/2010/wordprocessingShape" mc:Ignorable="w14 w15 w16se w16cid w16 w16cex w16sdtdh w16sdtfl w16du wp14">
+  <w:p>
+    <w:r>
+      <w:rPr>
+        <w:noProof/>
+      </w:rPr>
+      <w:drawing>
+        <wp:inline distT="114300" distB="114300" distL="114300" distR="114300" wp14:anchorId="0FCB32A9" wp14:editId="07777777">
+          <wp:extent cx="1647825" cy="1152525"/>
+          <wp:effectExtent l="0" t="0" r="0" b="0"/>
+          <wp:docPr id="4" name="image4.png"/>
+          <wp:cNvGraphicFramePr/>
+          <a:graphic xmlns:a="http://schemas.openxmlformats.org/drawingml/2006/main">
+            <a:graphicData uri="http://schemas.openxmlformats.org/drawingml/2006/picture">
+              <pic:pic xmlns:pic="http://schemas.openxmlformats.org/drawingml/2006/picture">
+                <pic:nvPicPr>
+                  <pic:cNvPr id="0" name="image4.png"/>
+                  <pic:cNvPicPr preferRelativeResize="0"/>
+                </pic:nvPicPr>
+                <pic:blipFill>
+                  <a:blip r:embed="rId1"/>
+                  <a:srcRect/>
+                  <a:stretch>
+                    <a:fillRect/>
+                  </a:stretch>
+                </pic:blipFill>
+                <pic:spPr>
+                  <a:xfrm>
+                    <a:off x="0" y="0"/>
+                    <a:ext cx="1647825" cy="1152525"/>
+                  </a:xfrm>
+                  <a:prstGeom prst="rect">
+                    <a:avLst/>
+                  </a:prstGeom>
+                  <a:ln/>
+                </pic:spPr>
+              </pic:pic>
+            </a:graphicData>
+          </a:graphic>
+        </wp:inline>
+      </w:drawing>
+    </w:r>
+  </w:p>
+</w:hdr>
+</file>
+
+<file path=word/header2.xml><?xml version="1.0" encoding="utf-8"?>
+<w:hdr xmlns:wpc="http://schemas.microsoft.com/office/word/2010/wordprocessingCanvas" xmlns:cx="http://schemas.microsoft.com/office/drawing/2014/chartex" xmlns:cx1="http://schemas.microsoft.com/office/drawing/2015/9/8/chartex" xmlns:cx2="http://schemas.microsoft.com/office/drawing/2015/10/21/chartex" xmlns:cx3="http://schemas.microsoft.com/office/drawing/2016/5/9/chartex" xmlns:cx4="http://schemas.microsoft.com/office/drawing/2016/5/10/chartex" xmlns:cx5="http://schemas.microsoft.com/office/drawing/2016/5/11/chartex" xmlns:cx6="http://schemas.microsoft.com/office/drawing/2016/5/12/chartex" xmlns:cx7="http://schemas.microsoft.com/office/drawing/2016/5/13/chartex" xmlns:cx8="http://schemas.microsoft.com/office/drawing/2016/5/14/chartex" xmlns:mc="http://schemas.openxmlformats.org/markup-compatibility/2006" xmlns:aink="http://schemas.microsoft.com/office/drawing/2016/ink" xmlns:am3d="http://schemas.microsoft.com/office/drawing/2017/model3d" xmlns:o="urn:schemas-microsoft-com:office:office" xmlns:oel="http://schemas.microsoft.com/office/2019/extlst" xmlns:r="http://schemas.openxmlformats.org/officeDocument/2006/relationships" xmlns:m="http://schemas.openxmlformats.org/officeDocument/2006/math" xmlns:v="urn:schemas-microsoft-com:vml" xmlns:wp14="http://schemas.microsoft.com/office/word/2010/wordprocessingDrawing" xmlns:wp="http://schemas.openxmlformats.org/drawingml/2006/wordprocessingDrawing" xmlns:w10="urn:schemas-microsoft-com:office:word" xmlns:w="http://schemas.openxmlformats.org/wordprocessingml/2006/main" xmlns:w14="http://schemas.microsoft.com/office/word/2010/wordml" xmlns:w15="http://schemas.microsoft.com/office/word/2012/wordml" xmlns:w16cex="http://schemas.microsoft.com/office/word/2018/wordml/cex" xmlns:w16cid="http://schemas.microsoft.com/office/word/2016/wordml/cid" xmlns:w16="http://schemas.microsoft.com/office/word/2018/wordml" xmlns:w16du="http://schemas.microsoft.com/office/word/2023/wordml/word16du" xmlns:w16sdtdh="http://schemas.microsoft.com/office/word/2020/wordml/sdtdatahash" xmlns:w16sdtfl="http://schemas.microsoft.com/office/word/2024/wordml/sdtformatlock" xmlns:w16se="http://schemas.microsoft.com/office/word/2015/wordml/symex" xmlns:wpg="http://schemas.microsoft.com/office/word/2010/wordprocessingGroup" xmlns:wpi="http://schemas.microsoft.com/office/word/2010/wordprocessingInk" xmlns:wne="http://schemas.microsoft.com/office/word/2006/wordml" xmlns:wps="http://schemas.microsoft.com/office/word/2010/wordprocessingShape" mc:Ignorable="w14 w15 w16se w16cid w16 w16cex w16sdtdh w16sdtfl w16du wp14">
+  <w:p>
+    <w:r>
+      <w:rPr>
+        <w:noProof/>
+      </w:rPr>
+      <w:drawing>
+        <wp:inline distT="114300" distB="114300" distL="114300" distR="114300" wp14:anchorId="532B102C" wp14:editId="07777777">
+          <wp:extent cx="1647825" cy="1152525"/>
+          <wp:effectExtent l="0" t="0" r="0" b="0"/>
+          <wp:docPr id="6" name="image4.png"/>
+          <wp:cNvGraphicFramePr/>
+          <a:graphic xmlns:a="http://schemas.openxmlformats.org/drawingml/2006/main">
+            <a:graphicData uri="http://schemas.openxmlformats.org/drawingml/2006/picture">
+              <pic:pic xmlns:pic="http://schemas.openxmlformats.org/drawingml/2006/picture">
+                <pic:nvPicPr>
+                  <pic:cNvPr id="0" name="image4.png"/>
+                  <pic:cNvPicPr preferRelativeResize="0"/>
+                </pic:nvPicPr>
+                <pic:blipFill>
+                  <a:blip r:embed="rId1"/>
+                  <a:srcRect/>
+                  <a:stretch>
+                    <a:fillRect/>
+                  </a:stretch>
+                </pic:blipFill>
+                <pic:spPr>
+                  <a:xfrm>
+                    <a:off x="0" y="0"/>
+                    <a:ext cx="1647825" cy="1152525"/>
+                  </a:xfrm>
+                  <a:prstGeom prst="rect">
+                    <a:avLst/>
+                  </a:prstGeom>
+                  <a:ln/>
+                </pic:spPr>
+              </pic:pic>
+            </a:graphicData>
+          </a:graphic>
+        </wp:inline>
+      </w:drawing>
+    </w:r>
+  </w:p>
+</w:hdr>
+</file>
 
 <file path=word/styles.xml><?xml version="1.0" encoding="utf-8"?>
 <w:styles xmlns:mc="http://schemas.openxmlformats.org/markup-compatibility/2006" xmlns:r="http://schemas.openxmlformats.org/officeDocument/2006/relationships" xmlns:w="http://schemas.openxmlformats.org/wordprocessingml/2006/main" xmlns:w14="http://schemas.microsoft.com/office/word/2010/wordml" xmlns:w15="http://schemas.microsoft.com/office/word/2012/wordml" xmlns:w16cex="http://schemas.microsoft.com/office/word/2018/wordml/cex" xmlns:w16cid="http://schemas.microsoft.com/office/word/2016/wordml/cid" xmlns:w16="http://schemas.microsoft.com/office/word/2018/wordml" xmlns:w16du="http://schemas.microsoft.com/office/word/2023/wordml/word16du" xmlns:w16sdtdh="http://schemas.microsoft.com/office/word/2020/wordml/sdtdatahash" xmlns:w16sdtfl="http://schemas.microsoft.com/office/word/2024/wordml/sdtformatlock" xmlns:w16se="http://schemas.microsoft.com/office/word/2015/wordml/symex" mc:Ignorable="w14 w15 w16se w16cid w16 w16cex w16sdtdh w16sdtfl w16du">

</xml_diff>

<commit_message>
fix(git): stop corrupting binary files via line-ending normalization
.gitattributes forced every file to text with eol=lf, which rewrote
CRLF byte sequences inside PNGs and DOCX files on commit, corrupting
them in the repository. Switch to text=auto with explicit binary
markers and renormalize the affected files from the intact working
tree copies.

Co-Authored-By: Claude Fable 5 <noreply@anthropic.com>
</commit_message>
<xml_diff>
--- a/modelos/desenvolvimento/ModeloDev - Estimativa de Esforço e Cronograma.docx
+++ b/modelos/desenvolvimento/ModeloDev - Estimativa de Esforço e Cronograma.docx
@@ -1,3 +1,3266 @@
+
+<file path=word/document.xml><?xml version="1.0" encoding="utf-8"?>
+<w:document xmlns:wpc="http://schemas.microsoft.com/office/word/2010/wordprocessingCanvas" xmlns:cx="http://schemas.microsoft.com/office/drawing/2014/chartex" xmlns:cx1="http://schemas.microsoft.com/office/drawing/2015/9/8/chartex" xmlns:cx2="http://schemas.microsoft.com/office/drawing/2015/10/21/chartex" xmlns:cx3="http://schemas.microsoft.com/office/drawing/2016/5/9/chartex" xmlns:cx4="http://schemas.microsoft.com/office/drawing/2016/5/10/chartex" xmlns:cx5="http://schemas.microsoft.com/office/drawing/2016/5/11/chartex" xmlns:cx6="http://schemas.microsoft.com/office/drawing/2016/5/12/chartex" xmlns:cx7="http://schemas.microsoft.com/office/drawing/2016/5/13/chartex" xmlns:cx8="http://schemas.microsoft.com/office/drawing/2016/5/14/chartex" xmlns:mc="http://schemas.openxmlformats.org/markup-compatibility/2006" xmlns:aink="http://schemas.microsoft.com/office/drawing/2016/ink" xmlns:am3d="http://schemas.microsoft.com/office/drawing/2017/model3d" xmlns:o="urn:schemas-microsoft-com:office:office" xmlns:oel="http://schemas.microsoft.com/office/2019/extlst" xmlns:r="http://schemas.openxmlformats.org/officeDocument/2006/relationships" xmlns:m="http://schemas.openxmlformats.org/officeDocument/2006/math" xmlns:v="urn:schemas-microsoft-com:vml" xmlns:wp14="http://schemas.microsoft.com/office/word/2010/wordprocessingDrawing" xmlns:wp="http://schemas.openxmlformats.org/drawingml/2006/wordprocessingDrawing" xmlns:w10="urn:schemas-microsoft-com:office:word" xmlns:w="http://schemas.openxmlformats.org/wordprocessingml/2006/main" xmlns:w14="http://schemas.microsoft.com/office/word/2010/wordml" xmlns:w15="http://schemas.microsoft.com/office/word/2012/wordml" xmlns:w16cex="http://schemas.microsoft.com/office/word/2018/wordml/cex" xmlns:w16cid="http://schemas.microsoft.com/office/word/2016/wordml/cid" xmlns:w16="http://schemas.microsoft.com/office/word/2018/wordml" xmlns:w16du="http://schemas.microsoft.com/office/word/2023/wordml/word16du" xmlns:w16sdtdh="http://schemas.microsoft.com/office/word/2020/wordml/sdtdatahash" xmlns:w16sdtfl="http://schemas.microsoft.com/office/word/2024/wordml/sdtformatlock" xmlns:w16se="http://schemas.microsoft.com/office/word/2015/wordml/symex" xmlns:wpg="http://schemas.microsoft.com/office/word/2010/wordprocessingGroup" xmlns:wpi="http://schemas.microsoft.com/office/word/2010/wordprocessingInk" xmlns:wne="http://schemas.microsoft.com/office/word/2006/wordml" xmlns:wps="http://schemas.microsoft.com/office/word/2010/wordprocessingShape" mc:Ignorable="w14 w15 w16se w16cid w16 w16cex w16sdtdh w16sdtfl w16du wp14">
+  <w:body>
+    <w:p>
+      <w:pPr>
+        <w:rPr>
+          <w:rFonts w:ascii="Calibri" w:hAnsi="Calibri" w:cs="Calibri"/>
+        </w:rPr>
+      </w:pPr>
+      <w:bookmarkStart w:id="0" w:name="_ht9zwna7w4do"/>
+      <w:bookmarkStart w:id="1" w:name="_alkxysdga6x8" w:colFirst="0" w:colLast="0"/>
+      <w:bookmarkStart w:id="2" w:name="_Hlk190487182"/>
+      <w:bookmarkEnd w:id="0"/>
+      <w:bookmarkEnd w:id="1"/>
+    </w:p>
+    <w:p>
+      <w:pPr>
+        <w:rPr>
+          <w:rFonts w:ascii="Calibri" w:hAnsi="Calibri" w:cs="Calibri"/>
+        </w:rPr>
+      </w:pPr>
+      <w:bookmarkStart w:id="3" w:name="_pt5h7plkpyez" w:colFirst="0" w:colLast="0"/>
+      <w:bookmarkEnd w:id="3"/>
+    </w:p>
+    <w:p>
+      <w:pPr>
+        <w:rPr>
+          <w:rFonts w:ascii="Calibri" w:hAnsi="Calibri" w:cs="Calibri"/>
+        </w:rPr>
+      </w:pPr>
+    </w:p>
+    <w:p>
+      <w:pPr>
+        <w:rPr>
+          <w:rFonts w:ascii="Calibri" w:hAnsi="Calibri" w:cs="Calibri"/>
+        </w:rPr>
+      </w:pPr>
+    </w:p>
+    <w:p>
+      <w:pPr>
+        <w:rPr>
+          <w:rFonts w:ascii="Calibri" w:hAnsi="Calibri" w:cs="Calibri"/>
+        </w:rPr>
+      </w:pPr>
+    </w:p>
+    <w:p>
+      <w:pPr>
+        <w:rPr>
+          <w:rFonts w:ascii="Calibri" w:hAnsi="Calibri" w:cs="Calibri"/>
+        </w:rPr>
+      </w:pPr>
+    </w:p>
+    <w:p>
+      <w:pPr>
+        <w:rPr>
+          <w:rFonts w:ascii="Calibri" w:hAnsi="Calibri" w:cs="Calibri"/>
+        </w:rPr>
+      </w:pPr>
+    </w:p>
+    <w:p>
+      <w:pPr>
+        <w:rPr>
+          <w:rFonts w:ascii="Calibri" w:hAnsi="Calibri" w:cs="Calibri"/>
+        </w:rPr>
+      </w:pPr>
+    </w:p>
+    <w:p>
+      <w:pPr>
+        <w:rPr>
+          <w:rFonts w:ascii="Calibri" w:hAnsi="Calibri" w:cs="Calibri"/>
+        </w:rPr>
+      </w:pPr>
+    </w:p>
+    <w:p>
+      <w:pPr>
+        <w:rPr>
+          <w:rFonts w:ascii="Calibri" w:hAnsi="Calibri" w:cs="Calibri"/>
+        </w:rPr>
+      </w:pPr>
+    </w:p>
+    <w:p>
+      <w:pPr>
+        <w:rPr>
+          <w:rFonts w:ascii="Calibri" w:hAnsi="Calibri" w:cs="Calibri"/>
+        </w:rPr>
+      </w:pPr>
+    </w:p>
+    <w:p>
+      <w:pPr>
+        <w:rPr>
+          <w:rFonts w:ascii="Calibri" w:hAnsi="Calibri" w:cs="Calibri"/>
+        </w:rPr>
+      </w:pPr>
+      <w:bookmarkStart w:id="4" w:name="_gli44eea0fa8" w:colFirst="0" w:colLast="0"/>
+      <w:bookmarkEnd w:id="4"/>
+    </w:p>
+    <w:p>
+      <w:pPr>
+        <w:rPr>
+          <w:rFonts w:ascii="Calibri" w:hAnsi="Calibri" w:cs="Calibri"/>
+        </w:rPr>
+      </w:pPr>
+    </w:p>
+    <w:p>
+      <w:pPr>
+        <w:rPr>
+          <w:rFonts w:ascii="Calibri" w:hAnsi="Calibri" w:cs="Calibri"/>
+        </w:rPr>
+      </w:pPr>
+    </w:p>
+    <w:bookmarkEnd w:id="2"/>
+    <w:p>
+      <w:pPr>
+        <w:spacing w:before="240" w:after="240"/>
+        <w:jc w:val="right"/>
+        <w:rPr>
+          <w:rFonts w:ascii="Calibri" w:eastAsia="Calibri" w:hAnsi="Calibri" w:cs="Calibri"/>
+          <w:sz w:val="48"/>
+          <w:szCs w:val="48"/>
+        </w:rPr>
+      </w:pPr>
+      <w:r>
+        <w:rPr>
+          <w:rFonts w:ascii="Calibri" w:eastAsia="Calibri" w:hAnsi="Calibri" w:cs="Calibri"/>
+          <w:b/>
+          <w:color w:val="334682"/>
+          <w:sz w:val="48"/>
+          <w:szCs w:val="48"/>
+        </w:rPr>
+        <w:t>Estimativa de Esforço e Cronograma</w:t>
+      </w:r>
+    </w:p>
+    <w:p>
+      <w:pPr>
+        <w:pBdr>
+          <w:top w:val="nil"/>
+          <w:left w:val="nil"/>
+          <w:bottom w:val="nil"/>
+          <w:right w:val="nil"/>
+          <w:between w:val="nil"/>
+        </w:pBdr>
+        <w:spacing w:before="240" w:after="240"/>
+        <w:jc w:val="right"/>
+        <w:rPr>
+          <w:rFonts w:ascii="Calibri" w:eastAsia="Calibri" w:hAnsi="Calibri" w:cs="Calibri"/>
+          <w:b/>
+          <w:bCs/>
+          <w:color w:val="334682"/>
+          <w:sz w:val="28"/>
+          <w:szCs w:val="28"/>
+        </w:rPr>
+      </w:pPr>
+      <w:r>
+        <w:rPr>
+          <w:rFonts w:ascii="Calibri" w:eastAsia="Calibri" w:hAnsi="Calibri" w:cs="Calibri"/>
+          <w:b/>
+          <w:bCs/>
+          <w:color w:val="334682"/>
+          <w:sz w:val="28"/>
+          <w:szCs w:val="28"/>
+        </w:rPr>
+        <w:t>SS-CTNI-0534-2021.00-[NNN]-[AAAA]</w:t>
+      </w:r>
+    </w:p>
+    <w:p>
+      <w:pPr>
+        <w:rPr>
+          <w:rFonts w:ascii="Calibri" w:eastAsia="Calibri" w:hAnsi="Calibri" w:cs="Calibri"/>
+        </w:rPr>
+      </w:pPr>
+    </w:p>
+    <w:p>
+      <w:pPr>
+        <w:rPr>
+          <w:rFonts w:ascii="Calibri" w:eastAsia="Calibri" w:hAnsi="Calibri" w:cs="Calibri"/>
+        </w:rPr>
+      </w:pPr>
+    </w:p>
+    <w:p>
+      <w:pPr>
+        <w:rPr>
+          <w:rFonts w:ascii="Calibri" w:eastAsia="Calibri" w:hAnsi="Calibri" w:cs="Calibri"/>
+        </w:rPr>
+      </w:pPr>
+    </w:p>
+    <w:p>
+      <w:pPr>
+        <w:rPr>
+          <w:rFonts w:ascii="Calibri" w:eastAsia="Calibri" w:hAnsi="Calibri" w:cs="Calibri"/>
+        </w:rPr>
+      </w:pPr>
+    </w:p>
+    <w:p>
+      <w:pPr>
+        <w:rPr>
+          <w:rFonts w:ascii="Calibri" w:eastAsia="Calibri" w:hAnsi="Calibri" w:cs="Calibri"/>
+        </w:rPr>
+      </w:pPr>
+    </w:p>
+    <w:p>
+      <w:pPr>
+        <w:rPr>
+          <w:rFonts w:ascii="Calibri" w:eastAsia="Calibri" w:hAnsi="Calibri" w:cs="Calibri"/>
+        </w:rPr>
+      </w:pPr>
+    </w:p>
+    <w:p>
+      <w:pPr>
+        <w:pBdr>
+          <w:top w:val="nil"/>
+          <w:left w:val="nil"/>
+          <w:bottom w:val="nil"/>
+          <w:right w:val="nil"/>
+          <w:between w:val="nil"/>
+        </w:pBdr>
+        <w:spacing w:before="240" w:after="240"/>
+        <w:jc w:val="right"/>
+        <w:rPr>
+          <w:rFonts w:ascii="Calibri" w:eastAsia="Calibri" w:hAnsi="Calibri" w:cs="Calibri"/>
+          <w:b/>
+          <w:color w:val="334682"/>
+          <w:sz w:val="28"/>
+          <w:szCs w:val="28"/>
+        </w:rPr>
+      </w:pPr>
+      <w:r>
+        <w:rPr>
+          <w:rFonts w:ascii="Calibri" w:eastAsia="Calibri" w:hAnsi="Calibri" w:cs="Calibri"/>
+          <w:b/>
+          <w:color w:val="334682"/>
+          <w:sz w:val="28"/>
+          <w:szCs w:val="28"/>
+        </w:rPr>
+        <w:t>Versão 1.0</w:t>
+      </w:r>
+    </w:p>
+    <w:p>
+      <w:pPr>
+        <w:pBdr>
+          <w:top w:val="nil"/>
+          <w:left w:val="nil"/>
+          <w:bottom w:val="nil"/>
+          <w:right w:val="nil"/>
+          <w:between w:val="nil"/>
+        </w:pBdr>
+        <w:spacing w:before="240" w:after="240"/>
+        <w:jc w:val="right"/>
+        <w:rPr>
+          <w:rFonts w:ascii="Calibri" w:eastAsia="Calibri" w:hAnsi="Calibri" w:cs="Calibri"/>
+          <w:b/>
+          <w:bCs/>
+          <w:sz w:val="40"/>
+          <w:szCs w:val="40"/>
+          <w:u w:val="single"/>
+        </w:rPr>
+      </w:pPr>
+      <w:r>
+        <w:rPr>
+          <w:rFonts w:ascii="Calibri" w:eastAsia="Calibri" w:hAnsi="Calibri" w:cs="Calibri"/>
+          <w:b/>
+          <w:color w:val="334682"/>
+          <w:sz w:val="28"/>
+          <w:szCs w:val="28"/>
+        </w:rPr>
+        <w:t>[DATA_ATUAL]</w:t>
+      </w:r>
+    </w:p>
+    <w:p>
+      <w:pPr>
+        <w:rPr>
+          <w:rFonts w:ascii="Calibri" w:hAnsi="Calibri" w:cs="Calibri"/>
+          <w:b/>
+          <w:color w:val="334682"/>
+          <w:sz w:val="42"/>
+          <w:szCs w:val="42"/>
+        </w:rPr>
+      </w:pPr>
+      <w:bookmarkStart w:id="5" w:name="_i2upxltnlkdd"/>
+      <w:bookmarkEnd w:id="5"/>
+      <w:r>
+        <w:rPr>
+          <w:rFonts w:ascii="Calibri" w:hAnsi="Calibri" w:cs="Calibri"/>
+        </w:rPr>
+        <w:br w:type="page"/>
+      </w:r>
+    </w:p>
+    <w:p>
+      <w:pPr>
+        <w:rPr>
+          <w:rFonts w:ascii="Calibri" w:hAnsi="Calibri" w:cs="Calibri"/>
+        </w:rPr>
+      </w:pPr>
+      <w:bookmarkStart w:id="6" w:name="_f2q8bufb49ap" w:colFirst="0" w:colLast="0"/>
+      <w:bookmarkEnd w:id="6"/>
+    </w:p>
+    <w:p>
+      <w:pPr>
+        <w:jc w:val="center"/>
+        <w:rPr>
+          <w:rFonts w:ascii="Calibri" w:eastAsia="Calibri" w:hAnsi="Calibri" w:cs="Calibri"/>
+        </w:rPr>
+      </w:pPr>
+      <w:r>
+        <w:rPr>
+          <w:rFonts w:ascii="Calibri" w:eastAsia="Calibri" w:hAnsi="Calibri" w:cs="Calibri"/>
+          <w:b/>
+          <w:color w:val="334682"/>
+          <w:sz w:val="42"/>
+          <w:szCs w:val="42"/>
+        </w:rPr>
+        <w:t>Histórico de Revisão</w:t>
+      </w:r>
+    </w:p>
+    <w:p>
+      <w:pPr>
+        <w:spacing w:before="240" w:after="240"/>
+        <w:rPr>
+          <w:rFonts w:ascii="Calibri" w:eastAsia="Corbel" w:hAnsi="Calibri" w:cs="Calibri"/>
+        </w:rPr>
+      </w:pPr>
+      <w:r>
+        <w:rPr>
+          <w:rFonts w:ascii="Calibri" w:eastAsia="Corbel" w:hAnsi="Calibri" w:cs="Calibri"/>
+        </w:rPr>
+        <w:t xml:space="preserve"> </w:t>
+      </w:r>
+    </w:p>
+    <w:tbl>
+      <w:tblPr>
+        <w:tblW w:w="9630" w:type="dxa"/>
+        <w:tblInd w:w="2" w:type="dxa"/>
+        <w:tblBorders>
+          <w:top w:val="nil"/>
+          <w:left w:val="nil"/>
+          <w:bottom w:val="nil"/>
+          <w:right w:val="nil"/>
+          <w:insideH w:val="nil"/>
+          <w:insideV w:val="nil"/>
+        </w:tblBorders>
+        <w:tblLook w:val="0600" w:firstRow="0" w:lastRow="0" w:firstColumn="0" w:lastColumn="0" w:noHBand="1" w:noVBand="1"/>
+      </w:tblPr>
+      <w:tblGrid>
+        <w:gridCol w:w="2445"/>
+        <w:gridCol w:w="3690"/>
+        <w:gridCol w:w="3495"/>
+      </w:tblGrid>
+      <w:tr>
+        <w:trPr>
+          <w:trHeight w:val="460"/>
+        </w:trPr>
+        <w:tc>
+          <w:tcPr>
+            <w:tcW w:w="1785" w:type="dxa"/>
+            <w:tcBorders>
+              <w:top w:val="single" w:sz="8" w:space="0" w:color="000000" w:themeColor="text1"/>
+              <w:left w:val="single" w:sz="8" w:space="0" w:color="000000" w:themeColor="text1"/>
+              <w:bottom w:val="single" w:sz="8" w:space="0" w:color="000000" w:themeColor="text1"/>
+              <w:right w:val="single" w:sz="8" w:space="0" w:color="000000" w:themeColor="text1"/>
+            </w:tcBorders>
+            <w:tcMar>
+              <w:top w:w="100" w:type="dxa"/>
+              <w:left w:w="100" w:type="dxa"/>
+              <w:bottom w:w="100" w:type="dxa"/>
+              <w:right w:w="100" w:type="dxa"/>
+            </w:tcMar>
+          </w:tcPr>
+          <w:p>
+            <w:pPr>
+              <w:spacing w:before="240" w:after="240" w:line="240" w:lineRule="auto"/>
+              <w:rPr>
+                <w:rFonts w:ascii="Calibri" w:eastAsia="Calibri" w:hAnsi="Calibri" w:cs="Calibri"/>
+                <w:b/>
+                <w:sz w:val="24"/>
+                <w:szCs w:val="24"/>
+              </w:rPr>
+            </w:pPr>
+            <w:r>
+              <w:rPr>
+                <w:rFonts w:ascii="Calibri" w:eastAsia="Calibri" w:hAnsi="Calibri" w:cs="Calibri"/>
+                <w:b/>
+                <w:sz w:val="24"/>
+                <w:szCs w:val="24"/>
+              </w:rPr>
+              <w:t>Data</w:t>
+            </w:r>
+          </w:p>
+        </w:tc>
+        <w:tc>
+          <w:tcPr>
+            <w:tcW w:w="5475" w:type="dxa"/>
+            <w:tcBorders>
+              <w:top w:val="single" w:sz="8" w:space="0" w:color="000000" w:themeColor="text1"/>
+              <w:left w:val="nil"/>
+              <w:bottom w:val="single" w:sz="8" w:space="0" w:color="000000" w:themeColor="text1"/>
+              <w:right w:val="single" w:sz="8" w:space="0" w:color="000000" w:themeColor="text1"/>
+            </w:tcBorders>
+            <w:tcMar>
+              <w:top w:w="100" w:type="dxa"/>
+              <w:left w:w="100" w:type="dxa"/>
+              <w:bottom w:w="100" w:type="dxa"/>
+              <w:right w:w="100" w:type="dxa"/>
+            </w:tcMar>
+          </w:tcPr>
+          <w:p>
+            <w:pPr>
+              <w:spacing w:before="240" w:after="240" w:line="240" w:lineRule="auto"/>
+              <w:rPr>
+                <w:rFonts w:ascii="Calibri" w:eastAsia="Calibri" w:hAnsi="Calibri" w:cs="Calibri"/>
+                <w:b/>
+                <w:sz w:val="24"/>
+                <w:szCs w:val="24"/>
+              </w:rPr>
+            </w:pPr>
+            <w:r>
+              <w:rPr>
+                <w:rFonts w:ascii="Calibri" w:eastAsia="Calibri" w:hAnsi="Calibri" w:cs="Calibri"/>
+                <w:b/>
+                <w:sz w:val="24"/>
+                <w:szCs w:val="24"/>
+              </w:rPr>
+              <w:t>Descrição</w:t>
+            </w:r>
+          </w:p>
+        </w:tc>
+        <w:tc>
+          <w:tcPr>
+            <w:tcW w:w="2370" w:type="dxa"/>
+            <w:tcBorders>
+              <w:top w:val="single" w:sz="8" w:space="0" w:color="000000" w:themeColor="text1"/>
+              <w:left w:val="nil"/>
+              <w:bottom w:val="single" w:sz="8" w:space="0" w:color="000000" w:themeColor="text1"/>
+              <w:right w:val="single" w:sz="8" w:space="0" w:color="000000" w:themeColor="text1"/>
+            </w:tcBorders>
+            <w:tcMar>
+              <w:top w:w="100" w:type="dxa"/>
+              <w:left w:w="100" w:type="dxa"/>
+              <w:bottom w:w="100" w:type="dxa"/>
+              <w:right w:w="100" w:type="dxa"/>
+            </w:tcMar>
+          </w:tcPr>
+          <w:p>
+            <w:pPr>
+              <w:spacing w:before="240" w:after="240" w:line="240" w:lineRule="auto"/>
+              <w:rPr>
+                <w:rFonts w:ascii="Calibri" w:eastAsia="Calibri" w:hAnsi="Calibri" w:cs="Calibri"/>
+                <w:b/>
+                <w:sz w:val="24"/>
+                <w:szCs w:val="24"/>
+              </w:rPr>
+            </w:pPr>
+            <w:r>
+              <w:rPr>
+                <w:rFonts w:ascii="Calibri" w:eastAsia="Calibri" w:hAnsi="Calibri" w:cs="Calibri"/>
+                <w:b/>
+                <w:sz w:val="24"/>
+                <w:szCs w:val="24"/>
+              </w:rPr>
+              <w:t>Autor</w:t>
+            </w:r>
+          </w:p>
+        </w:tc>
+      </w:tr>
+      <w:tr>
+        <w:trPr>
+          <w:trHeight w:val="560"/>
+        </w:trPr>
+        <w:tc>
+          <w:tcPr>
+            <w:tcW w:w="1785" w:type="dxa"/>
+            <w:tcBorders>
+              <w:top w:val="nil"/>
+              <w:left w:val="single" w:sz="8" w:space="0" w:color="000000" w:themeColor="text1"/>
+              <w:bottom w:val="single" w:sz="8" w:space="0" w:color="000000" w:themeColor="text1"/>
+              <w:right w:val="single" w:sz="8" w:space="0" w:color="000000" w:themeColor="text1"/>
+            </w:tcBorders>
+            <w:tcMar>
+              <w:top w:w="100" w:type="dxa"/>
+              <w:left w:w="100" w:type="dxa"/>
+              <w:bottom w:w="100" w:type="dxa"/>
+              <w:right w:w="100" w:type="dxa"/>
+            </w:tcMar>
+            <w:vAlign w:val="center"/>
+          </w:tcPr>
+          <w:p>
+            <w:pPr>
+              <w:spacing w:before="240" w:after="240" w:line="240" w:lineRule="auto"/>
+              <w:rPr>
+                <w:rFonts w:ascii="Calibri" w:eastAsia="Calibri" w:hAnsi="Calibri" w:cs="Calibri"/>
+                <w:sz w:val="24"/>
+                <w:szCs w:val="24"/>
+              </w:rPr>
+            </w:pPr>
+            <w:r>
+              <w:rPr>
+                <w:rFonts w:ascii="Calibri" w:eastAsia="Calibri" w:hAnsi="Calibri" w:cs="Calibri"/>
+                <w:sz w:val="24"/>
+                <w:szCs w:val="24"/>
+              </w:rPr>
+              <w:t>[DATA_</w:t>
+            </w:r>
+            <w:r>
+              <w:rPr>
+                <w:rFonts w:ascii="Calibri" w:eastAsia="Calibri" w:hAnsi="Calibri" w:cs="Calibri"/>
+                <w:sz w:val="24"/>
+                <w:szCs w:val="24"/>
+              </w:rPr>
+              <w:t>CRIACAO</w:t>
+            </w:r>
+            <w:r>
+              <w:rPr>
+                <w:rFonts w:ascii="Calibri" w:eastAsia="Calibri" w:hAnsi="Calibri" w:cs="Calibri"/>
+                <w:sz w:val="24"/>
+                <w:szCs w:val="24"/>
+              </w:rPr>
+              <w:t>]</w:t>
+            </w:r>
+          </w:p>
+        </w:tc>
+        <w:tc>
+          <w:tcPr>
+            <w:tcW w:w="5475" w:type="dxa"/>
+            <w:tcBorders>
+              <w:top w:val="nil"/>
+              <w:left w:val="nil"/>
+              <w:bottom w:val="single" w:sz="8" w:space="0" w:color="000000" w:themeColor="text1"/>
+              <w:right w:val="single" w:sz="8" w:space="0" w:color="000000" w:themeColor="text1"/>
+            </w:tcBorders>
+            <w:tcMar>
+              <w:top w:w="100" w:type="dxa"/>
+              <w:left w:w="100" w:type="dxa"/>
+              <w:bottom w:w="100" w:type="dxa"/>
+              <w:right w:w="100" w:type="dxa"/>
+            </w:tcMar>
+            <w:vAlign w:val="center"/>
+          </w:tcPr>
+          <w:p>
+            <w:pPr>
+              <w:spacing w:before="240" w:after="240" w:line="240" w:lineRule="auto"/>
+              <w:rPr>
+                <w:rFonts w:ascii="Calibri" w:eastAsia="Calibri" w:hAnsi="Calibri" w:cs="Calibri"/>
+                <w:sz w:val="24"/>
+                <w:szCs w:val="24"/>
+              </w:rPr>
+            </w:pPr>
+            <w:r>
+              <w:rPr>
+                <w:rFonts w:ascii="Calibri" w:eastAsia="Calibri" w:hAnsi="Calibri" w:cs="Calibri"/>
+                <w:sz w:val="24"/>
+                <w:szCs w:val="24"/>
+              </w:rPr>
+              <w:t>Criação do documento</w:t>
+            </w:r>
+          </w:p>
+        </w:tc>
+        <w:tc>
+          <w:tcPr>
+            <w:tcW w:w="2370" w:type="dxa"/>
+            <w:tcBorders>
+              <w:top w:val="nil"/>
+              <w:left w:val="nil"/>
+              <w:bottom w:val="single" w:sz="8" w:space="0" w:color="000000" w:themeColor="text1"/>
+              <w:right w:val="single" w:sz="8" w:space="0" w:color="000000" w:themeColor="text1"/>
+            </w:tcBorders>
+            <w:tcMar>
+              <w:top w:w="100" w:type="dxa"/>
+              <w:left w:w="100" w:type="dxa"/>
+              <w:bottom w:w="100" w:type="dxa"/>
+              <w:right w:w="100" w:type="dxa"/>
+            </w:tcMar>
+            <w:vAlign w:val="center"/>
+          </w:tcPr>
+          <w:p>
+            <w:pPr>
+              <w:spacing w:before="240" w:after="240" w:line="240" w:lineRule="auto"/>
+              <w:rPr>
+                <w:rFonts w:ascii="Calibri" w:eastAsia="Calibri" w:hAnsi="Calibri" w:cs="Calibri"/>
+                <w:sz w:val="24"/>
+                <w:szCs w:val="24"/>
+              </w:rPr>
+            </w:pPr>
+            <w:r>
+              <w:rPr>
+                <w:rFonts w:ascii="Calibri" w:eastAsia="Calibri" w:hAnsi="Calibri" w:cs="Calibri"/>
+                <w:sz w:val="24"/>
+                <w:szCs w:val="24"/>
+              </w:rPr>
+              <w:t>[INICIAIS_AUTOR</w:t>
+            </w:r>
+            <w:r>
+              <w:rPr>
+                <w:rFonts w:ascii="Calibri" w:eastAsia="Calibri" w:hAnsi="Calibri" w:cs="Calibri"/>
+                <w:sz w:val="24"/>
+                <w:szCs w:val="24"/>
+              </w:rPr>
+              <w:t>_CRIACAO</w:t>
+            </w:r>
+            <w:r>
+              <w:rPr>
+                <w:rFonts w:ascii="Calibri" w:eastAsia="Calibri" w:hAnsi="Calibri" w:cs="Calibri"/>
+                <w:sz w:val="24"/>
+                <w:szCs w:val="24"/>
+              </w:rPr>
+              <w:t>]</w:t>
+            </w:r>
+          </w:p>
+        </w:tc>
+      </w:tr>
+      <w:tr>
+        <w:trPr>
+          <w:cantSplit/>
+          <w:trHeight w:val="1134"/>
+        </w:trPr>
+        <w:tc>
+          <w:tcPr>
+            <w:tcW w:w="1785" w:type="dxa"/>
+            <w:tcBorders>
+              <w:top w:val="nil"/>
+              <w:left w:val="single" w:sz="8" w:space="0" w:color="000000" w:themeColor="text1"/>
+              <w:bottom w:val="single" w:sz="8" w:space="0" w:color="000000" w:themeColor="text1"/>
+              <w:right w:val="single" w:sz="8" w:space="0" w:color="000000" w:themeColor="text1"/>
+            </w:tcBorders>
+            <w:tcMar>
+              <w:top w:w="100" w:type="dxa"/>
+              <w:left w:w="100" w:type="dxa"/>
+              <w:bottom w:w="100" w:type="dxa"/>
+              <w:right w:w="100" w:type="dxa"/>
+            </w:tcMar>
+            <w:vAlign w:val="center"/>
+          </w:tcPr>
+          <w:p>
+            <w:pPr>
+              <w:spacing w:before="240" w:after="240" w:line="240" w:lineRule="auto"/>
+              <w:rPr>
+                <w:rFonts w:ascii="Calibri" w:eastAsia="Calibri" w:hAnsi="Calibri" w:cs="Calibri"/>
+                <w:sz w:val="24"/>
+                <w:szCs w:val="24"/>
+              </w:rPr>
+            </w:pPr>
+            <w:r>
+              <w:rPr>
+                <w:rFonts w:ascii="Calibri" w:eastAsia="Calibri" w:hAnsi="Calibri" w:cs="Calibri"/>
+                <w:sz w:val="24"/>
+                <w:szCs w:val="24"/>
+              </w:rPr>
+              <w:t>[DATA_MODIFICACAO]</w:t>
+            </w:r>
+          </w:p>
+        </w:tc>
+        <w:tc>
+          <w:tcPr>
+            <w:tcW w:w="5475" w:type="dxa"/>
+            <w:tcBorders>
+              <w:top w:val="nil"/>
+              <w:left w:val="nil"/>
+              <w:bottom w:val="single" w:sz="8" w:space="0" w:color="000000" w:themeColor="text1"/>
+              <w:right w:val="single" w:sz="8" w:space="0" w:color="000000" w:themeColor="text1"/>
+            </w:tcBorders>
+            <w:tcMar>
+              <w:top w:w="100" w:type="dxa"/>
+              <w:left w:w="100" w:type="dxa"/>
+              <w:bottom w:w="100" w:type="dxa"/>
+              <w:right w:w="100" w:type="dxa"/>
+            </w:tcMar>
+            <w:vAlign w:val="center"/>
+          </w:tcPr>
+          <w:p>
+            <w:pPr>
+              <w:spacing w:before="240" w:after="240" w:line="240" w:lineRule="auto"/>
+              <w:rPr>
+                <w:rFonts w:ascii="Calibri" w:eastAsia="Calibri" w:hAnsi="Calibri" w:cs="Calibri"/>
+                <w:sz w:val="24"/>
+                <w:szCs w:val="24"/>
+              </w:rPr>
+            </w:pPr>
+            <w:r>
+              <w:rPr>
+                <w:rFonts w:ascii="Calibri" w:eastAsia="Calibri" w:hAnsi="Calibri" w:cs="Calibri"/>
+                <w:sz w:val="24"/>
+                <w:szCs w:val="24"/>
+              </w:rPr>
+              <w:t>Contagem de pontos de função</w:t>
+            </w:r>
+          </w:p>
+        </w:tc>
+        <w:tc>
+          <w:tcPr>
+            <w:tcW w:w="2370" w:type="dxa"/>
+            <w:tcBorders>
+              <w:top w:val="nil"/>
+              <w:left w:val="nil"/>
+              <w:bottom w:val="single" w:sz="8" w:space="0" w:color="000000" w:themeColor="text1"/>
+              <w:right w:val="single" w:sz="8" w:space="0" w:color="000000" w:themeColor="text1"/>
+            </w:tcBorders>
+            <w:tcMar>
+              <w:top w:w="100" w:type="dxa"/>
+              <w:left w:w="100" w:type="dxa"/>
+              <w:bottom w:w="100" w:type="dxa"/>
+              <w:right w:w="100" w:type="dxa"/>
+            </w:tcMar>
+            <w:vAlign w:val="center"/>
+          </w:tcPr>
+          <w:p>
+            <w:pPr>
+              <w:spacing w:before="240" w:after="240" w:line="240" w:lineRule="auto"/>
+              <w:rPr>
+                <w:rFonts w:ascii="Calibri" w:eastAsia="Calibri" w:hAnsi="Calibri" w:cs="Calibri"/>
+                <w:sz w:val="24"/>
+                <w:szCs w:val="24"/>
+              </w:rPr>
+            </w:pPr>
+            <w:r>
+              <w:rPr>
+                <w:rFonts w:ascii="Calibri" w:eastAsia="Calibri" w:hAnsi="Calibri" w:cs="Calibri"/>
+                <w:sz w:val="24"/>
+                <w:szCs w:val="24"/>
+              </w:rPr>
+              <w:t>[INICIAIS_AUTOR</w:t>
+            </w:r>
+            <w:r>
+              <w:rPr>
+                <w:rFonts w:ascii="Calibri" w:eastAsia="Calibri" w:hAnsi="Calibri" w:cs="Calibri"/>
+                <w:sz w:val="24"/>
+                <w:szCs w:val="24"/>
+              </w:rPr>
+              <w:t>_MODIFICACAO</w:t>
+            </w:r>
+            <w:r>
+              <w:rPr>
+                <w:rFonts w:ascii="Calibri" w:eastAsia="Calibri" w:hAnsi="Calibri" w:cs="Calibri"/>
+                <w:sz w:val="24"/>
+                <w:szCs w:val="24"/>
+              </w:rPr>
+              <w:t>]</w:t>
+            </w:r>
+          </w:p>
+        </w:tc>
+      </w:tr>
+      <w:tr>
+        <w:trPr>
+          <w:trHeight w:val="480"/>
+        </w:trPr>
+        <w:tc>
+          <w:tcPr>
+            <w:tcW w:w="1785" w:type="dxa"/>
+            <w:tcBorders>
+              <w:top w:val="nil"/>
+              <w:left w:val="single" w:sz="8" w:space="0" w:color="000000" w:themeColor="text1"/>
+              <w:bottom w:val="single" w:sz="8" w:space="0" w:color="000000" w:themeColor="text1"/>
+              <w:right w:val="single" w:sz="8" w:space="0" w:color="000000" w:themeColor="text1"/>
+            </w:tcBorders>
+            <w:tcMar>
+              <w:top w:w="100" w:type="dxa"/>
+              <w:left w:w="100" w:type="dxa"/>
+              <w:bottom w:w="100" w:type="dxa"/>
+              <w:right w:w="100" w:type="dxa"/>
+            </w:tcMar>
+          </w:tcPr>
+          <w:p>
+            <w:pPr>
+              <w:spacing w:before="240" w:after="240" w:line="240" w:lineRule="auto"/>
+              <w:rPr>
+                <w:rFonts w:ascii="Calibri" w:eastAsia="Calibri" w:hAnsi="Calibri" w:cs="Calibri"/>
+                <w:sz w:val="24"/>
+                <w:szCs w:val="24"/>
+              </w:rPr>
+            </w:pPr>
+          </w:p>
+        </w:tc>
+        <w:tc>
+          <w:tcPr>
+            <w:tcW w:w="5475" w:type="dxa"/>
+            <w:tcBorders>
+              <w:top w:val="nil"/>
+              <w:left w:val="nil"/>
+              <w:bottom w:val="single" w:sz="8" w:space="0" w:color="000000" w:themeColor="text1"/>
+              <w:right w:val="single" w:sz="8" w:space="0" w:color="000000" w:themeColor="text1"/>
+            </w:tcBorders>
+            <w:tcMar>
+              <w:top w:w="100" w:type="dxa"/>
+              <w:left w:w="100" w:type="dxa"/>
+              <w:bottom w:w="100" w:type="dxa"/>
+              <w:right w:w="100" w:type="dxa"/>
+            </w:tcMar>
+          </w:tcPr>
+          <w:p>
+            <w:pPr>
+              <w:spacing w:before="240" w:after="240" w:line="240" w:lineRule="auto"/>
+              <w:rPr>
+                <w:rFonts w:ascii="Calibri" w:eastAsia="Calibri" w:hAnsi="Calibri" w:cs="Calibri"/>
+                <w:sz w:val="24"/>
+                <w:szCs w:val="24"/>
+              </w:rPr>
+            </w:pPr>
+          </w:p>
+        </w:tc>
+        <w:tc>
+          <w:tcPr>
+            <w:tcW w:w="2370" w:type="dxa"/>
+            <w:tcBorders>
+              <w:top w:val="nil"/>
+              <w:left w:val="nil"/>
+              <w:bottom w:val="single" w:sz="8" w:space="0" w:color="000000" w:themeColor="text1"/>
+              <w:right w:val="single" w:sz="8" w:space="0" w:color="000000" w:themeColor="text1"/>
+            </w:tcBorders>
+            <w:tcMar>
+              <w:top w:w="100" w:type="dxa"/>
+              <w:left w:w="100" w:type="dxa"/>
+              <w:bottom w:w="100" w:type="dxa"/>
+              <w:right w:w="100" w:type="dxa"/>
+            </w:tcMar>
+          </w:tcPr>
+          <w:p>
+            <w:pPr>
+              <w:spacing w:before="240" w:after="240" w:line="240" w:lineRule="auto"/>
+              <w:rPr>
+                <w:rFonts w:ascii="Calibri" w:eastAsia="Calibri" w:hAnsi="Calibri" w:cs="Calibri"/>
+                <w:sz w:val="24"/>
+                <w:szCs w:val="24"/>
+              </w:rPr>
+            </w:pPr>
+          </w:p>
+        </w:tc>
+      </w:tr>
+      <w:tr>
+        <w:trPr>
+          <w:trHeight w:val="460"/>
+        </w:trPr>
+        <w:tc>
+          <w:tcPr>
+            <w:tcW w:w="1785" w:type="dxa"/>
+            <w:tcBorders>
+              <w:top w:val="nil"/>
+              <w:left w:val="single" w:sz="8" w:space="0" w:color="000000" w:themeColor="text1"/>
+              <w:bottom w:val="single" w:sz="8" w:space="0" w:color="000000" w:themeColor="text1"/>
+              <w:right w:val="single" w:sz="8" w:space="0" w:color="000000" w:themeColor="text1"/>
+            </w:tcBorders>
+            <w:tcMar>
+              <w:top w:w="100" w:type="dxa"/>
+              <w:left w:w="100" w:type="dxa"/>
+              <w:bottom w:w="100" w:type="dxa"/>
+              <w:right w:w="100" w:type="dxa"/>
+            </w:tcMar>
+          </w:tcPr>
+          <w:p>
+            <w:pPr>
+              <w:spacing w:before="240" w:after="240" w:line="240" w:lineRule="auto"/>
+              <w:rPr>
+                <w:rFonts w:ascii="Calibri" w:eastAsia="Calibri" w:hAnsi="Calibri" w:cs="Calibri"/>
+                <w:sz w:val="24"/>
+                <w:szCs w:val="24"/>
+              </w:rPr>
+            </w:pPr>
+            <w:r>
+              <w:rPr>
+                <w:rFonts w:ascii="Calibri" w:eastAsia="Calibri" w:hAnsi="Calibri" w:cs="Calibri"/>
+                <w:sz w:val="24"/>
+                <w:szCs w:val="24"/>
+              </w:rPr>
+              <w:t xml:space="preserve"> </w:t>
+            </w:r>
+          </w:p>
+        </w:tc>
+        <w:tc>
+          <w:tcPr>
+            <w:tcW w:w="5475" w:type="dxa"/>
+            <w:tcBorders>
+              <w:top w:val="nil"/>
+              <w:left w:val="nil"/>
+              <w:bottom w:val="single" w:sz="8" w:space="0" w:color="000000" w:themeColor="text1"/>
+              <w:right w:val="single" w:sz="8" w:space="0" w:color="000000" w:themeColor="text1"/>
+            </w:tcBorders>
+            <w:tcMar>
+              <w:top w:w="100" w:type="dxa"/>
+              <w:left w:w="100" w:type="dxa"/>
+              <w:bottom w:w="100" w:type="dxa"/>
+              <w:right w:w="100" w:type="dxa"/>
+            </w:tcMar>
+          </w:tcPr>
+          <w:p>
+            <w:pPr>
+              <w:spacing w:before="240" w:after="240" w:line="240" w:lineRule="auto"/>
+              <w:rPr>
+                <w:rFonts w:ascii="Calibri" w:eastAsia="Calibri" w:hAnsi="Calibri" w:cs="Calibri"/>
+                <w:sz w:val="24"/>
+                <w:szCs w:val="24"/>
+              </w:rPr>
+            </w:pPr>
+            <w:r>
+              <w:rPr>
+                <w:rFonts w:ascii="Calibri" w:eastAsia="Calibri" w:hAnsi="Calibri" w:cs="Calibri"/>
+                <w:sz w:val="24"/>
+                <w:szCs w:val="24"/>
+              </w:rPr>
+              <w:t xml:space="preserve"> </w:t>
+            </w:r>
+          </w:p>
+        </w:tc>
+        <w:tc>
+          <w:tcPr>
+            <w:tcW w:w="2370" w:type="dxa"/>
+            <w:tcBorders>
+              <w:top w:val="nil"/>
+              <w:left w:val="nil"/>
+              <w:bottom w:val="single" w:sz="8" w:space="0" w:color="000000" w:themeColor="text1"/>
+              <w:right w:val="single" w:sz="8" w:space="0" w:color="000000" w:themeColor="text1"/>
+            </w:tcBorders>
+            <w:tcMar>
+              <w:top w:w="100" w:type="dxa"/>
+              <w:left w:w="100" w:type="dxa"/>
+              <w:bottom w:w="100" w:type="dxa"/>
+              <w:right w:w="100" w:type="dxa"/>
+            </w:tcMar>
+          </w:tcPr>
+          <w:p>
+            <w:pPr>
+              <w:spacing w:before="240" w:after="240" w:line="240" w:lineRule="auto"/>
+              <w:rPr>
+                <w:rFonts w:ascii="Calibri" w:eastAsia="Calibri" w:hAnsi="Calibri" w:cs="Calibri"/>
+                <w:sz w:val="24"/>
+                <w:szCs w:val="24"/>
+              </w:rPr>
+            </w:pPr>
+            <w:r>
+              <w:rPr>
+                <w:rFonts w:ascii="Calibri" w:eastAsia="Calibri" w:hAnsi="Calibri" w:cs="Calibri"/>
+                <w:sz w:val="24"/>
+                <w:szCs w:val="24"/>
+              </w:rPr>
+              <w:t xml:space="preserve"> </w:t>
+            </w:r>
+          </w:p>
+        </w:tc>
+      </w:tr>
+      <w:tr>
+        <w:trPr>
+          <w:trHeight w:val="460"/>
+        </w:trPr>
+        <w:tc>
+          <w:tcPr>
+            <w:tcW w:w="1785" w:type="dxa"/>
+            <w:tcBorders>
+              <w:top w:val="nil"/>
+              <w:left w:val="single" w:sz="8" w:space="0" w:color="000000" w:themeColor="text1"/>
+              <w:bottom w:val="single" w:sz="8" w:space="0" w:color="000000" w:themeColor="text1"/>
+              <w:right w:val="single" w:sz="8" w:space="0" w:color="000000" w:themeColor="text1"/>
+            </w:tcBorders>
+            <w:tcMar>
+              <w:top w:w="100" w:type="dxa"/>
+              <w:left w:w="100" w:type="dxa"/>
+              <w:bottom w:w="100" w:type="dxa"/>
+              <w:right w:w="100" w:type="dxa"/>
+            </w:tcMar>
+          </w:tcPr>
+          <w:p>
+            <w:pPr>
+              <w:spacing w:before="240" w:after="240" w:line="240" w:lineRule="auto"/>
+              <w:rPr>
+                <w:rFonts w:ascii="Calibri" w:eastAsia="Calibri" w:hAnsi="Calibri" w:cs="Calibri"/>
+                <w:sz w:val="24"/>
+                <w:szCs w:val="24"/>
+              </w:rPr>
+            </w:pPr>
+            <w:r>
+              <w:rPr>
+                <w:rFonts w:ascii="Calibri" w:eastAsia="Calibri" w:hAnsi="Calibri" w:cs="Calibri"/>
+                <w:sz w:val="24"/>
+                <w:szCs w:val="24"/>
+              </w:rPr>
+              <w:t xml:space="preserve"> </w:t>
+            </w:r>
+          </w:p>
+        </w:tc>
+        <w:tc>
+          <w:tcPr>
+            <w:tcW w:w="5475" w:type="dxa"/>
+            <w:tcBorders>
+              <w:top w:val="nil"/>
+              <w:left w:val="nil"/>
+              <w:bottom w:val="single" w:sz="8" w:space="0" w:color="000000" w:themeColor="text1"/>
+              <w:right w:val="single" w:sz="8" w:space="0" w:color="000000" w:themeColor="text1"/>
+            </w:tcBorders>
+            <w:tcMar>
+              <w:top w:w="100" w:type="dxa"/>
+              <w:left w:w="100" w:type="dxa"/>
+              <w:bottom w:w="100" w:type="dxa"/>
+              <w:right w:w="100" w:type="dxa"/>
+            </w:tcMar>
+          </w:tcPr>
+          <w:p>
+            <w:pPr>
+              <w:spacing w:before="240" w:after="240" w:line="240" w:lineRule="auto"/>
+              <w:rPr>
+                <w:rFonts w:ascii="Calibri" w:eastAsia="Calibri" w:hAnsi="Calibri" w:cs="Calibri"/>
+                <w:sz w:val="24"/>
+                <w:szCs w:val="24"/>
+              </w:rPr>
+            </w:pPr>
+            <w:r>
+              <w:rPr>
+                <w:rFonts w:ascii="Calibri" w:eastAsia="Calibri" w:hAnsi="Calibri" w:cs="Calibri"/>
+                <w:sz w:val="24"/>
+                <w:szCs w:val="24"/>
+              </w:rPr>
+              <w:t xml:space="preserve"> </w:t>
+            </w:r>
+          </w:p>
+        </w:tc>
+        <w:tc>
+          <w:tcPr>
+            <w:tcW w:w="2370" w:type="dxa"/>
+            <w:tcBorders>
+              <w:top w:val="nil"/>
+              <w:left w:val="nil"/>
+              <w:bottom w:val="single" w:sz="8" w:space="0" w:color="000000" w:themeColor="text1"/>
+              <w:right w:val="single" w:sz="8" w:space="0" w:color="000000" w:themeColor="text1"/>
+            </w:tcBorders>
+            <w:tcMar>
+              <w:top w:w="100" w:type="dxa"/>
+              <w:left w:w="100" w:type="dxa"/>
+              <w:bottom w:w="100" w:type="dxa"/>
+              <w:right w:w="100" w:type="dxa"/>
+            </w:tcMar>
+          </w:tcPr>
+          <w:p>
+            <w:pPr>
+              <w:spacing w:before="240" w:after="240" w:line="240" w:lineRule="auto"/>
+              <w:rPr>
+                <w:rFonts w:ascii="Calibri" w:eastAsia="Calibri" w:hAnsi="Calibri" w:cs="Calibri"/>
+                <w:sz w:val="24"/>
+                <w:szCs w:val="24"/>
+              </w:rPr>
+            </w:pPr>
+            <w:r>
+              <w:rPr>
+                <w:rFonts w:ascii="Calibri" w:eastAsia="Calibri" w:hAnsi="Calibri" w:cs="Calibri"/>
+                <w:sz w:val="24"/>
+                <w:szCs w:val="24"/>
+              </w:rPr>
+              <w:t xml:space="preserve"> </w:t>
+            </w:r>
+          </w:p>
+        </w:tc>
+      </w:tr>
+    </w:tbl>
+    <w:p>
+      <w:pPr>
+        <w:pBdr>
+          <w:top w:val="nil"/>
+          <w:left w:val="nil"/>
+          <w:bottom w:val="nil"/>
+          <w:right w:val="nil"/>
+          <w:between w:val="nil"/>
+        </w:pBdr>
+        <w:spacing w:before="240" w:after="240" w:line="360" w:lineRule="auto"/>
+        <w:jc w:val="both"/>
+        <w:rPr>
+          <w:rFonts w:ascii="Calibri" w:hAnsi="Calibri" w:cs="Calibri"/>
+        </w:rPr>
+      </w:pPr>
+      <w:r>
+        <w:rPr>
+          <w:rFonts w:ascii="Calibri" w:hAnsi="Calibri" w:cs="Calibri"/>
+        </w:rPr>
+        <w:br w:type="page"/>
+      </w:r>
+    </w:p>
+    <w:p>
+      <w:pPr>
+        <w:pBdr>
+          <w:top w:val="nil"/>
+          <w:left w:val="nil"/>
+          <w:bottom w:val="nil"/>
+          <w:right w:val="nil"/>
+          <w:between w:val="nil"/>
+        </w:pBdr>
+        <w:jc w:val="both"/>
+        <w:rPr>
+          <w:rFonts w:ascii="Calibri" w:hAnsi="Calibri" w:cs="Calibri"/>
+        </w:rPr>
+      </w:pPr>
+      <w:bookmarkStart w:id="7" w:name="_y0pa65pm7hu" w:colFirst="0" w:colLast="0"/>
+      <w:bookmarkEnd w:id="7"/>
+    </w:p>
+    <w:p>
+      <w:pPr>
+        <w:pStyle w:val="CabealhodoSumrio"/>
+        <w:spacing w:before="0" w:after="200" w:line="276" w:lineRule="auto"/>
+        <w:rPr>
+          <w:rFonts w:ascii="Calibri" w:hAnsi="Calibri" w:cs="Calibri"/>
+          <w:b/>
+          <w:bCs/>
+          <w:color w:val="334682"/>
+          <w:sz w:val="42"/>
+          <w:szCs w:val="42"/>
+        </w:rPr>
+      </w:pPr>
+      <w:r>
+        <w:rPr>
+          <w:rFonts w:ascii="Calibri" w:hAnsi="Calibri" w:cs="Calibri"/>
+          <w:b/>
+          <w:bCs/>
+          <w:color w:val="334682"/>
+          <w:sz w:val="42"/>
+          <w:szCs w:val="42"/>
+        </w:rPr>
+        <w:t>Sumário</w:t>
+      </w:r>
+    </w:p>
+    <w:p>
+      <w:pPr>
+        <w:rPr>
+          <w:rFonts w:ascii="Calibri" w:hAnsi="Calibri" w:cs="Calibri"/>
+        </w:rPr>
+      </w:pPr>
+    </w:p>
+    <w:p>
+      <w:pPr>
+        <w:rPr>
+          <w:rFonts w:ascii="Calibri" w:hAnsi="Calibri" w:cs="Calibri"/>
+        </w:rPr>
+      </w:pPr>
+    </w:p>
+    <w:p>
+      <w:pPr>
+        <w:rPr>
+          <w:rFonts w:ascii="Calibri" w:hAnsi="Calibri" w:cs="Calibri"/>
+        </w:rPr>
+      </w:pPr>
+      <w:r>
+        <w:rPr>
+          <w:rFonts w:ascii="Calibri" w:hAnsi="Calibri" w:cs="Calibri"/>
+        </w:rPr>
+        <w:br w:type="page"/>
+      </w:r>
+    </w:p>
+    <w:p>
+      <w:pPr>
+        <w:rPr>
+          <w:rFonts w:ascii="Calibri" w:hAnsi="Calibri" w:cs="Calibri"/>
+        </w:rPr>
+      </w:pPr>
+      <w:bookmarkStart w:id="8" w:name="_llibfpoyq82q" w:colFirst="0" w:colLast="0"/>
+      <w:bookmarkEnd w:id="8"/>
+    </w:p>
+    <w:p>
+      <w:pPr>
+        <w:pStyle w:val="Ttulo1"/>
+        <w:rPr>
+          <w:rFonts w:ascii="Calibri" w:eastAsia="Calibri" w:hAnsi="Calibri" w:cs="Calibri"/>
+        </w:rPr>
+      </w:pPr>
+      <w:bookmarkStart w:id="9" w:name="_Toc191013032"/>
+      <w:r>
+        <w:rPr>
+          <w:rFonts w:ascii="Calibri" w:eastAsia="Calibri" w:hAnsi="Calibri" w:cs="Calibri"/>
+        </w:rPr>
+        <w:t>1 - Introdução</w:t>
+      </w:r>
+      <w:bookmarkEnd w:id="9"/>
+    </w:p>
+    <w:p>
+      <w:pPr>
+        <w:spacing w:before="240" w:after="240" w:line="360" w:lineRule="auto"/>
+        <w:jc w:val="both"/>
+        <w:rPr>
+          <w:rFonts w:ascii="Calibri" w:eastAsia="Calibri" w:hAnsi="Calibri" w:cs="Calibri"/>
+          <w:sz w:val="24"/>
+          <w:szCs w:val="24"/>
+        </w:rPr>
+      </w:pPr>
+      <w:r>
+        <w:rPr>
+          <w:rFonts w:ascii="Calibri" w:eastAsia="Calibri" w:hAnsi="Calibri" w:cs="Calibri"/>
+          <w:sz w:val="24"/>
+          <w:szCs w:val="24"/>
+        </w:rPr>
+        <w:t>Este documento tem por objetivo complementar o documento de Estratégia de Solução ES-CTNI-0534-2021.00-[NNN]-[AAAA], descrevendo a estimativa preliminar de esforço e o cronograma de distribuição de reembolso.</w:t>
+      </w:r>
+    </w:p>
+    <w:p>
+      <w:pPr>
+        <w:pStyle w:val="Ttulo1"/>
+        <w:spacing w:after="0" w:line="360" w:lineRule="auto"/>
+        <w:jc w:val="both"/>
+        <w:rPr>
+          <w:rFonts w:ascii="Calibri" w:hAnsi="Calibri" w:cs="Calibri"/>
+        </w:rPr>
+      </w:pPr>
+      <w:bookmarkStart w:id="10" w:name="_otibrhjxvmfc" w:colFirst="0" w:colLast="0"/>
+      <w:bookmarkEnd w:id="10"/>
+      <w:r>
+        <w:rPr>
+          <w:rFonts w:ascii="Calibri" w:hAnsi="Calibri" w:cs="Calibri"/>
+        </w:rPr>
+        <w:br w:type="page"/>
+      </w:r>
+    </w:p>
+    <w:p>
+      <w:pPr>
+        <w:rPr>
+          <w:rFonts w:ascii="Calibri" w:hAnsi="Calibri" w:cs="Calibri"/>
+        </w:rPr>
+      </w:pPr>
+    </w:p>
+    <w:p>
+      <w:pPr>
+        <w:pStyle w:val="Ttulo1"/>
+        <w:jc w:val="both"/>
+        <w:rPr>
+          <w:rFonts w:ascii="Calibri" w:eastAsia="Calibri" w:hAnsi="Calibri" w:cs="Calibri"/>
+        </w:rPr>
+      </w:pPr>
+      <w:bookmarkStart w:id="11" w:name="_Toc191013033"/>
+      <w:r>
+        <w:rPr>
+          <w:rFonts w:ascii="Calibri" w:eastAsia="Calibri" w:hAnsi="Calibri" w:cs="Calibri"/>
+        </w:rPr>
+        <w:t>2 - Estimativa preliminar (PF)</w:t>
+      </w:r>
+      <w:bookmarkEnd w:id="11"/>
+    </w:p>
+    <w:tbl>
+      <w:tblPr>
+        <w:tblStyle w:val="a0"/>
+        <w:tblW w:w="9615" w:type="dxa"/>
+        <w:tblInd w:w="2" w:type="dxa"/>
+        <w:tblBorders>
+          <w:top w:val="nil"/>
+          <w:left w:val="nil"/>
+          <w:bottom w:val="nil"/>
+          <w:right w:val="nil"/>
+          <w:insideH w:val="nil"/>
+          <w:insideV w:val="nil"/>
+        </w:tblBorders>
+        <w:tblLayout w:type="fixed"/>
+        <w:tblLook w:val="0600" w:firstRow="0" w:lastRow="0" w:firstColumn="0" w:lastColumn="0" w:noHBand="1" w:noVBand="1"/>
+      </w:tblPr>
+      <w:tblGrid>
+        <w:gridCol w:w="630"/>
+        <w:gridCol w:w="6870"/>
+        <w:gridCol w:w="2115"/>
+      </w:tblGrid>
+      <w:tr>
+        <w:trPr>
+          <w:trHeight w:val="680"/>
+        </w:trPr>
+        <w:tc>
+          <w:tcPr>
+            <w:tcW w:w="630" w:type="dxa"/>
+            <w:tcBorders>
+              <w:top w:val="single" w:sz="8" w:space="0" w:color="000000" w:themeColor="text1"/>
+              <w:left w:val="single" w:sz="8" w:space="0" w:color="000000" w:themeColor="text1"/>
+              <w:bottom w:val="single" w:sz="8" w:space="0" w:color="000000" w:themeColor="text1"/>
+              <w:right w:val="single" w:sz="8" w:space="0" w:color="000000" w:themeColor="text1"/>
+            </w:tcBorders>
+            <w:shd w:val="clear" w:color="auto" w:fill="FFFFFF" w:themeFill="background1"/>
+            <w:tcMar>
+              <w:top w:w="100" w:type="dxa"/>
+              <w:left w:w="100" w:type="dxa"/>
+              <w:bottom w:w="100" w:type="dxa"/>
+              <w:right w:w="100" w:type="dxa"/>
+            </w:tcMar>
+          </w:tcPr>
+          <w:p>
+            <w:pPr>
+              <w:spacing w:line="240" w:lineRule="auto"/>
+              <w:rPr>
+                <w:rFonts w:ascii="Calibri" w:eastAsia="Calibri" w:hAnsi="Calibri" w:cs="Calibri"/>
+                <w:b/>
+                <w:sz w:val="24"/>
+                <w:szCs w:val="24"/>
+              </w:rPr>
+            </w:pPr>
+          </w:p>
+        </w:tc>
+        <w:tc>
+          <w:tcPr>
+            <w:tcW w:w="6870" w:type="dxa"/>
+            <w:tcBorders>
+              <w:top w:val="single" w:sz="8" w:space="0" w:color="000000" w:themeColor="text1"/>
+              <w:left w:val="single" w:sz="8" w:space="0" w:color="000000" w:themeColor="text1"/>
+              <w:bottom w:val="single" w:sz="8" w:space="0" w:color="000000" w:themeColor="text1"/>
+              <w:right w:val="single" w:sz="8" w:space="0" w:color="000000" w:themeColor="text1"/>
+            </w:tcBorders>
+            <w:shd w:val="clear" w:color="auto" w:fill="FFFFFF" w:themeFill="background1"/>
+            <w:tcMar>
+              <w:top w:w="100" w:type="dxa"/>
+              <w:left w:w="100" w:type="dxa"/>
+              <w:bottom w:w="100" w:type="dxa"/>
+              <w:right w:w="100" w:type="dxa"/>
+            </w:tcMar>
+            <w:vAlign w:val="center"/>
+          </w:tcPr>
+          <w:p>
+            <w:pPr>
+              <w:spacing w:line="240" w:lineRule="auto"/>
+              <w:jc w:val="center"/>
+              <w:rPr>
+                <w:rFonts w:ascii="Calibri" w:eastAsia="Calibri" w:hAnsi="Calibri" w:cs="Calibri"/>
+                <w:b/>
+                <w:bCs/>
+                <w:sz w:val="24"/>
+                <w:szCs w:val="24"/>
+              </w:rPr>
+            </w:pPr>
+            <w:r>
+              <w:rPr>
+                <w:rFonts w:ascii="Calibri" w:eastAsia="Calibri" w:hAnsi="Calibri" w:cs="Calibri"/>
+                <w:b/>
+                <w:bCs/>
+                <w:sz w:val="24"/>
+                <w:szCs w:val="24"/>
+              </w:rPr>
+              <w:t>Atividade</w:t>
+            </w:r>
+          </w:p>
+        </w:tc>
+        <w:tc>
+          <w:tcPr>
+            <w:tcW w:w="2115" w:type="dxa"/>
+            <w:tcBorders>
+              <w:top w:val="single" w:sz="8" w:space="0" w:color="000000" w:themeColor="text1"/>
+              <w:left w:val="single" w:sz="8" w:space="0" w:color="000000" w:themeColor="text1"/>
+              <w:bottom w:val="single" w:sz="8" w:space="0" w:color="000000" w:themeColor="text1"/>
+              <w:right w:val="single" w:sz="8" w:space="0" w:color="000000" w:themeColor="text1"/>
+            </w:tcBorders>
+            <w:shd w:val="clear" w:color="auto" w:fill="FFFFFF" w:themeFill="background1"/>
+            <w:tcMar>
+              <w:top w:w="100" w:type="dxa"/>
+              <w:left w:w="100" w:type="dxa"/>
+              <w:bottom w:w="100" w:type="dxa"/>
+              <w:right w:w="100" w:type="dxa"/>
+            </w:tcMar>
+            <w:vAlign w:val="center"/>
+          </w:tcPr>
+          <w:p>
+            <w:pPr>
+              <w:spacing w:line="240" w:lineRule="auto"/>
+              <w:jc w:val="center"/>
+              <w:rPr>
+                <w:rFonts w:ascii="Calibri" w:eastAsia="Calibri" w:hAnsi="Calibri" w:cs="Calibri"/>
+                <w:b/>
+                <w:sz w:val="24"/>
+                <w:szCs w:val="24"/>
+              </w:rPr>
+            </w:pPr>
+            <w:r>
+              <w:rPr>
+                <w:rFonts w:ascii="Calibri" w:eastAsia="Calibri" w:hAnsi="Calibri" w:cs="Calibri"/>
+                <w:b/>
+                <w:sz w:val="24"/>
+                <w:szCs w:val="24"/>
+              </w:rPr>
+              <w:t>PF</w:t>
+            </w:r>
+          </w:p>
+        </w:tc>
+      </w:tr>
+      <w:tr>
+        <w:trPr>
+          <w:trHeight w:val="500"/>
+        </w:trPr>
+        <w:tc>
+          <w:tcPr>
+            <w:tcW w:w="630" w:type="dxa"/>
+            <w:tcBorders>
+              <w:top w:val="nil"/>
+              <w:left w:val="single" w:sz="8" w:space="0" w:color="000000" w:themeColor="text1"/>
+              <w:bottom w:val="single" w:sz="8" w:space="0" w:color="000000" w:themeColor="text1"/>
+              <w:right w:val="single" w:sz="8" w:space="0" w:color="000000" w:themeColor="text1"/>
+            </w:tcBorders>
+            <w:tcMar>
+              <w:top w:w="100" w:type="dxa"/>
+              <w:left w:w="100" w:type="dxa"/>
+              <w:bottom w:w="100" w:type="dxa"/>
+              <w:right w:w="100" w:type="dxa"/>
+            </w:tcMar>
+            <w:vAlign w:val="center"/>
+          </w:tcPr>
+          <w:p>
+            <w:pPr>
+              <w:spacing w:line="240" w:lineRule="auto"/>
+              <w:jc w:val="center"/>
+              <w:rPr>
+                <w:rFonts w:ascii="Calibri" w:eastAsia="Calibri" w:hAnsi="Calibri" w:cs="Calibri"/>
+                <w:sz w:val="24"/>
+                <w:szCs w:val="24"/>
+                <w:highlight w:val="white"/>
+              </w:rPr>
+            </w:pPr>
+            <w:r>
+              <w:rPr>
+                <w:rFonts w:ascii="Calibri" w:eastAsia="Calibri" w:hAnsi="Calibri" w:cs="Calibri"/>
+                <w:sz w:val="24"/>
+                <w:szCs w:val="24"/>
+                <w:highlight w:val="white"/>
+              </w:rPr>
+              <w:t>1</w:t>
+            </w:r>
+          </w:p>
+        </w:tc>
+        <w:tc>
+          <w:tcPr>
+            <w:tcW w:w="6870" w:type="dxa"/>
+            <w:tcBorders>
+              <w:top w:val="nil"/>
+              <w:left w:val="single" w:sz="8" w:space="0" w:color="000000" w:themeColor="text1"/>
+              <w:bottom w:val="single" w:sz="8" w:space="0" w:color="000000" w:themeColor="text1"/>
+              <w:right w:val="single" w:sz="8" w:space="0" w:color="000000" w:themeColor="text1"/>
+            </w:tcBorders>
+            <w:tcMar>
+              <w:top w:w="100" w:type="dxa"/>
+              <w:left w:w="100" w:type="dxa"/>
+              <w:bottom w:w="100" w:type="dxa"/>
+              <w:right w:w="100" w:type="dxa"/>
+            </w:tcMar>
+            <w:vAlign w:val="center"/>
+          </w:tcPr>
+          <w:p>
+            <w:pPr>
+              <w:spacing w:line="240" w:lineRule="auto"/>
+              <w:rPr>
+                <w:rFonts w:ascii="Calibri" w:eastAsia="Calibri" w:hAnsi="Calibri" w:cs="Calibri"/>
+                <w:sz w:val="24"/>
+                <w:szCs w:val="24"/>
+              </w:rPr>
+            </w:pPr>
+            <w:r>
+              <w:rPr>
+                <w:rFonts w:ascii="Calibri" w:eastAsia="Calibri" w:hAnsi="Calibri" w:cs="Calibri"/>
+                <w:sz w:val="24"/>
+                <w:szCs w:val="24"/>
+              </w:rPr>
+              <w:t>[</w:t>
+            </w:r>
+            <w:proofErr w:type="gramStart"/>
+            <w:r>
+              <w:rPr>
+                <w:rFonts w:ascii="Calibri" w:eastAsia="Calibri" w:hAnsi="Calibri" w:cs="Calibri"/>
+                <w:sz w:val="24"/>
+                <w:szCs w:val="24"/>
+              </w:rPr>
+              <w:t>TITULO</w:t>
+            </w:r>
+            <w:proofErr w:type="gramEnd"/>
+            <w:r>
+              <w:rPr>
+                <w:rFonts w:ascii="Calibri" w:eastAsia="Calibri" w:hAnsi="Calibri" w:cs="Calibri"/>
+                <w:sz w:val="24"/>
+                <w:szCs w:val="24"/>
+              </w:rPr>
+              <w:t>]</w:t>
+            </w:r>
+          </w:p>
+        </w:tc>
+        <w:tc>
+          <w:tcPr>
+            <w:tcW w:w="2115" w:type="dxa"/>
+            <w:tcBorders>
+              <w:top w:val="nil"/>
+              <w:left w:val="single" w:sz="8" w:space="0" w:color="000000" w:themeColor="text1"/>
+              <w:bottom w:val="single" w:sz="8" w:space="0" w:color="000000" w:themeColor="text1"/>
+              <w:right w:val="single" w:sz="8" w:space="0" w:color="000000" w:themeColor="text1"/>
+            </w:tcBorders>
+            <w:tcMar>
+              <w:top w:w="100" w:type="dxa"/>
+              <w:left w:w="100" w:type="dxa"/>
+              <w:bottom w:w="100" w:type="dxa"/>
+              <w:right w:w="100" w:type="dxa"/>
+            </w:tcMar>
+            <w:vAlign w:val="center"/>
+          </w:tcPr>
+          <w:p>
+            <w:pPr>
+              <w:spacing w:line="240" w:lineRule="auto"/>
+              <w:jc w:val="center"/>
+              <w:rPr>
+                <w:rFonts w:ascii="Calibri" w:eastAsia="Calibri" w:hAnsi="Calibri" w:cs="Calibri"/>
+                <w:sz w:val="24"/>
+                <w:szCs w:val="24"/>
+              </w:rPr>
+            </w:pPr>
+            <w:r>
+              <w:rPr>
+                <w:rFonts w:ascii="Calibri" w:eastAsia="Calibri" w:hAnsi="Calibri" w:cs="Calibri"/>
+                <w:sz w:val="24"/>
+                <w:szCs w:val="24"/>
+              </w:rPr>
+              <w:t>[N_PF]</w:t>
+            </w:r>
+          </w:p>
+        </w:tc>
+      </w:tr>
+      <w:tr>
+        <w:trPr>
+          <w:trHeight w:val="500"/>
+        </w:trPr>
+        <w:tc>
+          <w:tcPr>
+            <w:tcW w:w="630" w:type="dxa"/>
+            <w:tcBorders>
+              <w:top w:val="nil"/>
+              <w:left w:val="single" w:sz="8" w:space="0" w:color="000000" w:themeColor="text1"/>
+              <w:bottom w:val="single" w:sz="8" w:space="0" w:color="000000" w:themeColor="text1"/>
+              <w:right w:val="single" w:sz="8" w:space="0" w:color="000000" w:themeColor="text1"/>
+            </w:tcBorders>
+            <w:tcMar>
+              <w:top w:w="100" w:type="dxa"/>
+              <w:left w:w="100" w:type="dxa"/>
+              <w:bottom w:w="100" w:type="dxa"/>
+              <w:right w:w="100" w:type="dxa"/>
+            </w:tcMar>
+            <w:vAlign w:val="center"/>
+          </w:tcPr>
+          <w:p>
+            <w:pPr>
+              <w:spacing w:line="240" w:lineRule="auto"/>
+              <w:jc w:val="center"/>
+              <w:rPr>
+                <w:rFonts w:ascii="Calibri" w:eastAsia="Calibri" w:hAnsi="Calibri" w:cs="Calibri"/>
+                <w:sz w:val="24"/>
+                <w:szCs w:val="24"/>
+                <w:highlight w:val="white"/>
+              </w:rPr>
+            </w:pPr>
+          </w:p>
+        </w:tc>
+        <w:tc>
+          <w:tcPr>
+            <w:tcW w:w="6870" w:type="dxa"/>
+            <w:tcBorders>
+              <w:top w:val="nil"/>
+              <w:left w:val="single" w:sz="8" w:space="0" w:color="000000" w:themeColor="text1"/>
+              <w:bottom w:val="single" w:sz="8" w:space="0" w:color="000000" w:themeColor="text1"/>
+              <w:right w:val="single" w:sz="8" w:space="0" w:color="000000" w:themeColor="text1"/>
+            </w:tcBorders>
+            <w:tcMar>
+              <w:top w:w="100" w:type="dxa"/>
+              <w:left w:w="100" w:type="dxa"/>
+              <w:bottom w:w="100" w:type="dxa"/>
+              <w:right w:w="100" w:type="dxa"/>
+            </w:tcMar>
+            <w:vAlign w:val="center"/>
+          </w:tcPr>
+          <w:p>
+            <w:pPr>
+              <w:spacing w:line="240" w:lineRule="auto"/>
+              <w:jc w:val="center"/>
+              <w:rPr>
+                <w:rFonts w:ascii="Calibri" w:eastAsia="Calibri" w:hAnsi="Calibri" w:cs="Calibri"/>
+                <w:b/>
+                <w:sz w:val="24"/>
+                <w:szCs w:val="24"/>
+                <w:highlight w:val="white"/>
+              </w:rPr>
+            </w:pPr>
+            <w:r>
+              <w:rPr>
+                <w:rFonts w:ascii="Calibri" w:eastAsia="Calibri" w:hAnsi="Calibri" w:cs="Calibri"/>
+                <w:b/>
+                <w:sz w:val="24"/>
+                <w:szCs w:val="24"/>
+                <w:highlight w:val="white"/>
+              </w:rPr>
+              <w:t>Total</w:t>
+            </w:r>
+          </w:p>
+        </w:tc>
+        <w:tc>
+          <w:tcPr>
+            <w:tcW w:w="2115" w:type="dxa"/>
+            <w:tcBorders>
+              <w:top w:val="nil"/>
+              <w:left w:val="single" w:sz="8" w:space="0" w:color="000000" w:themeColor="text1"/>
+              <w:bottom w:val="single" w:sz="8" w:space="0" w:color="000000" w:themeColor="text1"/>
+              <w:right w:val="single" w:sz="8" w:space="0" w:color="000000" w:themeColor="text1"/>
+            </w:tcBorders>
+            <w:tcMar>
+              <w:top w:w="100" w:type="dxa"/>
+              <w:left w:w="100" w:type="dxa"/>
+              <w:bottom w:w="100" w:type="dxa"/>
+              <w:right w:w="100" w:type="dxa"/>
+            </w:tcMar>
+            <w:vAlign w:val="center"/>
+          </w:tcPr>
+          <w:p>
+            <w:pPr>
+              <w:spacing w:line="240" w:lineRule="auto"/>
+              <w:jc w:val="center"/>
+              <w:rPr>
+                <w:rFonts w:ascii="Calibri" w:eastAsia="Calibri" w:hAnsi="Calibri" w:cs="Calibri"/>
+                <w:b/>
+                <w:bCs/>
+                <w:sz w:val="24"/>
+                <w:szCs w:val="24"/>
+              </w:rPr>
+            </w:pPr>
+            <w:r>
+              <w:rPr>
+                <w:rFonts w:ascii="Calibri" w:eastAsia="Calibri" w:hAnsi="Calibri" w:cs="Calibri"/>
+                <w:b/>
+                <w:bCs/>
+                <w:sz w:val="24"/>
+                <w:szCs w:val="24"/>
+              </w:rPr>
+              <w:t>[N_PF]</w:t>
+            </w:r>
+          </w:p>
+        </w:tc>
+      </w:tr>
+    </w:tbl>
+    <w:p>
+      <w:pPr>
+        <w:spacing w:before="240" w:after="240" w:line="360" w:lineRule="auto"/>
+        <w:jc w:val="center"/>
+        <w:rPr>
+          <w:rFonts w:ascii="Calibri" w:eastAsia="Calibri" w:hAnsi="Calibri" w:cs="Calibri"/>
+        </w:rPr>
+      </w:pPr>
+      <w:r>
+        <w:rPr>
+          <w:rFonts w:ascii="Calibri" w:eastAsia="Calibri" w:hAnsi="Calibri" w:cs="Calibri"/>
+        </w:rPr>
+        <w:t>Tabela 1 – Estimativa de pontos de função.</w:t>
+      </w:r>
+    </w:p>
+    <w:p>
+      <w:pPr>
+        <w:pStyle w:val="Ttulo1"/>
+        <w:spacing w:before="240" w:after="240" w:line="360" w:lineRule="auto"/>
+        <w:jc w:val="both"/>
+      </w:pPr>
+      <w:bookmarkStart w:id="12" w:name="_oh0zdv6if8xp" w:colFirst="0" w:colLast="0"/>
+      <w:bookmarkEnd w:id="12"/>
+      <w:r>
+        <w:br w:type="page"/>
+      </w:r>
+    </w:p>
+    <w:p>
+      <w:pPr>
+        <w:rPr>
+          <w:rFonts w:ascii="Calibri" w:eastAsia="Calibri" w:hAnsi="Calibri" w:cs="Calibri"/>
+        </w:rPr>
+      </w:pPr>
+      <w:bookmarkStart w:id="13" w:name="_9uqw0j7fcvq1" w:colFirst="0" w:colLast="0"/>
+      <w:bookmarkEnd w:id="13"/>
+    </w:p>
+    <w:p>
+      <w:pPr>
+        <w:pStyle w:val="Ttulo1"/>
+        <w:jc w:val="both"/>
+        <w:rPr>
+          <w:rFonts w:ascii="Calibri" w:eastAsia="Calibri" w:hAnsi="Calibri" w:cs="Calibri"/>
+        </w:rPr>
+      </w:pPr>
+      <w:bookmarkStart w:id="14" w:name="_Toc191013034"/>
+      <w:r>
+        <w:rPr>
+          <w:rFonts w:ascii="Calibri" w:eastAsia="Calibri" w:hAnsi="Calibri" w:cs="Calibri"/>
+        </w:rPr>
+        <w:t>3 - Cronograma de distribuição de desembolso</w:t>
+      </w:r>
+      <w:bookmarkEnd w:id="14"/>
+    </w:p>
+    <w:p>
+      <w:pPr>
+        <w:spacing w:before="240" w:after="240" w:line="360" w:lineRule="auto"/>
+        <w:jc w:val="both"/>
+        <w:rPr>
+          <w:rFonts w:ascii="Calibri" w:eastAsia="Calibri" w:hAnsi="Calibri" w:cs="Calibri"/>
+          <w:sz w:val="24"/>
+          <w:szCs w:val="24"/>
+        </w:rPr>
+      </w:pPr>
+      <w:r>
+        <w:rPr>
+          <w:rFonts w:ascii="Calibri" w:eastAsia="Calibri" w:hAnsi="Calibri" w:cs="Calibri"/>
+          <w:sz w:val="24"/>
+          <w:szCs w:val="24"/>
+        </w:rPr>
+        <w:t xml:space="preserve">Na Tabela </w:t>
+      </w:r>
+      <w:r>
+        <w:rPr>
+          <w:rFonts w:ascii="Calibri" w:eastAsia="Calibri" w:hAnsi="Calibri" w:cs="Calibri"/>
+          <w:sz w:val="24"/>
+          <w:szCs w:val="24"/>
+        </w:rPr>
+        <w:t>2</w:t>
+      </w:r>
+      <w:r>
+        <w:rPr>
+          <w:rFonts w:ascii="Calibri" w:eastAsia="Calibri" w:hAnsi="Calibri" w:cs="Calibri"/>
+          <w:sz w:val="24"/>
+          <w:szCs w:val="24"/>
+        </w:rPr>
+        <w:t xml:space="preserve"> estão as autorizações de serviço necessárias para execução da solicitação de serviço SS-CTNI-0534-2021.00-</w:t>
+      </w:r>
+      <w:r>
+        <w:rPr>
+          <w:rFonts w:ascii="Calibri" w:eastAsia="Calibri" w:hAnsi="Calibri" w:cs="Calibri"/>
+          <w:sz w:val="24"/>
+          <w:szCs w:val="24"/>
+        </w:rPr>
+        <w:t>[NNN]</w:t>
+      </w:r>
+      <w:r>
+        <w:rPr>
+          <w:rFonts w:ascii="Calibri" w:eastAsia="Calibri" w:hAnsi="Calibri" w:cs="Calibri"/>
+          <w:sz w:val="24"/>
+          <w:szCs w:val="24"/>
+        </w:rPr>
+        <w:t>-</w:t>
+      </w:r>
+      <w:r>
+        <w:rPr>
+          <w:rFonts w:ascii="Calibri" w:eastAsia="Calibri" w:hAnsi="Calibri" w:cs="Calibri"/>
+          <w:sz w:val="24"/>
+          <w:szCs w:val="24"/>
+        </w:rPr>
+        <w:t>[AAAA]</w:t>
+      </w:r>
+      <w:r>
+        <w:rPr>
+          <w:rFonts w:ascii="Calibri" w:eastAsia="Calibri" w:hAnsi="Calibri" w:cs="Calibri"/>
+          <w:sz w:val="24"/>
+          <w:szCs w:val="24"/>
+        </w:rPr>
+        <w:t>.</w:t>
+      </w:r>
+    </w:p>
+    <w:tbl>
+      <w:tblPr>
+        <w:tblStyle w:val="a1"/>
+        <w:tblW w:w="9450" w:type="dxa"/>
+        <w:tblInd w:w="2" w:type="dxa"/>
+        <w:tblBorders>
+          <w:top w:val="nil"/>
+          <w:left w:val="nil"/>
+          <w:bottom w:val="nil"/>
+          <w:right w:val="nil"/>
+          <w:insideH w:val="nil"/>
+          <w:insideV w:val="nil"/>
+        </w:tblBorders>
+        <w:tblLayout w:type="fixed"/>
+        <w:tblLook w:val="0600" w:firstRow="0" w:lastRow="0" w:firstColumn="0" w:lastColumn="0" w:noHBand="1" w:noVBand="1"/>
+      </w:tblPr>
+      <w:tblGrid>
+        <w:gridCol w:w="2385"/>
+        <w:gridCol w:w="4380"/>
+        <w:gridCol w:w="2685"/>
+      </w:tblGrid>
+      <w:tr>
+        <w:trPr>
+          <w:trHeight w:val="480"/>
+        </w:trPr>
+        <w:tc>
+          <w:tcPr>
+            <w:tcW w:w="2385" w:type="dxa"/>
+            <w:tcBorders>
+              <w:top w:val="single" w:sz="8" w:space="0" w:color="000000" w:themeColor="text1"/>
+              <w:left w:val="single" w:sz="8" w:space="0" w:color="000000" w:themeColor="text1"/>
+              <w:bottom w:val="single" w:sz="8" w:space="0" w:color="000000" w:themeColor="text1"/>
+              <w:right w:val="single" w:sz="8" w:space="0" w:color="000000" w:themeColor="text1"/>
+            </w:tcBorders>
+            <w:tcMar>
+              <w:top w:w="100" w:type="dxa"/>
+              <w:left w:w="100" w:type="dxa"/>
+              <w:bottom w:w="100" w:type="dxa"/>
+              <w:right w:w="100" w:type="dxa"/>
+            </w:tcMar>
+          </w:tcPr>
+          <w:p>
+            <w:pPr>
+              <w:spacing w:before="240" w:after="240" w:line="240" w:lineRule="auto"/>
+              <w:jc w:val="center"/>
+              <w:rPr>
+                <w:rFonts w:ascii="Calibri" w:eastAsia="Calibri" w:hAnsi="Calibri" w:cs="Calibri"/>
+                <w:b/>
+                <w:sz w:val="24"/>
+                <w:szCs w:val="24"/>
+              </w:rPr>
+            </w:pPr>
+            <w:r>
+              <w:rPr>
+                <w:rFonts w:ascii="Calibri" w:eastAsia="Calibri" w:hAnsi="Calibri" w:cs="Calibri"/>
+                <w:b/>
+                <w:sz w:val="24"/>
+                <w:szCs w:val="24"/>
+              </w:rPr>
+              <w:t>Autorização</w:t>
+            </w:r>
+          </w:p>
+        </w:tc>
+        <w:tc>
+          <w:tcPr>
+            <w:tcW w:w="4380" w:type="dxa"/>
+            <w:tcBorders>
+              <w:top w:val="single" w:sz="8" w:space="0" w:color="000000" w:themeColor="text1"/>
+              <w:left w:val="nil"/>
+              <w:bottom w:val="single" w:sz="8" w:space="0" w:color="000000" w:themeColor="text1"/>
+              <w:right w:val="single" w:sz="8" w:space="0" w:color="000000" w:themeColor="text1"/>
+            </w:tcBorders>
+            <w:tcMar>
+              <w:top w:w="100" w:type="dxa"/>
+              <w:left w:w="100" w:type="dxa"/>
+              <w:bottom w:w="100" w:type="dxa"/>
+              <w:right w:w="100" w:type="dxa"/>
+            </w:tcMar>
+          </w:tcPr>
+          <w:p>
+            <w:pPr>
+              <w:spacing w:before="240" w:after="240" w:line="240" w:lineRule="auto"/>
+              <w:jc w:val="center"/>
+              <w:rPr>
+                <w:rFonts w:ascii="Calibri" w:eastAsia="Calibri" w:hAnsi="Calibri" w:cs="Calibri"/>
+                <w:b/>
+                <w:sz w:val="24"/>
+                <w:szCs w:val="24"/>
+              </w:rPr>
+            </w:pPr>
+            <w:r>
+              <w:rPr>
+                <w:rFonts w:ascii="Calibri" w:eastAsia="Calibri" w:hAnsi="Calibri" w:cs="Calibri"/>
+                <w:b/>
+                <w:sz w:val="24"/>
+                <w:szCs w:val="24"/>
+              </w:rPr>
+              <w:t>Descrição</w:t>
+            </w:r>
+          </w:p>
+        </w:tc>
+        <w:tc>
+          <w:tcPr>
+            <w:tcW w:w="2685" w:type="dxa"/>
+            <w:tcBorders>
+              <w:top w:val="single" w:sz="8" w:space="0" w:color="000000" w:themeColor="text1"/>
+              <w:left w:val="nil"/>
+              <w:bottom w:val="single" w:sz="8" w:space="0" w:color="000000" w:themeColor="text1"/>
+              <w:right w:val="single" w:sz="8" w:space="0" w:color="000000" w:themeColor="text1"/>
+            </w:tcBorders>
+            <w:tcMar>
+              <w:top w:w="100" w:type="dxa"/>
+              <w:left w:w="100" w:type="dxa"/>
+              <w:bottom w:w="100" w:type="dxa"/>
+              <w:right w:w="100" w:type="dxa"/>
+            </w:tcMar>
+          </w:tcPr>
+          <w:p>
+            <w:pPr>
+              <w:spacing w:before="240" w:after="240" w:line="240" w:lineRule="auto"/>
+              <w:jc w:val="center"/>
+              <w:rPr>
+                <w:rFonts w:ascii="Calibri" w:eastAsia="Calibri" w:hAnsi="Calibri" w:cs="Calibri"/>
+                <w:b/>
+                <w:sz w:val="24"/>
+                <w:szCs w:val="24"/>
+              </w:rPr>
+            </w:pPr>
+            <w:r>
+              <w:rPr>
+                <w:rFonts w:ascii="Calibri" w:eastAsia="Calibri" w:hAnsi="Calibri" w:cs="Calibri"/>
+                <w:b/>
+                <w:sz w:val="24"/>
+                <w:szCs w:val="24"/>
+              </w:rPr>
+              <w:t>Quantidade PF</w:t>
+            </w:r>
+          </w:p>
+        </w:tc>
+      </w:tr>
+      <w:tr>
+        <w:trPr>
+          <w:trHeight w:val="740"/>
+        </w:trPr>
+        <w:tc>
+          <w:tcPr>
+            <w:tcW w:w="2385" w:type="dxa"/>
+            <w:tcBorders>
+              <w:top w:val="nil"/>
+              <w:left w:val="single" w:sz="8" w:space="0" w:color="000000" w:themeColor="text1"/>
+              <w:bottom w:val="single" w:sz="8" w:space="0" w:color="000000" w:themeColor="text1"/>
+              <w:right w:val="single" w:sz="8" w:space="0" w:color="000000" w:themeColor="text1"/>
+            </w:tcBorders>
+            <w:tcMar>
+              <w:top w:w="100" w:type="dxa"/>
+              <w:left w:w="100" w:type="dxa"/>
+              <w:bottom w:w="100" w:type="dxa"/>
+              <w:right w:w="100" w:type="dxa"/>
+            </w:tcMar>
+          </w:tcPr>
+          <w:p>
+            <w:pPr>
+              <w:spacing w:before="240" w:after="240" w:line="240" w:lineRule="auto"/>
+              <w:jc w:val="center"/>
+              <w:rPr>
+                <w:rFonts w:ascii="Calibri" w:eastAsia="Calibri" w:hAnsi="Calibri" w:cs="Calibri"/>
+                <w:sz w:val="24"/>
+                <w:szCs w:val="24"/>
+                <w:highlight w:val="white"/>
+              </w:rPr>
+            </w:pPr>
+            <w:r>
+              <w:rPr>
+                <w:rFonts w:ascii="Calibri" w:eastAsia="Calibri" w:hAnsi="Calibri" w:cs="Calibri"/>
+                <w:sz w:val="24"/>
+                <w:szCs w:val="24"/>
+                <w:highlight w:val="white"/>
+              </w:rPr>
+              <w:t xml:space="preserve">Autorização </w:t>
+            </w:r>
+            <w:r>
+              <w:rPr>
+                <w:rFonts w:ascii="Calibri" w:eastAsia="Calibri" w:hAnsi="Calibri" w:cs="Calibri"/>
+                <w:sz w:val="24"/>
+                <w:szCs w:val="24"/>
+                <w:highlight w:val="white"/>
+              </w:rPr>
+              <w:t>[NNN]</w:t>
+            </w:r>
+          </w:p>
+        </w:tc>
+        <w:tc>
+          <w:tcPr>
+            <w:tcW w:w="4380" w:type="dxa"/>
+            <w:tcBorders>
+              <w:top w:val="nil"/>
+              <w:left w:val="nil"/>
+              <w:bottom w:val="single" w:sz="8" w:space="0" w:color="000000" w:themeColor="text1"/>
+              <w:right w:val="single" w:sz="8" w:space="0" w:color="000000" w:themeColor="text1"/>
+            </w:tcBorders>
+            <w:tcMar>
+              <w:top w:w="100" w:type="dxa"/>
+              <w:left w:w="100" w:type="dxa"/>
+              <w:bottom w:w="100" w:type="dxa"/>
+              <w:right w:w="100" w:type="dxa"/>
+            </w:tcMar>
+          </w:tcPr>
+          <w:p>
+            <w:pPr>
+              <w:spacing w:line="240" w:lineRule="auto"/>
+              <w:jc w:val="center"/>
+              <w:rPr>
+                <w:rFonts w:ascii="Calibri" w:eastAsia="Calibri" w:hAnsi="Calibri" w:cs="Calibri"/>
+                <w:sz w:val="24"/>
+                <w:szCs w:val="24"/>
+                <w:highlight w:val="white"/>
+              </w:rPr>
+            </w:pPr>
+            <w:r>
+              <w:rPr>
+                <w:rFonts w:ascii="Calibri" w:eastAsia="Calibri" w:hAnsi="Calibri" w:cs="Calibri"/>
+                <w:sz w:val="24"/>
+                <w:szCs w:val="24"/>
+                <w:highlight w:val="white"/>
+              </w:rPr>
+              <w:t>[</w:t>
+            </w:r>
+            <w:proofErr w:type="gramStart"/>
+            <w:r>
+              <w:rPr>
+                <w:rFonts w:ascii="Calibri" w:eastAsia="Calibri" w:hAnsi="Calibri" w:cs="Calibri"/>
+                <w:sz w:val="24"/>
+                <w:szCs w:val="24"/>
+                <w:highlight w:val="white"/>
+              </w:rPr>
+              <w:t>TITULO</w:t>
+            </w:r>
+            <w:proofErr w:type="gramEnd"/>
+            <w:r>
+              <w:rPr>
+                <w:rFonts w:ascii="Calibri" w:eastAsia="Calibri" w:hAnsi="Calibri" w:cs="Calibri"/>
+                <w:sz w:val="24"/>
+                <w:szCs w:val="24"/>
+                <w:highlight w:val="white"/>
+              </w:rPr>
+              <w:t>]</w:t>
+            </w:r>
+          </w:p>
+        </w:tc>
+        <w:tc>
+          <w:tcPr>
+            <w:tcW w:w="2685" w:type="dxa"/>
+            <w:tcBorders>
+              <w:top w:val="nil"/>
+              <w:left w:val="single" w:sz="8" w:space="0" w:color="000000" w:themeColor="text1"/>
+              <w:bottom w:val="single" w:sz="8" w:space="0" w:color="000000" w:themeColor="text1"/>
+              <w:right w:val="single" w:sz="8" w:space="0" w:color="000000" w:themeColor="text1"/>
+            </w:tcBorders>
+            <w:tcMar>
+              <w:top w:w="100" w:type="dxa"/>
+              <w:left w:w="100" w:type="dxa"/>
+              <w:bottom w:w="100" w:type="dxa"/>
+              <w:right w:w="100" w:type="dxa"/>
+            </w:tcMar>
+          </w:tcPr>
+          <w:p>
+            <w:pPr>
+              <w:spacing w:line="240" w:lineRule="auto"/>
+              <w:jc w:val="center"/>
+              <w:rPr>
+                <w:rFonts w:ascii="Calibri" w:eastAsia="Calibri" w:hAnsi="Calibri" w:cs="Calibri"/>
+                <w:b/>
+                <w:bCs/>
+                <w:sz w:val="24"/>
+                <w:szCs w:val="24"/>
+              </w:rPr>
+            </w:pPr>
+            <w:r>
+              <w:rPr>
+                <w:rFonts w:ascii="Calibri" w:eastAsia="Calibri" w:hAnsi="Calibri" w:cs="Calibri"/>
+                <w:b/>
+                <w:bCs/>
+                <w:sz w:val="24"/>
+                <w:szCs w:val="24"/>
+              </w:rPr>
+              <w:t>[N_PF]</w:t>
+            </w:r>
+          </w:p>
+        </w:tc>
+      </w:tr>
+    </w:tbl>
+    <w:p>
+      <w:pPr>
+        <w:spacing w:before="240" w:after="240" w:line="240" w:lineRule="auto"/>
+        <w:jc w:val="center"/>
+        <w:rPr>
+          <w:rFonts w:ascii="Calibri" w:eastAsia="Calibri" w:hAnsi="Calibri" w:cs="Calibri"/>
+        </w:rPr>
+      </w:pPr>
+      <w:r>
+        <w:rPr>
+          <w:rFonts w:ascii="Calibri" w:eastAsia="Calibri" w:hAnsi="Calibri" w:cs="Calibri"/>
+        </w:rPr>
+        <w:t xml:space="preserve">Tabela </w:t>
+      </w:r>
+      <w:r>
+        <w:rPr>
+          <w:rFonts w:ascii="Calibri" w:eastAsia="Calibri" w:hAnsi="Calibri" w:cs="Calibri"/>
+        </w:rPr>
+        <w:t>2</w:t>
+      </w:r>
+      <w:r>
+        <w:rPr>
+          <w:rFonts w:ascii="Calibri" w:eastAsia="Calibri" w:hAnsi="Calibri" w:cs="Calibri"/>
+        </w:rPr>
+        <w:t xml:space="preserve"> - Autorizações de serviço necessárias. </w:t>
+      </w:r>
+    </w:p>
+    <w:tbl>
+      <w:tblPr>
+        <w:tblStyle w:val="a2"/>
+        <w:tblW w:w="9465" w:type="dxa"/>
+        <w:tblInd w:w="2" w:type="dxa"/>
+        <w:tblBorders>
+          <w:top w:val="nil"/>
+          <w:left w:val="nil"/>
+          <w:bottom w:val="nil"/>
+          <w:right w:val="nil"/>
+          <w:insideH w:val="nil"/>
+          <w:insideV w:val="nil"/>
+        </w:tblBorders>
+        <w:tblLayout w:type="fixed"/>
+        <w:tblLook w:val="0600" w:firstRow="0" w:lastRow="0" w:firstColumn="0" w:lastColumn="0" w:noHBand="1" w:noVBand="1"/>
+      </w:tblPr>
+      <w:tblGrid>
+        <w:gridCol w:w="2400"/>
+        <w:gridCol w:w="4305"/>
+        <w:gridCol w:w="2760"/>
+      </w:tblGrid>
+      <w:tr>
+        <w:trPr>
+          <w:trHeight w:val="660"/>
+        </w:trPr>
+        <w:tc>
+          <w:tcPr>
+            <w:tcW w:w="2400" w:type="dxa"/>
+            <w:tcBorders>
+              <w:top w:val="single" w:sz="8" w:space="0" w:color="000000" w:themeColor="text1"/>
+              <w:left w:val="single" w:sz="8" w:space="0" w:color="000000" w:themeColor="text1"/>
+              <w:bottom w:val="single" w:sz="8" w:space="0" w:color="000000" w:themeColor="text1"/>
+              <w:right w:val="single" w:sz="8" w:space="0" w:color="000000" w:themeColor="text1"/>
+            </w:tcBorders>
+            <w:tcMar>
+              <w:top w:w="100" w:type="dxa"/>
+              <w:left w:w="100" w:type="dxa"/>
+              <w:bottom w:w="100" w:type="dxa"/>
+              <w:right w:w="100" w:type="dxa"/>
+            </w:tcMar>
+          </w:tcPr>
+          <w:p>
+            <w:pPr>
+              <w:spacing w:before="240" w:after="240" w:line="240" w:lineRule="auto"/>
+              <w:jc w:val="center"/>
+              <w:rPr>
+                <w:rFonts w:ascii="Calibri" w:eastAsia="Calibri" w:hAnsi="Calibri" w:cs="Calibri"/>
+                <w:b/>
+                <w:sz w:val="24"/>
+                <w:szCs w:val="24"/>
+              </w:rPr>
+            </w:pPr>
+            <w:r>
+              <w:rPr>
+                <w:rFonts w:ascii="Calibri" w:eastAsia="Calibri" w:hAnsi="Calibri" w:cs="Calibri"/>
+                <w:b/>
+                <w:sz w:val="24"/>
+                <w:szCs w:val="24"/>
+              </w:rPr>
+              <w:t>Fase</w:t>
+            </w:r>
+          </w:p>
+        </w:tc>
+        <w:tc>
+          <w:tcPr>
+            <w:tcW w:w="4305" w:type="dxa"/>
+            <w:tcBorders>
+              <w:top w:val="single" w:sz="8" w:space="0" w:color="000000" w:themeColor="text1"/>
+              <w:left w:val="nil"/>
+              <w:bottom w:val="single" w:sz="8" w:space="0" w:color="000000" w:themeColor="text1"/>
+              <w:right w:val="single" w:sz="8" w:space="0" w:color="000000" w:themeColor="text1"/>
+            </w:tcBorders>
+            <w:tcMar>
+              <w:top w:w="100" w:type="dxa"/>
+              <w:left w:w="100" w:type="dxa"/>
+              <w:bottom w:w="100" w:type="dxa"/>
+              <w:right w:w="100" w:type="dxa"/>
+            </w:tcMar>
+          </w:tcPr>
+          <w:p>
+            <w:pPr>
+              <w:spacing w:before="240" w:after="240" w:line="240" w:lineRule="auto"/>
+              <w:jc w:val="center"/>
+              <w:rPr>
+                <w:rFonts w:ascii="Calibri" w:eastAsia="Calibri" w:hAnsi="Calibri" w:cs="Calibri"/>
+                <w:b/>
+                <w:sz w:val="24"/>
+                <w:szCs w:val="24"/>
+              </w:rPr>
+            </w:pPr>
+            <w:r>
+              <w:rPr>
+                <w:rFonts w:ascii="Calibri" w:eastAsia="Calibri" w:hAnsi="Calibri" w:cs="Calibri"/>
+                <w:b/>
+                <w:sz w:val="24"/>
+                <w:szCs w:val="24"/>
+              </w:rPr>
+              <w:t>Descrição</w:t>
+            </w:r>
+          </w:p>
+        </w:tc>
+        <w:tc>
+          <w:tcPr>
+            <w:tcW w:w="2760" w:type="dxa"/>
+            <w:tcBorders>
+              <w:top w:val="single" w:sz="8" w:space="0" w:color="000000" w:themeColor="text1"/>
+              <w:left w:val="nil"/>
+              <w:bottom w:val="single" w:sz="8" w:space="0" w:color="000000" w:themeColor="text1"/>
+              <w:right w:val="single" w:sz="8" w:space="0" w:color="000000" w:themeColor="text1"/>
+            </w:tcBorders>
+            <w:tcMar>
+              <w:top w:w="100" w:type="dxa"/>
+              <w:left w:w="100" w:type="dxa"/>
+              <w:bottom w:w="100" w:type="dxa"/>
+              <w:right w:w="100" w:type="dxa"/>
+            </w:tcMar>
+          </w:tcPr>
+          <w:p>
+            <w:pPr>
+              <w:spacing w:line="240" w:lineRule="auto"/>
+              <w:jc w:val="center"/>
+              <w:rPr>
+                <w:rFonts w:ascii="Calibri" w:eastAsia="Calibri" w:hAnsi="Calibri" w:cs="Calibri"/>
+                <w:b/>
+                <w:sz w:val="24"/>
+                <w:szCs w:val="24"/>
+              </w:rPr>
+            </w:pPr>
+            <w:r>
+              <w:rPr>
+                <w:rFonts w:ascii="Calibri" w:eastAsia="Calibri" w:hAnsi="Calibri" w:cs="Calibri"/>
+                <w:b/>
+                <w:sz w:val="24"/>
+                <w:szCs w:val="24"/>
+              </w:rPr>
+              <w:t xml:space="preserve">Duração estimada </w:t>
+            </w:r>
+          </w:p>
+          <w:p>
+            <w:pPr>
+              <w:spacing w:line="240" w:lineRule="auto"/>
+              <w:jc w:val="center"/>
+              <w:rPr>
+                <w:rFonts w:ascii="Calibri" w:eastAsia="Calibri" w:hAnsi="Calibri" w:cs="Calibri"/>
+                <w:b/>
+                <w:sz w:val="24"/>
+                <w:szCs w:val="24"/>
+              </w:rPr>
+            </w:pPr>
+            <w:r>
+              <w:rPr>
+                <w:rFonts w:ascii="Calibri" w:eastAsia="Calibri" w:hAnsi="Calibri" w:cs="Calibri"/>
+                <w:b/>
+                <w:sz w:val="24"/>
+                <w:szCs w:val="24"/>
+              </w:rPr>
+              <w:t>(dias úteis)</w:t>
+            </w:r>
+          </w:p>
+        </w:tc>
+      </w:tr>
+      <w:tr>
+        <w:trPr>
+          <w:trHeight w:val="820"/>
+        </w:trPr>
+        <w:tc>
+          <w:tcPr>
+            <w:tcW w:w="2400" w:type="dxa"/>
+            <w:tcBorders>
+              <w:top w:val="nil"/>
+              <w:left w:val="single" w:sz="8" w:space="0" w:color="000000" w:themeColor="text1"/>
+              <w:bottom w:val="single" w:sz="8" w:space="0" w:color="000000" w:themeColor="text1"/>
+              <w:right w:val="single" w:sz="8" w:space="0" w:color="000000" w:themeColor="text1"/>
+            </w:tcBorders>
+            <w:tcMar>
+              <w:top w:w="100" w:type="dxa"/>
+              <w:left w:w="100" w:type="dxa"/>
+              <w:bottom w:w="100" w:type="dxa"/>
+              <w:right w:w="100" w:type="dxa"/>
+            </w:tcMar>
+          </w:tcPr>
+          <w:p>
+            <w:pPr>
+              <w:keepNext/>
+              <w:spacing w:line="240" w:lineRule="auto"/>
+              <w:jc w:val="center"/>
+              <w:rPr>
+                <w:rFonts w:ascii="Calibri" w:eastAsia="Calibri" w:hAnsi="Calibri" w:cs="Calibri"/>
+                <w:sz w:val="24"/>
+                <w:szCs w:val="24"/>
+              </w:rPr>
+            </w:pPr>
+            <w:r>
+              <w:rPr>
+                <w:rFonts w:ascii="Calibri" w:eastAsia="Calibri" w:hAnsi="Calibri" w:cs="Calibri"/>
+                <w:sz w:val="24"/>
+                <w:szCs w:val="24"/>
+              </w:rPr>
+              <w:t>Requisitos</w:t>
+            </w:r>
+          </w:p>
+        </w:tc>
+        <w:tc>
+          <w:tcPr>
+            <w:tcW w:w="4305" w:type="dxa"/>
+            <w:tcBorders>
+              <w:top w:val="nil"/>
+              <w:left w:val="nil"/>
+              <w:bottom w:val="single" w:sz="8" w:space="0" w:color="000000" w:themeColor="text1"/>
+              <w:right w:val="single" w:sz="8" w:space="0" w:color="000000" w:themeColor="text1"/>
+            </w:tcBorders>
+            <w:tcMar>
+              <w:top w:w="100" w:type="dxa"/>
+              <w:left w:w="100" w:type="dxa"/>
+              <w:bottom w:w="100" w:type="dxa"/>
+              <w:right w:w="100" w:type="dxa"/>
+            </w:tcMar>
+          </w:tcPr>
+          <w:p>
+            <w:pPr>
+              <w:keepNext/>
+              <w:spacing w:line="240" w:lineRule="auto"/>
+              <w:jc w:val="center"/>
+              <w:rPr>
+                <w:rFonts w:ascii="Calibri" w:eastAsia="Calibri" w:hAnsi="Calibri" w:cs="Calibri"/>
+                <w:sz w:val="24"/>
+                <w:szCs w:val="24"/>
+              </w:rPr>
+            </w:pPr>
+            <w:r>
+              <w:rPr>
+                <w:rFonts w:ascii="Calibri" w:eastAsia="Calibri" w:hAnsi="Calibri" w:cs="Calibri"/>
+                <w:sz w:val="24"/>
+                <w:szCs w:val="24"/>
+              </w:rPr>
+              <w:t>Levantar mais detalhes das demandas.</w:t>
+            </w:r>
+          </w:p>
+        </w:tc>
+        <w:tc>
+          <w:tcPr>
+            <w:tcW w:w="2760" w:type="dxa"/>
+            <w:tcBorders>
+              <w:top w:val="nil"/>
+              <w:left w:val="nil"/>
+              <w:bottom w:val="single" w:sz="8" w:space="0" w:color="000000" w:themeColor="text1"/>
+              <w:right w:val="single" w:sz="8" w:space="0" w:color="000000" w:themeColor="text1"/>
+            </w:tcBorders>
+            <w:tcMar>
+              <w:top w:w="100" w:type="dxa"/>
+              <w:left w:w="100" w:type="dxa"/>
+              <w:bottom w:w="100" w:type="dxa"/>
+              <w:right w:w="100" w:type="dxa"/>
+            </w:tcMar>
+          </w:tcPr>
+          <w:p>
+            <w:pPr>
+              <w:keepNext/>
+              <w:spacing w:line="240" w:lineRule="auto"/>
+              <w:jc w:val="center"/>
+              <w:rPr>
+                <w:rFonts w:ascii="Calibri" w:eastAsia="Calibri" w:hAnsi="Calibri" w:cs="Calibri"/>
+                <w:sz w:val="24"/>
+                <w:szCs w:val="24"/>
+              </w:rPr>
+            </w:pPr>
+            <w:r>
+              <w:rPr>
+                <w:rFonts w:ascii="Calibri" w:eastAsia="Calibri" w:hAnsi="Calibri" w:cs="Calibri"/>
+                <w:sz w:val="24"/>
+                <w:szCs w:val="24"/>
+              </w:rPr>
+              <w:t>1</w:t>
+            </w:r>
+          </w:p>
+        </w:tc>
+      </w:tr>
+      <w:tr>
+        <w:trPr>
+          <w:trHeight w:val="780"/>
+        </w:trPr>
+        <w:tc>
+          <w:tcPr>
+            <w:tcW w:w="2400" w:type="dxa"/>
+            <w:tcBorders>
+              <w:top w:val="nil"/>
+              <w:left w:val="single" w:sz="8" w:space="0" w:color="000000" w:themeColor="text1"/>
+              <w:bottom w:val="single" w:sz="8" w:space="0" w:color="000000" w:themeColor="text1"/>
+              <w:right w:val="single" w:sz="8" w:space="0" w:color="000000" w:themeColor="text1"/>
+            </w:tcBorders>
+            <w:tcMar>
+              <w:top w:w="100" w:type="dxa"/>
+              <w:left w:w="100" w:type="dxa"/>
+              <w:bottom w:w="100" w:type="dxa"/>
+              <w:right w:w="100" w:type="dxa"/>
+            </w:tcMar>
+          </w:tcPr>
+          <w:p>
+            <w:pPr>
+              <w:keepNext/>
+              <w:spacing w:line="240" w:lineRule="auto"/>
+              <w:jc w:val="center"/>
+              <w:rPr>
+                <w:rFonts w:ascii="Calibri" w:eastAsia="Calibri" w:hAnsi="Calibri" w:cs="Calibri"/>
+                <w:sz w:val="24"/>
+                <w:szCs w:val="24"/>
+                <w:highlight w:val="white"/>
+              </w:rPr>
+            </w:pPr>
+            <w:r>
+              <w:rPr>
+                <w:rFonts w:ascii="Calibri" w:eastAsia="Calibri" w:hAnsi="Calibri" w:cs="Calibri"/>
+                <w:sz w:val="24"/>
+                <w:szCs w:val="24"/>
+                <w:highlight w:val="white"/>
+              </w:rPr>
+              <w:t>Desenvolvimento</w:t>
+            </w:r>
+          </w:p>
+        </w:tc>
+        <w:tc>
+          <w:tcPr>
+            <w:tcW w:w="4305" w:type="dxa"/>
+            <w:tcBorders>
+              <w:top w:val="nil"/>
+              <w:left w:val="nil"/>
+              <w:bottom w:val="single" w:sz="8" w:space="0" w:color="000000" w:themeColor="text1"/>
+              <w:right w:val="single" w:sz="8" w:space="0" w:color="000000" w:themeColor="text1"/>
+            </w:tcBorders>
+            <w:tcMar>
+              <w:top w:w="100" w:type="dxa"/>
+              <w:left w:w="100" w:type="dxa"/>
+              <w:bottom w:w="100" w:type="dxa"/>
+              <w:right w:w="100" w:type="dxa"/>
+            </w:tcMar>
+          </w:tcPr>
+          <w:p>
+            <w:pPr>
+              <w:keepNext/>
+              <w:spacing w:line="240" w:lineRule="auto"/>
+              <w:jc w:val="center"/>
+              <w:rPr>
+                <w:rFonts w:ascii="Calibri" w:eastAsia="Calibri" w:hAnsi="Calibri" w:cs="Calibri"/>
+                <w:sz w:val="24"/>
+                <w:szCs w:val="24"/>
+                <w:highlight w:val="white"/>
+              </w:rPr>
+            </w:pPr>
+            <w:r>
+              <w:rPr>
+                <w:rFonts w:ascii="Calibri" w:eastAsia="Calibri" w:hAnsi="Calibri" w:cs="Calibri"/>
+                <w:sz w:val="24"/>
+                <w:szCs w:val="24"/>
+                <w:highlight w:val="white"/>
+              </w:rPr>
+              <w:t>Realizar o desenvolvimento das demandas.</w:t>
+            </w:r>
+          </w:p>
+        </w:tc>
+        <w:tc>
+          <w:tcPr>
+            <w:tcW w:w="2760" w:type="dxa"/>
+            <w:tcBorders>
+              <w:top w:val="nil"/>
+              <w:left w:val="nil"/>
+              <w:bottom w:val="single" w:sz="8" w:space="0" w:color="000000" w:themeColor="text1"/>
+              <w:right w:val="single" w:sz="8" w:space="0" w:color="000000" w:themeColor="text1"/>
+            </w:tcBorders>
+            <w:tcMar>
+              <w:top w:w="100" w:type="dxa"/>
+              <w:left w:w="100" w:type="dxa"/>
+              <w:bottom w:w="100" w:type="dxa"/>
+              <w:right w:w="100" w:type="dxa"/>
+            </w:tcMar>
+          </w:tcPr>
+          <w:p>
+            <w:pPr>
+              <w:keepNext/>
+              <w:spacing w:line="240" w:lineRule="auto"/>
+              <w:jc w:val="center"/>
+              <w:rPr>
+                <w:rFonts w:ascii="Calibri" w:eastAsia="Calibri" w:hAnsi="Calibri" w:cs="Calibri"/>
+                <w:sz w:val="24"/>
+                <w:szCs w:val="24"/>
+                <w:highlight w:val="white"/>
+              </w:rPr>
+            </w:pPr>
+            <w:r>
+              <w:rPr>
+                <w:rFonts w:ascii="Calibri" w:eastAsia="Calibri" w:hAnsi="Calibri" w:cs="Calibri"/>
+                <w:sz w:val="24"/>
+                <w:szCs w:val="24"/>
+                <w:highlight w:val="white"/>
+              </w:rPr>
+              <w:t>[DIAS_UTEIS]</w:t>
+            </w:r>
+          </w:p>
+        </w:tc>
+      </w:tr>
+      <w:tr>
+        <w:trPr>
+          <w:trHeight w:val="680"/>
+        </w:trPr>
+        <w:tc>
+          <w:tcPr>
+            <w:tcW w:w="2400" w:type="dxa"/>
+            <w:tcBorders>
+              <w:top w:val="nil"/>
+              <w:left w:val="single" w:sz="8" w:space="0" w:color="000000" w:themeColor="text1"/>
+              <w:bottom w:val="single" w:sz="8" w:space="0" w:color="000000" w:themeColor="text1"/>
+              <w:right w:val="single" w:sz="8" w:space="0" w:color="000000" w:themeColor="text1"/>
+            </w:tcBorders>
+            <w:tcMar>
+              <w:top w:w="100" w:type="dxa"/>
+              <w:left w:w="100" w:type="dxa"/>
+              <w:bottom w:w="100" w:type="dxa"/>
+              <w:right w:w="100" w:type="dxa"/>
+            </w:tcMar>
+          </w:tcPr>
+          <w:p>
+            <w:pPr>
+              <w:keepNext/>
+              <w:spacing w:line="240" w:lineRule="auto"/>
+              <w:jc w:val="center"/>
+              <w:rPr>
+                <w:rFonts w:ascii="Calibri" w:eastAsia="Calibri" w:hAnsi="Calibri" w:cs="Calibri"/>
+                <w:sz w:val="24"/>
+                <w:szCs w:val="24"/>
+              </w:rPr>
+            </w:pPr>
+            <w:r>
+              <w:rPr>
+                <w:rFonts w:ascii="Calibri" w:eastAsia="Calibri" w:hAnsi="Calibri" w:cs="Calibri"/>
+                <w:sz w:val="24"/>
+                <w:szCs w:val="24"/>
+              </w:rPr>
+              <w:t>Contagem final de PF</w:t>
+            </w:r>
+          </w:p>
+        </w:tc>
+        <w:tc>
+          <w:tcPr>
+            <w:tcW w:w="4305" w:type="dxa"/>
+            <w:tcBorders>
+              <w:top w:val="nil"/>
+              <w:left w:val="nil"/>
+              <w:bottom w:val="single" w:sz="8" w:space="0" w:color="000000" w:themeColor="text1"/>
+              <w:right w:val="single" w:sz="8" w:space="0" w:color="000000" w:themeColor="text1"/>
+            </w:tcBorders>
+            <w:tcMar>
+              <w:top w:w="100" w:type="dxa"/>
+              <w:left w:w="100" w:type="dxa"/>
+              <w:bottom w:w="100" w:type="dxa"/>
+              <w:right w:w="100" w:type="dxa"/>
+            </w:tcMar>
+          </w:tcPr>
+          <w:p>
+            <w:pPr>
+              <w:keepNext/>
+              <w:spacing w:line="240" w:lineRule="auto"/>
+              <w:jc w:val="center"/>
+              <w:rPr>
+                <w:rFonts w:ascii="Calibri" w:eastAsia="Calibri" w:hAnsi="Calibri" w:cs="Calibri"/>
+                <w:sz w:val="24"/>
+                <w:szCs w:val="24"/>
+              </w:rPr>
+            </w:pPr>
+            <w:r>
+              <w:rPr>
+                <w:rFonts w:ascii="Calibri" w:eastAsia="Calibri" w:hAnsi="Calibri" w:cs="Calibri"/>
+                <w:sz w:val="24"/>
+                <w:szCs w:val="24"/>
+              </w:rPr>
+              <w:t>Contagem final do desenvolvimento</w:t>
+            </w:r>
+          </w:p>
+        </w:tc>
+        <w:tc>
+          <w:tcPr>
+            <w:tcW w:w="2760" w:type="dxa"/>
+            <w:tcBorders>
+              <w:top w:val="nil"/>
+              <w:left w:val="nil"/>
+              <w:bottom w:val="single" w:sz="8" w:space="0" w:color="000000" w:themeColor="text1"/>
+              <w:right w:val="single" w:sz="8" w:space="0" w:color="000000" w:themeColor="text1"/>
+            </w:tcBorders>
+            <w:tcMar>
+              <w:top w:w="100" w:type="dxa"/>
+              <w:left w:w="100" w:type="dxa"/>
+              <w:bottom w:w="100" w:type="dxa"/>
+              <w:right w:w="100" w:type="dxa"/>
+            </w:tcMar>
+          </w:tcPr>
+          <w:p>
+            <w:pPr>
+              <w:keepNext/>
+              <w:spacing w:line="240" w:lineRule="auto"/>
+              <w:jc w:val="center"/>
+              <w:rPr>
+                <w:rFonts w:ascii="Calibri" w:eastAsia="Calibri" w:hAnsi="Calibri" w:cs="Calibri"/>
+                <w:sz w:val="24"/>
+                <w:szCs w:val="24"/>
+              </w:rPr>
+            </w:pPr>
+            <w:r>
+              <w:rPr>
+                <w:rFonts w:ascii="Calibri" w:eastAsia="Calibri" w:hAnsi="Calibri" w:cs="Calibri"/>
+                <w:sz w:val="24"/>
+                <w:szCs w:val="24"/>
+              </w:rPr>
+              <w:t>1</w:t>
+            </w:r>
+          </w:p>
+        </w:tc>
+      </w:tr>
+      <w:tr>
+        <w:trPr>
+          <w:trHeight w:val="320"/>
+        </w:trPr>
+        <w:tc>
+          <w:tcPr>
+            <w:tcW w:w="2400" w:type="dxa"/>
+            <w:tcBorders>
+              <w:top w:val="nil"/>
+              <w:left w:val="single" w:sz="8" w:space="0" w:color="000000" w:themeColor="text1"/>
+              <w:bottom w:val="single" w:sz="8" w:space="0" w:color="000000" w:themeColor="text1"/>
+              <w:right w:val="single" w:sz="8" w:space="0" w:color="000000" w:themeColor="text1"/>
+            </w:tcBorders>
+            <w:tcMar>
+              <w:top w:w="100" w:type="dxa"/>
+              <w:left w:w="100" w:type="dxa"/>
+              <w:bottom w:w="100" w:type="dxa"/>
+              <w:right w:w="100" w:type="dxa"/>
+            </w:tcMar>
+          </w:tcPr>
+          <w:p>
+            <w:pPr>
+              <w:keepNext/>
+              <w:spacing w:line="240" w:lineRule="auto"/>
+              <w:jc w:val="center"/>
+              <w:rPr>
+                <w:rFonts w:ascii="Calibri" w:eastAsia="Calibri" w:hAnsi="Calibri" w:cs="Calibri"/>
+                <w:sz w:val="24"/>
+                <w:szCs w:val="24"/>
+              </w:rPr>
+            </w:pPr>
+            <w:r>
+              <w:rPr>
+                <w:rFonts w:ascii="Calibri" w:eastAsia="Calibri" w:hAnsi="Calibri" w:cs="Calibri"/>
+                <w:sz w:val="24"/>
+                <w:szCs w:val="24"/>
+              </w:rPr>
+              <w:t>Homologação</w:t>
+            </w:r>
+          </w:p>
+        </w:tc>
+        <w:tc>
+          <w:tcPr>
+            <w:tcW w:w="4305" w:type="dxa"/>
+            <w:tcBorders>
+              <w:top w:val="nil"/>
+              <w:left w:val="nil"/>
+              <w:bottom w:val="single" w:sz="8" w:space="0" w:color="000000" w:themeColor="text1"/>
+              <w:right w:val="single" w:sz="8" w:space="0" w:color="000000" w:themeColor="text1"/>
+            </w:tcBorders>
+            <w:tcMar>
+              <w:top w:w="100" w:type="dxa"/>
+              <w:left w:w="100" w:type="dxa"/>
+              <w:bottom w:w="100" w:type="dxa"/>
+              <w:right w:w="100" w:type="dxa"/>
+            </w:tcMar>
+          </w:tcPr>
+          <w:p>
+            <w:pPr>
+              <w:keepNext/>
+              <w:spacing w:line="240" w:lineRule="auto"/>
+              <w:jc w:val="center"/>
+              <w:rPr>
+                <w:rFonts w:ascii="Calibri" w:eastAsia="Calibri" w:hAnsi="Calibri" w:cs="Calibri"/>
+                <w:sz w:val="24"/>
+                <w:szCs w:val="24"/>
+              </w:rPr>
+            </w:pPr>
+            <w:r>
+              <w:rPr>
+                <w:rFonts w:ascii="Calibri" w:eastAsia="Calibri" w:hAnsi="Calibri" w:cs="Calibri"/>
+                <w:sz w:val="24"/>
+                <w:szCs w:val="24"/>
+              </w:rPr>
+              <w:t>Homologação da solução pela CHESF</w:t>
+            </w:r>
+          </w:p>
+        </w:tc>
+        <w:tc>
+          <w:tcPr>
+            <w:tcW w:w="2760" w:type="dxa"/>
+            <w:tcBorders>
+              <w:top w:val="nil"/>
+              <w:left w:val="nil"/>
+              <w:bottom w:val="single" w:sz="8" w:space="0" w:color="000000" w:themeColor="text1"/>
+              <w:right w:val="single" w:sz="8" w:space="0" w:color="000000" w:themeColor="text1"/>
+            </w:tcBorders>
+            <w:tcMar>
+              <w:top w:w="100" w:type="dxa"/>
+              <w:left w:w="100" w:type="dxa"/>
+              <w:bottom w:w="100" w:type="dxa"/>
+              <w:right w:w="100" w:type="dxa"/>
+            </w:tcMar>
+          </w:tcPr>
+          <w:p>
+            <w:pPr>
+              <w:keepNext/>
+              <w:spacing w:line="240" w:lineRule="auto"/>
+              <w:jc w:val="center"/>
+              <w:rPr>
+                <w:rFonts w:ascii="Calibri" w:eastAsia="Calibri" w:hAnsi="Calibri" w:cs="Calibri"/>
+                <w:sz w:val="24"/>
+                <w:szCs w:val="24"/>
+                <w:highlight w:val="white"/>
+              </w:rPr>
+            </w:pPr>
+            <w:r>
+              <w:rPr>
+                <w:rFonts w:ascii="Calibri" w:eastAsia="Calibri" w:hAnsi="Calibri" w:cs="Calibri"/>
+                <w:sz w:val="24"/>
+                <w:szCs w:val="24"/>
+                <w:highlight w:val="white"/>
+              </w:rPr>
+              <w:t>1</w:t>
+            </w:r>
+          </w:p>
+        </w:tc>
+      </w:tr>
+    </w:tbl>
+    <w:p>
+      <w:pPr>
+        <w:spacing w:before="240" w:after="240" w:line="240" w:lineRule="auto"/>
+        <w:jc w:val="center"/>
+        <w:rPr>
+          <w:rFonts w:ascii="Calibri" w:eastAsia="Calibri" w:hAnsi="Calibri" w:cs="Calibri"/>
+        </w:rPr>
+      </w:pPr>
+      <w:r>
+        <w:rPr>
+          <w:rFonts w:ascii="Calibri" w:eastAsia="Calibri" w:hAnsi="Calibri" w:cs="Calibri"/>
+        </w:rPr>
+        <w:t xml:space="preserve">Tabela </w:t>
+      </w:r>
+      <w:r>
+        <w:rPr>
+          <w:rFonts w:ascii="Calibri" w:eastAsia="Calibri" w:hAnsi="Calibri" w:cs="Calibri"/>
+        </w:rPr>
+        <w:t>3</w:t>
+      </w:r>
+      <w:r>
+        <w:rPr>
+          <w:rFonts w:ascii="Calibri" w:eastAsia="Calibri" w:hAnsi="Calibri" w:cs="Calibri"/>
+        </w:rPr>
+        <w:t xml:space="preserve"> – Cronograma de execução para autorização de serviço.</w:t>
+      </w:r>
+    </w:p>
+    <w:p>
+      <w:pPr>
+        <w:pBdr>
+          <w:top w:val="nil"/>
+          <w:left w:val="nil"/>
+          <w:bottom w:val="nil"/>
+          <w:right w:val="nil"/>
+          <w:between w:val="nil"/>
+        </w:pBdr>
+        <w:spacing w:before="240" w:after="240" w:line="360" w:lineRule="auto"/>
+        <w:jc w:val="both"/>
+        <w:rPr>
+          <w:rFonts w:ascii="Calibri" w:eastAsia="Calibri" w:hAnsi="Calibri" w:cs="Calibri"/>
+          <w:sz w:val="24"/>
+          <w:szCs w:val="24"/>
+        </w:rPr>
+      </w:pPr>
+      <w:r>
+        <w:rPr>
+          <w:rFonts w:ascii="Calibri" w:eastAsia="Calibri" w:hAnsi="Calibri" w:cs="Calibri"/>
+          <w:sz w:val="24"/>
+          <w:szCs w:val="24"/>
+        </w:rPr>
+        <w:t>O pagamento será realizado após a homologação e aprovação do serviço pela CHESF.</w:t>
+      </w:r>
+    </w:p>
+    <w:p>
+      <w:pPr>
+        <w:spacing w:line="360" w:lineRule="auto"/>
+        <w:jc w:val="both"/>
+        <w:rPr>
+          <w:rFonts w:ascii="Corbel" w:eastAsia="Corbel" w:hAnsi="Corbel" w:cs="Corbel"/>
+          <w:sz w:val="28"/>
+          <w:szCs w:val="28"/>
+        </w:rPr>
+      </w:pPr>
+    </w:p>
+    <w:sectPr>
+      <w:headerReference w:type="default" r:id="rId6"/>
+      <w:footerReference w:type="default" r:id="rId7"/>
+      <w:headerReference w:type="first" r:id="rId8"/>
+      <w:footerReference w:type="first" r:id="rId9"/>
+      <w:pgSz w:w="11909" w:h="16834"/>
+      <w:pgMar w:top="850" w:right="1133" w:bottom="850" w:left="1133" w:header="720" w:footer="850" w:gutter="0"/>
+      <w:pgNumType w:start="1"/>
+      <w:cols w:space="720"/>
+      <w:titlePg/>
+    </w:sectPr>
+  </w:body>
+</w:document>
+</file>
+
+<file path=word/endnotes.xml><?xml version="1.0" encoding="utf-8"?>
+<w:endnotes xmlns:wpc="http://schemas.microsoft.com/office/word/2010/wordprocessingCanvas" xmlns:cx="http://schemas.microsoft.com/office/drawing/2014/chartex" xmlns:cx1="http://schemas.microsoft.com/office/drawing/2015/9/8/chartex" xmlns:cx2="http://schemas.microsoft.com/office/drawing/2015/10/21/chartex" xmlns:cx3="http://schemas.microsoft.com/office/drawing/2016/5/9/chartex" xmlns:cx4="http://schemas.microsoft.com/office/drawing/2016/5/10/chartex" xmlns:cx5="http://schemas.microsoft.com/office/drawing/2016/5/11/chartex" xmlns:cx6="http://schemas.microsoft.com/office/drawing/2016/5/12/chartex" xmlns:cx7="http://schemas.microsoft.com/office/drawing/2016/5/13/chartex" xmlns:cx8="http://schemas.microsoft.com/office/drawing/2016/5/14/chartex" xmlns:mc="http://schemas.openxmlformats.org/markup-compatibility/2006" xmlns:aink="http://schemas.microsoft.com/office/drawing/2016/ink" xmlns:am3d="http://schemas.microsoft.com/office/drawing/2017/model3d" xmlns:o="urn:schemas-microsoft-com:office:office" xmlns:oel="http://schemas.microsoft.com/office/2019/extlst" xmlns:r="http://schemas.openxmlformats.org/officeDocument/2006/relationships" xmlns:m="http://schemas.openxmlformats.org/officeDocument/2006/math" xmlns:v="urn:schemas-microsoft-com:vml" xmlns:wp14="http://schemas.microsoft.com/office/word/2010/wordprocessingDrawing" xmlns:wp="http://schemas.openxmlformats.org/drawingml/2006/wordprocessingDrawing" xmlns:w10="urn:schemas-microsoft-com:office:word" xmlns:w="http://schemas.openxmlformats.org/wordprocessingml/2006/main" xmlns:w14="http://schemas.microsoft.com/office/word/2010/wordml" xmlns:w15="http://schemas.microsoft.com/office/word/2012/wordml" xmlns:w16cex="http://schemas.microsoft.com/office/word/2018/wordml/cex" xmlns:w16cid="http://schemas.microsoft.com/office/word/2016/wordml/cid" xmlns:w16="http://schemas.microsoft.com/office/word/2018/wordml" xmlns:w16du="http://schemas.microsoft.com/office/word/2023/wordml/word16du" xmlns:w16sdtdh="http://schemas.microsoft.com/office/word/2020/wordml/sdtdatahash" xmlns:w16sdtfl="http://schemas.microsoft.com/office/word/2024/wordml/sdtformatlock" xmlns:w16se="http://schemas.microsoft.com/office/word/2015/wordml/symex" xmlns:wpg="http://schemas.microsoft.com/office/word/2010/wordprocessingGroup" xmlns:wpi="http://schemas.microsoft.com/office/word/2010/wordprocessingInk" xmlns:wne="http://schemas.microsoft.com/office/word/2006/wordml" xmlns:wps="http://schemas.microsoft.com/office/word/2010/wordprocessingShape" mc:Ignorable="w14 w15 w16se w16cid w16 w16cex w16sdtdh w16sdtfl w16du wp14">
+  <w:endnote w:type="separator" w:id="-1">
+    <w:p>
+      <w:pPr>
+        <w:spacing w:line="240" w:lineRule="auto"/>
+      </w:pPr>
+      <w:r>
+        <w:separator/>
+      </w:r>
+    </w:p>
+  </w:endnote>
+  <w:endnote w:type="continuationSeparator" w:id="0">
+    <w:p>
+      <w:pPr>
+        <w:spacing w:line="240" w:lineRule="auto"/>
+      </w:pPr>
+      <w:r>
+        <w:continuationSeparator/>
+      </w:r>
+    </w:p>
+  </w:endnote>
+</w:endnotes>
+</file>
+
+<file path=word/footer1.xml><?xml version="1.0" encoding="utf-8"?>
+<w:ftr xmlns:wpc="http://schemas.microsoft.com/office/word/2010/wordprocessingCanvas" xmlns:cx="http://schemas.microsoft.com/office/drawing/2014/chartex" xmlns:cx1="http://schemas.microsoft.com/office/drawing/2015/9/8/chartex" xmlns:cx2="http://schemas.microsoft.com/office/drawing/2015/10/21/chartex" xmlns:cx3="http://schemas.microsoft.com/office/drawing/2016/5/9/chartex" xmlns:cx4="http://schemas.microsoft.com/office/drawing/2016/5/10/chartex" xmlns:cx5="http://schemas.microsoft.com/office/drawing/2016/5/11/chartex" xmlns:cx6="http://schemas.microsoft.com/office/drawing/2016/5/12/chartex" xmlns:cx7="http://schemas.microsoft.com/office/drawing/2016/5/13/chartex" xmlns:cx8="http://schemas.microsoft.com/office/drawing/2016/5/14/chartex" xmlns:mc="http://schemas.openxmlformats.org/markup-compatibility/2006" xmlns:aink="http://schemas.microsoft.com/office/drawing/2016/ink" xmlns:am3d="http://schemas.microsoft.com/office/drawing/2017/model3d" xmlns:o="urn:schemas-microsoft-com:office:office" xmlns:oel="http://schemas.microsoft.com/office/2019/extlst" xmlns:r="http://schemas.openxmlformats.org/officeDocument/2006/relationships" xmlns:m="http://schemas.openxmlformats.org/officeDocument/2006/math" xmlns:v="urn:schemas-microsoft-com:vml" xmlns:wp14="http://schemas.microsoft.com/office/word/2010/wordprocessingDrawing" xmlns:wp="http://schemas.openxmlformats.org/drawingml/2006/wordprocessingDrawing" xmlns:w10="urn:schemas-microsoft-com:office:word" xmlns:w="http://schemas.openxmlformats.org/wordprocessingml/2006/main" xmlns:w14="http://schemas.microsoft.com/office/word/2010/wordml" xmlns:w15="http://schemas.microsoft.com/office/word/2012/wordml" xmlns:w16cex="http://schemas.microsoft.com/office/word/2018/wordml/cex" xmlns:w16cid="http://schemas.microsoft.com/office/word/2016/wordml/cid" xmlns:w16="http://schemas.microsoft.com/office/word/2018/wordml" xmlns:w16du="http://schemas.microsoft.com/office/word/2023/wordml/word16du" xmlns:w16sdtdh="http://schemas.microsoft.com/office/word/2020/wordml/sdtdatahash" xmlns:w16sdtfl="http://schemas.microsoft.com/office/word/2024/wordml/sdtformatlock" xmlns:w16se="http://schemas.microsoft.com/office/word/2015/wordml/symex" xmlns:wpg="http://schemas.microsoft.com/office/word/2010/wordprocessingGroup" xmlns:wpi="http://schemas.microsoft.com/office/word/2010/wordprocessingInk" xmlns:wne="http://schemas.microsoft.com/office/word/2006/wordml" xmlns:wps="http://schemas.microsoft.com/office/word/2010/wordprocessingShape" mc:Ignorable="w14 w15 w16se w16cid w16 w16cex w16sdtdh w16sdtfl w16du wp14">
+  <w:p>
+    <w:pPr>
+      <w:rPr>
+        <w:color w:val="666666"/>
+      </w:rPr>
+    </w:pPr>
+    <w:r>
+      <w:rPr>
+        <w:noProof/>
+        <w:color w:val="666666"/>
+      </w:rPr>
+      <w:drawing>
+        <wp:inline distT="114300" distB="114300" distL="114300" distR="114300" wp14:anchorId="729AE733" wp14:editId="07777777">
+          <wp:extent cx="142875" cy="114300"/>
+          <wp:effectExtent l="0" t="0" r="0" b="0"/>
+          <wp:docPr id="2" name="image2.png"/>
+          <wp:cNvGraphicFramePr/>
+          <a:graphic xmlns:a="http://schemas.openxmlformats.org/drawingml/2006/main">
+            <a:graphicData uri="http://schemas.openxmlformats.org/drawingml/2006/picture">
+              <pic:pic xmlns:pic="http://schemas.openxmlformats.org/drawingml/2006/picture">
+                <pic:nvPicPr>
+                  <pic:cNvPr id="0" name="image2.png"/>
+                  <pic:cNvPicPr preferRelativeResize="0"/>
+                </pic:nvPicPr>
+                <pic:blipFill>
+                  <a:blip r:embed="rId1"/>
+                  <a:srcRect/>
+                  <a:stretch>
+                    <a:fillRect/>
+                  </a:stretch>
+                </pic:blipFill>
+                <pic:spPr>
+                  <a:xfrm>
+                    <a:off x="0" y="0"/>
+                    <a:ext cx="142875" cy="114300"/>
+                  </a:xfrm>
+                  <a:prstGeom prst="rect">
+                    <a:avLst/>
+                  </a:prstGeom>
+                  <a:ln/>
+                </pic:spPr>
+              </pic:pic>
+            </a:graphicData>
+          </a:graphic>
+        </wp:inline>
+      </w:drawing>
+    </w:r>
+    <w:r>
+      <w:rPr>
+        <w:color w:val="666666"/>
+      </w:rPr>
+      <w:t xml:space="preserve"> Rua da </w:t>
+    </w:r>
+    <w:proofErr w:type="spellStart"/>
+    <w:r>
+      <w:rPr>
+        <w:color w:val="666666"/>
+      </w:rPr>
+      <w:t>Bronzita</w:t>
+    </w:r>
+    <w:proofErr w:type="spellEnd"/>
+    <w:r>
+      <w:rPr>
+        <w:color w:val="666666"/>
+      </w:rPr>
+      <w:t>, 1917, Lagoa Nova, Natal/RN, Sala 3, 59.076-500</w:t>
+    </w:r>
+  </w:p>
+  <w:p>
+    <w:pPr>
+      <w:rPr>
+        <w:color w:val="666666"/>
+      </w:rPr>
+    </w:pPr>
+    <w:r>
+      <w:rPr>
+        <w:noProof/>
+        <w:color w:val="666666"/>
+      </w:rPr>
+      <w:drawing>
+        <wp:inline distT="114300" distB="114300" distL="114300" distR="114300" wp14:anchorId="382686BF" wp14:editId="07777777">
+          <wp:extent cx="123825" cy="123825"/>
+          <wp:effectExtent l="0" t="0" r="0" b="0"/>
+          <wp:docPr id="8" name="image3.png"/>
+          <wp:cNvGraphicFramePr/>
+          <a:graphic xmlns:a="http://schemas.openxmlformats.org/drawingml/2006/main">
+            <a:graphicData uri="http://schemas.openxmlformats.org/drawingml/2006/picture">
+              <pic:pic xmlns:pic="http://schemas.openxmlformats.org/drawingml/2006/picture">
+                <pic:nvPicPr>
+                  <pic:cNvPr id="0" name="image3.png"/>
+                  <pic:cNvPicPr preferRelativeResize="0"/>
+                </pic:nvPicPr>
+                <pic:blipFill>
+                  <a:blip r:embed="rId2"/>
+                  <a:srcRect/>
+                  <a:stretch>
+                    <a:fillRect/>
+                  </a:stretch>
+                </pic:blipFill>
+                <pic:spPr>
+                  <a:xfrm>
+                    <a:off x="0" y="0"/>
+                    <a:ext cx="123825" cy="123825"/>
+                  </a:xfrm>
+                  <a:prstGeom prst="rect">
+                    <a:avLst/>
+                  </a:prstGeom>
+                  <a:ln/>
+                </pic:spPr>
+              </pic:pic>
+            </a:graphicData>
+          </a:graphic>
+        </wp:inline>
+      </w:drawing>
+    </w:r>
+    <w:r>
+      <w:rPr>
+        <w:color w:val="666666"/>
+      </w:rPr>
+      <w:t xml:space="preserve"> +55 84 2020 1917</w:t>
+    </w:r>
+  </w:p>
+  <w:p>
+    <w:pPr>
+      <w:rPr>
+        <w:color w:val="666666"/>
+      </w:rPr>
+    </w:pPr>
+    <w:r>
+      <w:rPr>
+        <w:noProof/>
+        <w:color w:val="666666"/>
+      </w:rPr>
+      <w:drawing>
+        <wp:inline distT="114300" distB="114300" distL="114300" distR="114300" wp14:anchorId="40A04061" wp14:editId="07777777">
+          <wp:extent cx="133350" cy="104775"/>
+          <wp:effectExtent l="0" t="0" r="0" b="0"/>
+          <wp:docPr id="3" name="image1.png"/>
+          <wp:cNvGraphicFramePr/>
+          <a:graphic xmlns:a="http://schemas.openxmlformats.org/drawingml/2006/main">
+            <a:graphicData uri="http://schemas.openxmlformats.org/drawingml/2006/picture">
+              <pic:pic xmlns:pic="http://schemas.openxmlformats.org/drawingml/2006/picture">
+                <pic:nvPicPr>
+                  <pic:cNvPr id="0" name="image1.png"/>
+                  <pic:cNvPicPr preferRelativeResize="0"/>
+                </pic:nvPicPr>
+                <pic:blipFill>
+                  <a:blip r:embed="rId3"/>
+                  <a:srcRect/>
+                  <a:stretch>
+                    <a:fillRect/>
+                  </a:stretch>
+                </pic:blipFill>
+                <pic:spPr>
+                  <a:xfrm>
+                    <a:off x="0" y="0"/>
+                    <a:ext cx="133350" cy="104775"/>
+                  </a:xfrm>
+                  <a:prstGeom prst="rect">
+                    <a:avLst/>
+                  </a:prstGeom>
+                  <a:ln/>
+                </pic:spPr>
+              </pic:pic>
+            </a:graphicData>
+          </a:graphic>
+        </wp:inline>
+      </w:drawing>
+    </w:r>
+    <w:r>
+      <w:rPr>
+        <w:color w:val="666666"/>
+      </w:rPr>
+      <w:t xml:space="preserve"> contato@logap.com.br</w:t>
+    </w:r>
+  </w:p>
+</w:ftr>
+</file>
+
+<file path=word/footer2.xml><?xml version="1.0" encoding="utf-8"?>
+<w:ftr xmlns:wpc="http://schemas.microsoft.com/office/word/2010/wordprocessingCanvas" xmlns:cx="http://schemas.microsoft.com/office/drawing/2014/chartex" xmlns:cx1="http://schemas.microsoft.com/office/drawing/2015/9/8/chartex" xmlns:cx2="http://schemas.microsoft.com/office/drawing/2015/10/21/chartex" xmlns:cx3="http://schemas.microsoft.com/office/drawing/2016/5/9/chartex" xmlns:cx4="http://schemas.microsoft.com/office/drawing/2016/5/10/chartex" xmlns:cx5="http://schemas.microsoft.com/office/drawing/2016/5/11/chartex" xmlns:cx6="http://schemas.microsoft.com/office/drawing/2016/5/12/chartex" xmlns:cx7="http://schemas.microsoft.com/office/drawing/2016/5/13/chartex" xmlns:cx8="http://schemas.microsoft.com/office/drawing/2016/5/14/chartex" xmlns:mc="http://schemas.openxmlformats.org/markup-compatibility/2006" xmlns:aink="http://schemas.microsoft.com/office/drawing/2016/ink" xmlns:am3d="http://schemas.microsoft.com/office/drawing/2017/model3d" xmlns:o="urn:schemas-microsoft-com:office:office" xmlns:oel="http://schemas.microsoft.com/office/2019/extlst" xmlns:r="http://schemas.openxmlformats.org/officeDocument/2006/relationships" xmlns:m="http://schemas.openxmlformats.org/officeDocument/2006/math" xmlns:v="urn:schemas-microsoft-com:vml" xmlns:wp14="http://schemas.microsoft.com/office/word/2010/wordprocessingDrawing" xmlns:wp="http://schemas.openxmlformats.org/drawingml/2006/wordprocessingDrawing" xmlns:w10="urn:schemas-microsoft-com:office:word" xmlns:w="http://schemas.openxmlformats.org/wordprocessingml/2006/main" xmlns:w14="http://schemas.microsoft.com/office/word/2010/wordml" xmlns:w15="http://schemas.microsoft.com/office/word/2012/wordml" xmlns:w16cex="http://schemas.microsoft.com/office/word/2018/wordml/cex" xmlns:w16cid="http://schemas.microsoft.com/office/word/2016/wordml/cid" xmlns:w16="http://schemas.microsoft.com/office/word/2018/wordml" xmlns:w16du="http://schemas.microsoft.com/office/word/2023/wordml/word16du" xmlns:w16sdtdh="http://schemas.microsoft.com/office/word/2020/wordml/sdtdatahash" xmlns:w16sdtfl="http://schemas.microsoft.com/office/word/2024/wordml/sdtformatlock" xmlns:w16se="http://schemas.microsoft.com/office/word/2015/wordml/symex" xmlns:wpg="http://schemas.microsoft.com/office/word/2010/wordprocessingGroup" xmlns:wpi="http://schemas.microsoft.com/office/word/2010/wordprocessingInk" xmlns:wne="http://schemas.microsoft.com/office/word/2006/wordml" xmlns:wps="http://schemas.microsoft.com/office/word/2010/wordprocessingShape" mc:Ignorable="w14 w15 w16se w16cid w16 w16cex w16sdtdh w16sdtfl w16du wp14">
+  <w:p>
+    <w:pPr>
+      <w:rPr>
+        <w:color w:val="666666"/>
+      </w:rPr>
+    </w:pPr>
+    <w:r>
+      <w:rPr>
+        <w:noProof/>
+        <w:color w:val="666666"/>
+      </w:rPr>
+      <w:drawing>
+        <wp:inline distT="114300" distB="114300" distL="114300" distR="114300" wp14:anchorId="2B3CE4D9" wp14:editId="07777777">
+          <wp:extent cx="142875" cy="114300"/>
+          <wp:effectExtent l="0" t="0" r="0" b="0"/>
+          <wp:docPr id="7" name="image2.png"/>
+          <wp:cNvGraphicFramePr/>
+          <a:graphic xmlns:a="http://schemas.openxmlformats.org/drawingml/2006/main">
+            <a:graphicData uri="http://schemas.openxmlformats.org/drawingml/2006/picture">
+              <pic:pic xmlns:pic="http://schemas.openxmlformats.org/drawingml/2006/picture">
+                <pic:nvPicPr>
+                  <pic:cNvPr id="0" name="image2.png"/>
+                  <pic:cNvPicPr preferRelativeResize="0"/>
+                </pic:nvPicPr>
+                <pic:blipFill>
+                  <a:blip r:embed="rId1"/>
+                  <a:srcRect/>
+                  <a:stretch>
+                    <a:fillRect/>
+                  </a:stretch>
+                </pic:blipFill>
+                <pic:spPr>
+                  <a:xfrm>
+                    <a:off x="0" y="0"/>
+                    <a:ext cx="142875" cy="114300"/>
+                  </a:xfrm>
+                  <a:prstGeom prst="rect">
+                    <a:avLst/>
+                  </a:prstGeom>
+                  <a:ln/>
+                </pic:spPr>
+              </pic:pic>
+            </a:graphicData>
+          </a:graphic>
+        </wp:inline>
+      </w:drawing>
+    </w:r>
+    <w:r>
+      <w:rPr>
+        <w:color w:val="666666"/>
+      </w:rPr>
+      <w:t xml:space="preserve"> Rua da </w:t>
+    </w:r>
+    <w:proofErr w:type="spellStart"/>
+    <w:r>
+      <w:rPr>
+        <w:color w:val="666666"/>
+      </w:rPr>
+      <w:t>Bronzita</w:t>
+    </w:r>
+    <w:proofErr w:type="spellEnd"/>
+    <w:r>
+      <w:rPr>
+        <w:color w:val="666666"/>
+      </w:rPr>
+      <w:t>, 1917, Lagoa Nova, Natal/RN, Sala 3, 59.076-500</w:t>
+    </w:r>
+  </w:p>
+  <w:p>
+    <w:pPr>
+      <w:rPr>
+        <w:color w:val="666666"/>
+      </w:rPr>
+    </w:pPr>
+    <w:r>
+      <w:rPr>
+        <w:noProof/>
+        <w:color w:val="666666"/>
+      </w:rPr>
+      <w:drawing>
+        <wp:inline distT="114300" distB="114300" distL="114300" distR="114300" wp14:anchorId="2898D10B" wp14:editId="07777777">
+          <wp:extent cx="123825" cy="123825"/>
+          <wp:effectExtent l="0" t="0" r="0" b="0"/>
+          <wp:docPr id="1" name="image3.png"/>
+          <wp:cNvGraphicFramePr/>
+          <a:graphic xmlns:a="http://schemas.openxmlformats.org/drawingml/2006/main">
+            <a:graphicData uri="http://schemas.openxmlformats.org/drawingml/2006/picture">
+              <pic:pic xmlns:pic="http://schemas.openxmlformats.org/drawingml/2006/picture">
+                <pic:nvPicPr>
+                  <pic:cNvPr id="0" name="image3.png"/>
+                  <pic:cNvPicPr preferRelativeResize="0"/>
+                </pic:nvPicPr>
+                <pic:blipFill>
+                  <a:blip r:embed="rId2"/>
+                  <a:srcRect/>
+                  <a:stretch>
+                    <a:fillRect/>
+                  </a:stretch>
+                </pic:blipFill>
+                <pic:spPr>
+                  <a:xfrm>
+                    <a:off x="0" y="0"/>
+                    <a:ext cx="123825" cy="123825"/>
+                  </a:xfrm>
+                  <a:prstGeom prst="rect">
+                    <a:avLst/>
+                  </a:prstGeom>
+                  <a:ln/>
+                </pic:spPr>
+              </pic:pic>
+            </a:graphicData>
+          </a:graphic>
+        </wp:inline>
+      </w:drawing>
+    </w:r>
+    <w:r>
+      <w:rPr>
+        <w:color w:val="666666"/>
+      </w:rPr>
+      <w:t xml:space="preserve"> +55 84 2020 1917</w:t>
+    </w:r>
+  </w:p>
+  <w:p>
+    <w:r>
+      <w:rPr>
+        <w:noProof/>
+        <w:color w:val="666666"/>
+      </w:rPr>
+      <w:drawing>
+        <wp:inline distT="114300" distB="114300" distL="114300" distR="114300" wp14:anchorId="1B1561E1" wp14:editId="07777777">
+          <wp:extent cx="133350" cy="104775"/>
+          <wp:effectExtent l="0" t="0" r="0" b="0"/>
+          <wp:docPr id="5" name="image1.png"/>
+          <wp:cNvGraphicFramePr/>
+          <a:graphic xmlns:a="http://schemas.openxmlformats.org/drawingml/2006/main">
+            <a:graphicData uri="http://schemas.openxmlformats.org/drawingml/2006/picture">
+              <pic:pic xmlns:pic="http://schemas.openxmlformats.org/drawingml/2006/picture">
+                <pic:nvPicPr>
+                  <pic:cNvPr id="0" name="image1.png"/>
+                  <pic:cNvPicPr preferRelativeResize="0"/>
+                </pic:nvPicPr>
+                <pic:blipFill>
+                  <a:blip r:embed="rId3"/>
+                  <a:srcRect/>
+                  <a:stretch>
+                    <a:fillRect/>
+                  </a:stretch>
+                </pic:blipFill>
+                <pic:spPr>
+                  <a:xfrm>
+                    <a:off x="0" y="0"/>
+                    <a:ext cx="133350" cy="104775"/>
+                  </a:xfrm>
+                  <a:prstGeom prst="rect">
+                    <a:avLst/>
+                  </a:prstGeom>
+                  <a:ln/>
+                </pic:spPr>
+              </pic:pic>
+            </a:graphicData>
+          </a:graphic>
+        </wp:inline>
+      </w:drawing>
+    </w:r>
+    <w:r>
+      <w:rPr>
+        <w:color w:val="666666"/>
+      </w:rPr>
+      <w:t xml:space="preserve"> contato@logap.com.br</w:t>
+    </w:r>
+  </w:p>
+</w:ftr>
+</file>
+
+<file path=word/footnotes.xml><?xml version="1.0" encoding="utf-8"?>
+<w:footnotes xmlns:wpc="http://schemas.microsoft.com/office/word/2010/wordprocessingCanvas" xmlns:cx="http://schemas.microsoft.com/office/drawing/2014/chartex" xmlns:cx1="http://schemas.microsoft.com/office/drawing/2015/9/8/chartex" xmlns:cx2="http://schemas.microsoft.com/office/drawing/2015/10/21/chartex" xmlns:cx3="http://schemas.microsoft.com/office/drawing/2016/5/9/chartex" xmlns:cx4="http://schemas.microsoft.com/office/drawing/2016/5/10/chartex" xmlns:cx5="http://schemas.microsoft.com/office/drawing/2016/5/11/chartex" xmlns:cx6="http://schemas.microsoft.com/office/drawing/2016/5/12/chartex" xmlns:cx7="http://schemas.microsoft.com/office/drawing/2016/5/13/chartex" xmlns:cx8="http://schemas.microsoft.com/office/drawing/2016/5/14/chartex" xmlns:mc="http://schemas.openxmlformats.org/markup-compatibility/2006" xmlns:aink="http://schemas.microsoft.com/office/drawing/2016/ink" xmlns:am3d="http://schemas.microsoft.com/office/drawing/2017/model3d" xmlns:o="urn:schemas-microsoft-com:office:office" xmlns:oel="http://schemas.microsoft.com/office/2019/extlst" xmlns:r="http://schemas.openxmlformats.org/officeDocument/2006/relationships" xmlns:m="http://schemas.openxmlformats.org/officeDocument/2006/math" xmlns:v="urn:schemas-microsoft-com:vml" xmlns:wp14="http://schemas.microsoft.com/office/word/2010/wordprocessingDrawing" xmlns:wp="http://schemas.openxmlformats.org/drawingml/2006/wordprocessingDrawing" xmlns:w10="urn:schemas-microsoft-com:office:word" xmlns:w="http://schemas.openxmlformats.org/wordprocessingml/2006/main" xmlns:w14="http://schemas.microsoft.com/office/word/2010/wordml" xmlns:w15="http://schemas.microsoft.com/office/word/2012/wordml" xmlns:w16cex="http://schemas.microsoft.com/office/word/2018/wordml/cex" xmlns:w16cid="http://schemas.microsoft.com/office/word/2016/wordml/cid" xmlns:w16="http://schemas.microsoft.com/office/word/2018/wordml" xmlns:w16du="http://schemas.microsoft.com/office/word/2023/wordml/word16du" xmlns:w16sdtdh="http://schemas.microsoft.com/office/word/2020/wordml/sdtdatahash" xmlns:w16sdtfl="http://schemas.microsoft.com/office/word/2024/wordml/sdtformatlock" xmlns:w16se="http://schemas.microsoft.com/office/word/2015/wordml/symex" xmlns:wpg="http://schemas.microsoft.com/office/word/2010/wordprocessingGroup" xmlns:wpi="http://schemas.microsoft.com/office/word/2010/wordprocessingInk" xmlns:wne="http://schemas.microsoft.com/office/word/2006/wordml" xmlns:wps="http://schemas.microsoft.com/office/word/2010/wordprocessingShape" mc:Ignorable="w14 w15 w16se w16cid w16 w16cex w16sdtdh w16sdtfl w16du wp14">
+  <w:footnote w:type="separator" w:id="-1">
+    <w:p>
+      <w:pPr>
+        <w:spacing w:line="240" w:lineRule="auto"/>
+      </w:pPr>
+      <w:r>
+        <w:separator/>
+      </w:r>
+    </w:p>
+  </w:footnote>
+  <w:footnote w:type="continuationSeparator" w:id="0">
+    <w:p>
+      <w:pPr>
+        <w:spacing w:line="240" w:lineRule="auto"/>
+      </w:pPr>
+      <w:r>
+        <w:continuationSeparator/>
+      </w:r>
+    </w:p>
+  </w:footnote>
+</w:footnotes>
+</file>
+
+<file path=word/header1.xml><?xml version="1.0" encoding="utf-8"?>
+<w:hdr xmlns:wpc="http://schemas.microsoft.com/office/word/2010/wordprocessingCanvas" xmlns:cx="http://schemas.microsoft.com/office/drawing/2014/chartex" xmlns:cx1="http://schemas.microsoft.com/office/drawing/2015/9/8/chartex" xmlns:cx2="http://schemas.microsoft.com/office/drawing/2015/10/21/chartex" xmlns:cx3="http://schemas.microsoft.com/office/drawing/2016/5/9/chartex" xmlns:cx4="http://schemas.microsoft.com/office/drawing/2016/5/10/chartex" xmlns:cx5="http://schemas.microsoft.com/office/drawing/2016/5/11/chartex" xmlns:cx6="http://schemas.microsoft.com/office/drawing/2016/5/12/chartex" xmlns:cx7="http://schemas.microsoft.com/office/drawing/2016/5/13/chartex" xmlns:cx8="http://schemas.microsoft.com/office/drawing/2016/5/14/chartex" xmlns:mc="http://schemas.openxmlformats.org/markup-compatibility/2006" xmlns:aink="http://schemas.microsoft.com/office/drawing/2016/ink" xmlns:am3d="http://schemas.microsoft.com/office/drawing/2017/model3d" xmlns:o="urn:schemas-microsoft-com:office:office" xmlns:oel="http://schemas.microsoft.com/office/2019/extlst" xmlns:r="http://schemas.openxmlformats.org/officeDocument/2006/relationships" xmlns:m="http://schemas.openxmlformats.org/officeDocument/2006/math" xmlns:v="urn:schemas-microsoft-com:vml" xmlns:wp14="http://schemas.microsoft.com/office/word/2010/wordprocessingDrawing" xmlns:wp="http://schemas.openxmlformats.org/drawingml/2006/wordprocessingDrawing" xmlns:w10="urn:schemas-microsoft-com:office:word" xmlns:w="http://schemas.openxmlformats.org/wordprocessingml/2006/main" xmlns:w14="http://schemas.microsoft.com/office/word/2010/wordml" xmlns:w15="http://schemas.microsoft.com/office/word/2012/wordml" xmlns:w16cex="http://schemas.microsoft.com/office/word/2018/wordml/cex" xmlns:w16cid="http://schemas.microsoft.com/office/word/2016/wordml/cid" xmlns:w16="http://schemas.microsoft.com/office/word/2018/wordml" xmlns:w16du="http://schemas.microsoft.com/office/word/2023/wordml/word16du" xmlns:w16sdtdh="http://schemas.microsoft.com/office/word/2020/wordml/sdtdatahash" xmlns:w16sdtfl="http://schemas.microsoft.com/office/word/2024/wordml/sdtformatlock" xmlns:w16se="http://schemas.microsoft.com/office/word/2015/wordml/symex" xmlns:wpg="http://schemas.microsoft.com/office/word/2010/wordprocessingGroup" xmlns:wpi="http://schemas.microsoft.com/office/word/2010/wordprocessingInk" xmlns:wne="http://schemas.microsoft.com/office/word/2006/wordml" xmlns:wps="http://schemas.microsoft.com/office/word/2010/wordprocessingShape" mc:Ignorable="w14 w15 w16se w16cid w16 w16cex w16sdtdh w16sdtfl w16du wp14">
+  <w:p>
+    <w:r>
+      <w:rPr>
+        <w:noProof/>
+      </w:rPr>
+      <w:drawing>
+        <wp:inline distT="114300" distB="114300" distL="114300" distR="114300" wp14:anchorId="0FCB32A9" wp14:editId="07777777">
+          <wp:extent cx="1647825" cy="1152525"/>
+          <wp:effectExtent l="0" t="0" r="0" b="0"/>
+          <wp:docPr id="4" name="image4.png"/>
+          <wp:cNvGraphicFramePr/>
+          <a:graphic xmlns:a="http://schemas.openxmlformats.org/drawingml/2006/main">
+            <a:graphicData uri="http://schemas.openxmlformats.org/drawingml/2006/picture">
+              <pic:pic xmlns:pic="http://schemas.openxmlformats.org/drawingml/2006/picture">
+                <pic:nvPicPr>
+                  <pic:cNvPr id="0" name="image4.png"/>
+                  <pic:cNvPicPr preferRelativeResize="0"/>
+                </pic:nvPicPr>
+                <pic:blipFill>
+                  <a:blip r:embed="rId1"/>
+                  <a:srcRect/>
+                  <a:stretch>
+                    <a:fillRect/>
+                  </a:stretch>
+                </pic:blipFill>
+                <pic:spPr>
+                  <a:xfrm>
+                    <a:off x="0" y="0"/>
+                    <a:ext cx="1647825" cy="1152525"/>
+                  </a:xfrm>
+                  <a:prstGeom prst="rect">
+                    <a:avLst/>
+                  </a:prstGeom>
+                  <a:ln/>
+                </pic:spPr>
+              </pic:pic>
+            </a:graphicData>
+          </a:graphic>
+        </wp:inline>
+      </w:drawing>
+    </w:r>
+  </w:p>
+</w:hdr>
+</file>
+
+<file path=word/header2.xml><?xml version="1.0" encoding="utf-8"?>
+<w:hdr xmlns:wpc="http://schemas.microsoft.com/office/word/2010/wordprocessingCanvas" xmlns:cx="http://schemas.microsoft.com/office/drawing/2014/chartex" xmlns:cx1="http://schemas.microsoft.com/office/drawing/2015/9/8/chartex" xmlns:cx2="http://schemas.microsoft.com/office/drawing/2015/10/21/chartex" xmlns:cx3="http://schemas.microsoft.com/office/drawing/2016/5/9/chartex" xmlns:cx4="http://schemas.microsoft.com/office/drawing/2016/5/10/chartex" xmlns:cx5="http://schemas.microsoft.com/office/drawing/2016/5/11/chartex" xmlns:cx6="http://schemas.microsoft.com/office/drawing/2016/5/12/chartex" xmlns:cx7="http://schemas.microsoft.com/office/drawing/2016/5/13/chartex" xmlns:cx8="http://schemas.microsoft.com/office/drawing/2016/5/14/chartex" xmlns:mc="http://schemas.openxmlformats.org/markup-compatibility/2006" xmlns:aink="http://schemas.microsoft.com/office/drawing/2016/ink" xmlns:am3d="http://schemas.microsoft.com/office/drawing/2017/model3d" xmlns:o="urn:schemas-microsoft-com:office:office" xmlns:oel="http://schemas.microsoft.com/office/2019/extlst" xmlns:r="http://schemas.openxmlformats.org/officeDocument/2006/relationships" xmlns:m="http://schemas.openxmlformats.org/officeDocument/2006/math" xmlns:v="urn:schemas-microsoft-com:vml" xmlns:wp14="http://schemas.microsoft.com/office/word/2010/wordprocessingDrawing" xmlns:wp="http://schemas.openxmlformats.org/drawingml/2006/wordprocessingDrawing" xmlns:w10="urn:schemas-microsoft-com:office:word" xmlns:w="http://schemas.openxmlformats.org/wordprocessingml/2006/main" xmlns:w14="http://schemas.microsoft.com/office/word/2010/wordml" xmlns:w15="http://schemas.microsoft.com/office/word/2012/wordml" xmlns:w16cex="http://schemas.microsoft.com/office/word/2018/wordml/cex" xmlns:w16cid="http://schemas.microsoft.com/office/word/2016/wordml/cid" xmlns:w16="http://schemas.microsoft.com/office/word/2018/wordml" xmlns:w16du="http://schemas.microsoft.com/office/word/2023/wordml/word16du" xmlns:w16sdtdh="http://schemas.microsoft.com/office/word/2020/wordml/sdtdatahash" xmlns:w16sdtfl="http://schemas.microsoft.com/office/word/2024/wordml/sdtformatlock" xmlns:w16se="http://schemas.microsoft.com/office/word/2015/wordml/symex" xmlns:wpg="http://schemas.microsoft.com/office/word/2010/wordprocessingGroup" xmlns:wpi="http://schemas.microsoft.com/office/word/2010/wordprocessingInk" xmlns:wne="http://schemas.microsoft.com/office/word/2006/wordml" xmlns:wps="http://schemas.microsoft.com/office/word/2010/wordprocessingShape" mc:Ignorable="w14 w15 w16se w16cid w16 w16cex w16sdtdh w16sdtfl w16du wp14">
+  <w:p>
+    <w:r>
+      <w:rPr>
+        <w:noProof/>
+      </w:rPr>
+      <w:drawing>
+        <wp:inline distT="114300" distB="114300" distL="114300" distR="114300" wp14:anchorId="532B102C" wp14:editId="07777777">
+          <wp:extent cx="1647825" cy="1152525"/>
+          <wp:effectExtent l="0" t="0" r="0" b="0"/>
+          <wp:docPr id="6" name="image4.png"/>
+          <wp:cNvGraphicFramePr/>
+          <a:graphic xmlns:a="http://schemas.openxmlformats.org/drawingml/2006/main">
+            <a:graphicData uri="http://schemas.openxmlformats.org/drawingml/2006/picture">
+              <pic:pic xmlns:pic="http://schemas.openxmlformats.org/drawingml/2006/picture">
+                <pic:nvPicPr>
+                  <pic:cNvPr id="0" name="image4.png"/>
+                  <pic:cNvPicPr preferRelativeResize="0"/>
+                </pic:nvPicPr>
+                <pic:blipFill>
+                  <a:blip r:embed="rId1"/>
+                  <a:srcRect/>
+                  <a:stretch>
+                    <a:fillRect/>
+                  </a:stretch>
+                </pic:blipFill>
+                <pic:spPr>
+                  <a:xfrm>
+                    <a:off x="0" y="0"/>
+                    <a:ext cx="1647825" cy="1152525"/>
+                  </a:xfrm>
+                  <a:prstGeom prst="rect">
+                    <a:avLst/>
+                  </a:prstGeom>
+                  <a:ln/>
+                </pic:spPr>
+              </pic:pic>
+            </a:graphicData>
+          </a:graphic>
+        </wp:inline>
+      </w:drawing>
+    </w:r>
+  </w:p>
+</w:hdr>
+</file>
 
 <file path=word/styles.xml><?xml version="1.0" encoding="utf-8"?>
 <w:styles xmlns:mc="http://schemas.openxmlformats.org/markup-compatibility/2006" xmlns:r="http://schemas.openxmlformats.org/officeDocument/2006/relationships" xmlns:w="http://schemas.openxmlformats.org/wordprocessingml/2006/main" xmlns:w14="http://schemas.microsoft.com/office/word/2010/wordml" xmlns:w15="http://schemas.microsoft.com/office/word/2012/wordml" xmlns:w16cex="http://schemas.microsoft.com/office/word/2018/wordml/cex" xmlns:w16cid="http://schemas.microsoft.com/office/word/2016/wordml/cid" xmlns:w16="http://schemas.microsoft.com/office/word/2018/wordml" xmlns:w16du="http://schemas.microsoft.com/office/word/2023/wordml/word16du" xmlns:w16sdtdh="http://schemas.microsoft.com/office/word/2020/wordml/sdtdatahash" xmlns:w16sdtfl="http://schemas.microsoft.com/office/word/2024/wordml/sdtformatlock" xmlns:w16se="http://schemas.microsoft.com/office/word/2015/wordml/symex" mc:Ignorable="w14 w15 w16se w16cid w16 w16cex w16sdtdh w16sdtfl w16du">

</xml_diff>